<commit_message>
fixed docx issues that caused "IndexError: list index out of range" 1.  space after colon before included file name, and 2. space before '_content'  in included file name
</commit_message>
<xml_diff>
--- a/docassemble/ChangingDivorceOrder/data/templates/changing_divorce_order_action_plan.docx
+++ b/docassemble/ChangingDivorceOrder/data/templates/changing_divorce_order_action_plan.docx
@@ -194,12 +194,26 @@
               <w:rPr>
                 <w:color w:val="FF0000"/>
               </w:rPr>
-              <w:t>{% elif user_need == 'change divorce order' and defined('type_of_final_order') and type_of_final_order.all_true('custody order', exclusive = True</w:t>
-            </w:r>
+              <w:t xml:space="preserve">{% elif user_need == 'change divorce order' and defined('type_of_final_order') and </w:t>
+            </w:r>
+            <w:proofErr w:type="spellStart"/>
             <w:r>
               <w:rPr>
                 <w:color w:val="FF0000"/>
               </w:rPr>
+              <w:t>type_of_final_order.all_true</w:t>
+            </w:r>
+            <w:proofErr w:type="spellEnd"/>
+            <w:r>
+              <w:rPr>
+                <w:color w:val="FF0000"/>
+              </w:rPr>
+              <w:t>('custody order', exclusive = True</w:t>
+            </w:r>
+            <w:r>
+              <w:rPr>
+                <w:color w:val="FF0000"/>
+              </w:rPr>
               <w:t>)</w:t>
             </w:r>
             <w:r>
@@ -236,7 +250,11 @@
               <w:t>{% else %}</w:t>
             </w:r>
             <w:r>
-              <w:t>from your divorce case</w:t>
+              <w:t xml:space="preserve">from your divorce </w:t>
+            </w:r>
+            <w:r>
+              <w:lastRenderedPageBreak/>
+              <w:t>case</w:t>
             </w:r>
             <w:r>
               <w:rPr>
@@ -969,7 +987,15 @@
               <w:t xml:space="preserve"> </w:t>
             </w:r>
             <w:r>
-              <w:t>{{ step_list | length }}</w:t>
+              <w:t xml:space="preserve">{{ </w:t>
+            </w:r>
+            <w:proofErr w:type="spellStart"/>
+            <w:r>
+              <w:t>step_list</w:t>
+            </w:r>
+            <w:proofErr w:type="spellEnd"/>
+            <w:r>
+              <w:t xml:space="preserve"> | length }}</w:t>
             </w:r>
             <w:r>
               <w:t xml:space="preserve"> </w:t>
@@ -1146,12 +1172,14 @@
               </w:rPr>
               <w:t>') and (</w:t>
             </w:r>
+            <w:proofErr w:type="spellStart"/>
             <w:r>
               <w:rPr>
                 <w:color w:val="FF0000"/>
               </w:rPr>
               <w:t>parents_agree</w:t>
             </w:r>
+            <w:proofErr w:type="spellEnd"/>
             <w:r>
               <w:rPr>
                 <w:color w:val="FF0000"/>
@@ -1174,18 +1202,40 @@
               <w:rPr>
                 <w:color w:val="FF0000"/>
               </w:rPr>
-              <w:t>(unknown_final_date.true_values())|list|length</w:t>
-            </w:r>
+              <w:t>(</w:t>
+            </w:r>
+            <w:proofErr w:type="spellStart"/>
             <w:r>
               <w:rPr>
                 <w:color w:val="FF0000"/>
               </w:rPr>
-              <w:t xml:space="preserve"> </w:t>
-            </w:r>
+              <w:t>unknown_final_date.true_values</w:t>
+            </w:r>
+            <w:proofErr w:type="spellEnd"/>
             <w:r>
               <w:rPr>
                 <w:color w:val="FF0000"/>
               </w:rPr>
+              <w:t>())|</w:t>
+            </w:r>
+            <w:proofErr w:type="spellStart"/>
+            <w:r>
+              <w:rPr>
+                <w:color w:val="FF0000"/>
+              </w:rPr>
+              <w:t>list|length</w:t>
+            </w:r>
+            <w:proofErr w:type="spellEnd"/>
+            <w:r>
+              <w:rPr>
+                <w:color w:val="FF0000"/>
+              </w:rPr>
+              <w:t xml:space="preserve"> </w:t>
+            </w:r>
+            <w:r>
+              <w:rPr>
+                <w:color w:val="FF0000"/>
+              </w:rPr>
               <w:t>&gt;</w:t>
             </w:r>
             <w:r>
@@ -1233,9 +1283,11 @@
             <w:pPr>
               <w:pStyle w:val="Body"/>
             </w:pPr>
+            <w:proofErr w:type="spellStart"/>
             <w:r>
               <w:t>pick_a_step_step</w:t>
             </w:r>
+            <w:proofErr w:type="spellEnd"/>
             <w:r>
               <w:t xml:space="preserve"> in </w:t>
             </w:r>
@@ -1267,10 +1319,18 @@
               <w:t>{{</w:t>
             </w:r>
             <w:r>
-              <w:t xml:space="preserve"> pick_a_step</w:t>
-            </w:r>
-            <w:r>
-              <w:t>_step.subject }}</w:t>
+              <w:t xml:space="preserve"> </w:t>
+            </w:r>
+            <w:proofErr w:type="spellStart"/>
+            <w:r>
+              <w:t>pick_a_step</w:t>
+            </w:r>
+            <w:r>
+              <w:t>_step.subject</w:t>
+            </w:r>
+            <w:proofErr w:type="spellEnd"/>
+            <w:r>
+              <w:t xml:space="preserve"> }}</w:t>
             </w:r>
           </w:p>
         </w:tc>
@@ -1411,12 +1471,14 @@
               </w:rPr>
               <w:t xml:space="preserve"> </w:t>
             </w:r>
+            <w:proofErr w:type="spellStart"/>
             <w:r>
               <w:rPr>
                 <w:color w:val="FFC000"/>
               </w:rPr>
               <w:t>parents_agree</w:t>
             </w:r>
+            <w:proofErr w:type="spellEnd"/>
             <w:r>
               <w:rPr>
                 <w:color w:val="FFC000"/>
@@ -1444,18 +1506,22 @@
             <w:pPr>
               <w:pStyle w:val="Body"/>
             </w:pPr>
+            <w:proofErr w:type="spellStart"/>
             <w:r>
               <w:t>parents_agree_step</w:t>
             </w:r>
+            <w:proofErr w:type="spellEnd"/>
             <w:r>
               <w:t xml:space="preserve"> and</w:t>
             </w:r>
             <w:r>
               <w:br/>
             </w:r>
+            <w:proofErr w:type="spellStart"/>
             <w:r>
               <w:t>tell_the_court_step</w:t>
             </w:r>
+            <w:proofErr w:type="spellEnd"/>
             <w:r>
               <w:t xml:space="preserve"> </w:t>
             </w:r>
@@ -1500,7 +1566,15 @@
               <w:outlineLvl w:val="1"/>
             </w:pPr>
             <w:r>
-              <w:t>{{ parents_agree_step.subject }}</w:t>
+              <w:t xml:space="preserve">{{ </w:t>
+            </w:r>
+            <w:proofErr w:type="spellStart"/>
+            <w:r>
+              <w:t>parents_agree_step.subject</w:t>
+            </w:r>
+            <w:proofErr w:type="spellEnd"/>
+            <w:r>
+              <w:t xml:space="preserve"> }}</w:t>
             </w:r>
           </w:p>
         </w:tc>
@@ -1554,13 +1628,22 @@
               <w:outlineLvl w:val="1"/>
             </w:pPr>
             <w:r>
-              <w:t>{{ tell_the_court_</w:t>
+              <w:lastRenderedPageBreak/>
+              <w:t xml:space="preserve">{{ </w:t>
+            </w:r>
+            <w:proofErr w:type="spellStart"/>
+            <w:r>
+              <w:t>tell_the_court_</w:t>
             </w:r>
             <w:r>
               <w:t>step.</w:t>
             </w:r>
             <w:r>
-              <w:t>subject }}</w:t>
+              <w:t>subject</w:t>
+            </w:r>
+            <w:proofErr w:type="spellEnd"/>
+            <w:r>
+              <w:t xml:space="preserve"> }}</w:t>
             </w:r>
           </w:p>
         </w:tc>
@@ -1613,7 +1696,6 @@
               <w:rPr>
                 <w:shd w:val="clear" w:color="auto" w:fill="FFFFFF"/>
               </w:rPr>
-              <w:lastRenderedPageBreak/>
               <w:t>{%tr</w:t>
             </w:r>
             <w:r>
@@ -1792,9 +1874,11 @@
             <w:pPr>
               <w:pStyle w:val="Body"/>
             </w:pPr>
+            <w:proofErr w:type="spellStart"/>
             <w:r>
               <w:t>foreign_order_step</w:t>
             </w:r>
+            <w:proofErr w:type="spellEnd"/>
             <w:r>
               <w:t xml:space="preserve"> in </w:t>
             </w:r>
@@ -1806,9 +1890,11 @@
             <w:pPr>
               <w:pStyle w:val="Body"/>
             </w:pPr>
+            <w:proofErr w:type="spellStart"/>
             <w:r>
               <w:t>ak_jurisdiction_step</w:t>
             </w:r>
+            <w:proofErr w:type="spellEnd"/>
             <w:r>
               <w:t xml:space="preserve"> in </w:t>
             </w:r>
@@ -1820,9 +1906,11 @@
             <w:pPr>
               <w:pStyle w:val="Body"/>
             </w:pPr>
+            <w:proofErr w:type="spellStart"/>
             <w:r>
               <w:t>register_order_step</w:t>
             </w:r>
+            <w:proofErr w:type="spellEnd"/>
             <w:r>
               <w:t xml:space="preserve"> in </w:t>
             </w:r>
@@ -1856,11 +1944,16 @@
             <w:r>
               <w:t xml:space="preserve">{{ </w:t>
             </w:r>
+            <w:proofErr w:type="spellStart"/>
             <w:r>
               <w:t>foreign_order_step</w:t>
             </w:r>
             <w:r>
-              <w:t>.subject }}</w:t>
+              <w:t>.subject</w:t>
+            </w:r>
+            <w:proofErr w:type="spellEnd"/>
+            <w:r>
+              <w:t xml:space="preserve"> }}</w:t>
             </w:r>
           </w:p>
         </w:tc>
@@ -1915,6 +2008,7 @@
               </w:rPr>
               <w:t xml:space="preserve">{{ </w:t>
             </w:r>
+            <w:proofErr w:type="spellStart"/>
             <w:r>
               <w:rPr>
                 <w:shd w:val="clear" w:color="auto" w:fill="FFFFFF"/>
@@ -1925,7 +2019,14 @@
               <w:rPr>
                 <w:shd w:val="clear" w:color="auto" w:fill="FFFFFF"/>
               </w:rPr>
-              <w:t>.subject }}</w:t>
+              <w:t>.subject</w:t>
+            </w:r>
+            <w:proofErr w:type="spellEnd"/>
+            <w:r>
+              <w:rPr>
+                <w:shd w:val="clear" w:color="auto" w:fill="FFFFFF"/>
+              </w:rPr>
+              <w:t xml:space="preserve"> }}</w:t>
             </w:r>
           </w:p>
         </w:tc>
@@ -1990,6 +2091,7 @@
               </w:rPr>
               <w:t xml:space="preserve">{{ </w:t>
             </w:r>
+            <w:proofErr w:type="spellStart"/>
             <w:r>
               <w:rPr>
                 <w:shd w:val="clear" w:color="auto" w:fill="FFFFFF"/>
@@ -2000,7 +2102,14 @@
               <w:rPr>
                 <w:shd w:val="clear" w:color="auto" w:fill="FFFFFF"/>
               </w:rPr>
-              <w:t>.subject }}</w:t>
+              <w:t>.subject</w:t>
+            </w:r>
+            <w:proofErr w:type="spellEnd"/>
+            <w:r>
+              <w:rPr>
+                <w:shd w:val="clear" w:color="auto" w:fill="FFFFFF"/>
+              </w:rPr>
+              <w:t xml:space="preserve"> }}</w:t>
             </w:r>
           </w:p>
         </w:tc>
@@ -2279,6 +2388,7 @@
                 <w:color w:val="FFC000"/>
                 <w:shd w:val="clear" w:color="auto" w:fill="FFFFFF"/>
               </w:rPr>
+              <w:lastRenderedPageBreak/>
               <w:t>type_of_final_order['custody</w:t>
             </w:r>
             <w:r>
@@ -2432,49 +2542,41 @@
                 <w:color w:val="FFC000"/>
                 <w:shd w:val="clear" w:color="auto" w:fill="FFFFFF"/>
               </w:rPr>
-              <w:t xml:space="preserve">type_of_response == </w:t>
+              <w:t>type_of_response == 'modify' and type_of_modification.</w:t>
             </w:r>
             <w:r>
               <w:rPr>
                 <w:color w:val="FFC000"/>
                 <w:shd w:val="clear" w:color="auto" w:fill="FFFFFF"/>
               </w:rPr>
-              <w:lastRenderedPageBreak/>
-              <w:t>'modify' and type_of_modification.</w:t>
+              <w:t>any</w:t>
             </w:r>
             <w:r>
               <w:rPr>
                 <w:color w:val="FFC000"/>
                 <w:shd w:val="clear" w:color="auto" w:fill="FFFFFF"/>
               </w:rPr>
-              <w:t>any</w:t>
+              <w:t>_</w:t>
             </w:r>
             <w:r>
               <w:rPr>
                 <w:color w:val="FFC000"/>
                 <w:shd w:val="clear" w:color="auto" w:fill="FFFFFF"/>
               </w:rPr>
-              <w:t>_</w:t>
+              <w:t>true(</w:t>
             </w:r>
             <w:r>
               <w:rPr>
                 <w:color w:val="FFC000"/>
                 <w:shd w:val="clear" w:color="auto" w:fill="FFFFFF"/>
               </w:rPr>
-              <w:t>true(</w:t>
+              <w:t>'custody', 'child support'</w:t>
             </w:r>
             <w:r>
               <w:rPr>
                 <w:color w:val="FFC000"/>
                 <w:shd w:val="clear" w:color="auto" w:fill="FFFFFF"/>
               </w:rPr>
-              <w:t>'custody', 'child support'</w:t>
-            </w:r>
-            <w:r>
-              <w:rPr>
-                <w:color w:val="FFC000"/>
-                <w:shd w:val="clear" w:color="auto" w:fill="FFFFFF"/>
-              </w:rPr>
               <w:t>)</w:t>
             </w:r>
             <w:r>
@@ -2512,10 +2614,12 @@
             <w:pPr>
               <w:pStyle w:val="Body"/>
             </w:pPr>
+            <w:proofErr w:type="spellStart"/>
             <w:r>
               <w:lastRenderedPageBreak/>
               <w:t>modify_step</w:t>
             </w:r>
+            <w:proofErr w:type="spellEnd"/>
             <w:r>
               <w:t xml:space="preserve"> in </w:t>
             </w:r>
@@ -2550,7 +2654,21 @@
               <w:rPr>
                 <w:shd w:val="clear" w:color="auto" w:fill="FFFFFF"/>
               </w:rPr>
-              <w:t>{{ modify_step.subject }}</w:t>
+              <w:t xml:space="preserve">{{ </w:t>
+            </w:r>
+            <w:proofErr w:type="spellStart"/>
+            <w:r>
+              <w:rPr>
+                <w:shd w:val="clear" w:color="auto" w:fill="FFFFFF"/>
+              </w:rPr>
+              <w:t>modify_step.subject</w:t>
+            </w:r>
+            <w:proofErr w:type="spellEnd"/>
+            <w:r>
+              <w:rPr>
+                <w:shd w:val="clear" w:color="auto" w:fill="FFFFFF"/>
+              </w:rPr>
+              <w:t xml:space="preserve"> }}</w:t>
             </w:r>
           </w:p>
         </w:tc>
@@ -2731,9 +2849,11 @@
             <w:pPr>
               <w:pStyle w:val="Body"/>
             </w:pPr>
+            <w:proofErr w:type="spellStart"/>
             <w:r>
               <w:t>fill_modify_step</w:t>
             </w:r>
+            <w:proofErr w:type="spellEnd"/>
             <w:r>
               <w:t xml:space="preserve"> in </w:t>
             </w:r>
@@ -2745,11 +2865,16 @@
             <w:pPr>
               <w:pStyle w:val="Body"/>
             </w:pPr>
+            <w:proofErr w:type="spellStart"/>
             <w:r>
               <w:t>calculate_child_support_</w:t>
             </w:r>
             <w:r>
-              <w:t xml:space="preserve">step in </w:t>
+              <w:t>step</w:t>
+            </w:r>
+            <w:proofErr w:type="spellEnd"/>
+            <w:r>
+              <w:t xml:space="preserve"> in </w:t>
             </w:r>
             <w:r>
               <w:t>aka2j_templates.yml</w:t>
@@ -2782,7 +2907,21 @@
               <w:rPr>
                 <w:shd w:val="clear" w:color="auto" w:fill="FFFFFF"/>
               </w:rPr>
-              <w:t>{{ fill_modify_step.subject }}</w:t>
+              <w:t xml:space="preserve">{{ </w:t>
+            </w:r>
+            <w:proofErr w:type="spellStart"/>
+            <w:r>
+              <w:rPr>
+                <w:shd w:val="clear" w:color="auto" w:fill="FFFFFF"/>
+              </w:rPr>
+              <w:t>fill_modify_step.subject</w:t>
+            </w:r>
+            <w:proofErr w:type="spellEnd"/>
+            <w:r>
+              <w:rPr>
+                <w:shd w:val="clear" w:color="auto" w:fill="FFFFFF"/>
+              </w:rPr>
+              <w:t xml:space="preserve"> }}</w:t>
             </w:r>
           </w:p>
         </w:tc>
@@ -2845,14 +2984,17 @@
               <w:rPr>
                 <w:shd w:val="clear" w:color="auto" w:fill="FFFFFF"/>
               </w:rPr>
+              <w:lastRenderedPageBreak/>
               <w:t xml:space="preserve">{{ </w:t>
             </w:r>
+            <w:proofErr w:type="spellStart"/>
             <w:r>
               <w:t>calculate_child_support_</w:t>
             </w:r>
             <w:r>
               <w:t>step.subject</w:t>
             </w:r>
+            <w:proofErr w:type="spellEnd"/>
             <w:r>
               <w:rPr>
                 <w:shd w:val="clear" w:color="auto" w:fill="FFFFFF"/>
@@ -2891,7 +3033,7 @@
               <w:t>calculate_child_support</w:t>
             </w:r>
             <w:r>
-              <w:t xml:space="preserve"> _content.docx")) }}</w:t>
+              <w:t>_content.docx")) }}</w:t>
             </w:r>
             <w:bookmarkEnd w:id="0"/>
           </w:p>
@@ -2982,26 +3124,18 @@
                 <w:color w:val="C00000"/>
                 <w:shd w:val="clear" w:color="auto" w:fill="FFFFFF"/>
               </w:rPr>
-              <w:t xml:space="preserve">{%tr if user_need == 'change foreign custody </w:t>
+              <w:t>{%tr if user_need == 'change foreign custody order'</w:t>
             </w:r>
             <w:r>
               <w:rPr>
                 <w:color w:val="C00000"/>
-                <w:shd w:val="clear" w:color="auto" w:fill="FFFFFF"/>
-              </w:rPr>
-              <w:lastRenderedPageBreak/>
-              <w:t>order'</w:t>
+              </w:rPr>
+              <w:t xml:space="preserve"> </w:t>
             </w:r>
             <w:r>
               <w:rPr>
                 <w:color w:val="C00000"/>
               </w:rPr>
-              <w:t xml:space="preserve"> </w:t>
-            </w:r>
-            <w:r>
-              <w:rPr>
-                <w:color w:val="C00000"/>
-              </w:rPr>
               <w:t>%}</w:t>
             </w:r>
           </w:p>
@@ -3019,8 +3153,8 @@
             <w:pPr>
               <w:pStyle w:val="Body"/>
             </w:pPr>
-            <w:r>
-              <w:lastRenderedPageBreak/>
+            <w:proofErr w:type="spellStart"/>
+            <w:r>
               <w:t>dont_wait_modify_</w:t>
             </w:r>
             <w:r>
@@ -3029,11 +3163,11 @@
             <w:r>
               <w:t>_step</w:t>
             </w:r>
+            <w:proofErr w:type="spellEnd"/>
             <w:r>
               <w:t xml:space="preserve"> in </w:t>
             </w:r>
             <w:r>
-              <w:lastRenderedPageBreak/>
               <w:t>aka2j_mod_cust_div_templates.yml</w:t>
             </w:r>
           </w:p>
@@ -3058,7 +3192,6 @@
               <w:outlineLvl w:val="1"/>
             </w:pPr>
             <w:r>
-              <w:lastRenderedPageBreak/>
               <w:t xml:space="preserve">{{ </w:t>
             </w:r>
             <w:r>
@@ -3101,7 +3234,7 @@
               <w:t>_child_support</w:t>
             </w:r>
             <w:r>
-              <w:t xml:space="preserve"> _content.docx")) }}</w:t>
+              <w:t>_content.docx")) }}</w:t>
             </w:r>
           </w:p>
         </w:tc>
@@ -3219,7 +3352,23 @@
                 <w:color w:val="C00000"/>
                 <w:shd w:val="clear" w:color="auto" w:fill="FFFFFF"/>
               </w:rPr>
-              <w:t xml:space="preserve">and parents_agree and </w:t>
+              <w:t xml:space="preserve">and </w:t>
+            </w:r>
+            <w:proofErr w:type="spellStart"/>
+            <w:r>
+              <w:rPr>
+                <w:color w:val="C00000"/>
+                <w:shd w:val="clear" w:color="auto" w:fill="FFFFFF"/>
+              </w:rPr>
+              <w:t>parents_agree</w:t>
+            </w:r>
+            <w:proofErr w:type="spellEnd"/>
+            <w:r>
+              <w:rPr>
+                <w:color w:val="C00000"/>
+                <w:shd w:val="clear" w:color="auto" w:fill="FFFFFF"/>
+              </w:rPr>
+              <w:t xml:space="preserve"> and </w:t>
             </w:r>
             <w:r>
               <w:rPr>
@@ -3292,11 +3441,20 @@
             <w:r>
               <w:t xml:space="preserve">{{ </w:t>
             </w:r>
-            <w:r>
-              <w:t>dont_wait_modify_custody_divorce</w:t>
-            </w:r>
-            <w:r>
-              <w:t>_step.subject }}</w:t>
+            <w:proofErr w:type="spellStart"/>
+            <w:r>
+              <w:t>dont_wait_modif</w:t>
+            </w:r>
+            <w:r>
+              <w:lastRenderedPageBreak/>
+              <w:t>y_custody_divorce</w:t>
+            </w:r>
+            <w:r>
+              <w:t>_step.subject</w:t>
+            </w:r>
+            <w:proofErr w:type="spellEnd"/>
+            <w:r>
+              <w:t xml:space="preserve"> }}</w:t>
             </w:r>
           </w:p>
         </w:tc>
@@ -3326,7 +3484,11 @@
               <w:t>(include_docx_template("docassemble.AKA2JBranding:</w:t>
             </w:r>
             <w:r>
-              <w:t>dont_wait_modify_custody_divorce</w:t>
+              <w:t>dont_wait_m</w:t>
+            </w:r>
+            <w:r>
+              <w:lastRenderedPageBreak/>
+              <w:t>odify_custody_divorce</w:t>
             </w:r>
             <w:r>
               <w:t>_content.docx")) }}</w:t>
@@ -3356,6 +3518,7 @@
                 <w:color w:val="C00000"/>
                 <w:shd w:val="clear" w:color="auto" w:fill="FFFFFF"/>
               </w:rPr>
+              <w:lastRenderedPageBreak/>
               <w:t>{%tr</w:t>
             </w:r>
             <w:r>
@@ -3590,7 +3753,6 @@
               <w:rPr>
                 <w:color w:val="FF0000"/>
               </w:rPr>
-              <w:lastRenderedPageBreak/>
               <w:t>(</w:t>
             </w:r>
             <w:r>
@@ -3684,10 +3846,11 @@
             <w:pPr>
               <w:pStyle w:val="Body"/>
             </w:pPr>
-            <w:r>
-              <w:lastRenderedPageBreak/>
+            <w:proofErr w:type="spellStart"/>
+            <w:r>
               <w:t>modify_divorce_step</w:t>
             </w:r>
+            <w:proofErr w:type="spellEnd"/>
           </w:p>
         </w:tc>
       </w:tr>
@@ -3710,7 +3873,15 @@
               <w:outlineLvl w:val="1"/>
             </w:pPr>
             <w:r>
-              <w:t>{{ modify_divorce_step.subject }}</w:t>
+              <w:t xml:space="preserve">{{ </w:t>
+            </w:r>
+            <w:proofErr w:type="spellStart"/>
+            <w:r>
+              <w:t>modify_divorce_step.subject</w:t>
+            </w:r>
+            <w:proofErr w:type="spellEnd"/>
+            <w:r>
+              <w:t xml:space="preserve"> }}</w:t>
             </w:r>
           </w:p>
         </w:tc>
@@ -4051,6 +4222,7 @@
               <w:rPr>
                 <w:color w:val="FF0000"/>
               </w:rPr>
+              <w:lastRenderedPageBreak/>
               <w:t>{%</w:t>
             </w:r>
             <w:r>
@@ -4160,7 +4332,6 @@
               <w:rPr>
                 <w:color w:val="FF0000"/>
               </w:rPr>
-              <w:lastRenderedPageBreak/>
               <w:t>{%</w:t>
             </w:r>
             <w:r>
@@ -4422,7 +4593,14 @@
               <w:rPr>
                 <w:shd w:val="clear" w:color="auto" w:fill="FFFFFF"/>
               </w:rPr>
-              <w:t>) and why_change_divorce_order == 'changed circumstances' %}</w:t>
+              <w:t>) and why_change_divorce_or</w:t>
+            </w:r>
+            <w:r>
+              <w:rPr>
+                <w:shd w:val="clear" w:color="auto" w:fill="FFFFFF"/>
+              </w:rPr>
+              <w:lastRenderedPageBreak/>
+              <w:t>der == 'changed circumstances' %}</w:t>
             </w:r>
           </w:p>
         </w:tc>
@@ -4439,9 +4617,12 @@
             <w:pPr>
               <w:pStyle w:val="Body"/>
             </w:pPr>
-            <w:r>
+            <w:proofErr w:type="spellStart"/>
+            <w:r>
+              <w:lastRenderedPageBreak/>
               <w:t>fill_modify_divorce_step</w:t>
             </w:r>
+            <w:proofErr w:type="spellEnd"/>
           </w:p>
         </w:tc>
       </w:tr>
@@ -4464,7 +4645,15 @@
               <w:outlineLvl w:val="1"/>
             </w:pPr>
             <w:r>
-              <w:t>{{ fill_modify_divorce_step.subject }}</w:t>
+              <w:t xml:space="preserve">{{ </w:t>
+            </w:r>
+            <w:proofErr w:type="spellStart"/>
+            <w:r>
+              <w:t>fill_modify_divorce_step.subject</w:t>
+            </w:r>
+            <w:proofErr w:type="spellEnd"/>
+            <w:r>
+              <w:t xml:space="preserve"> }}</w:t>
             </w:r>
           </w:p>
         </w:tc>
@@ -4645,7 +4834,6 @@
               <w:rPr>
                 <w:color w:val="FF0000"/>
               </w:rPr>
-              <w:lastRenderedPageBreak/>
               <w:t>{%p if filling_manner in('paper', 'dunno') or filing_method in ('mail or in person', 'dunno') %}</w:t>
             </w:r>
           </w:p>
@@ -5038,7 +5226,23 @@
                   <w:rStyle w:val="Hyperlink"/>
                   <w:spacing w:val="0"/>
                 </w:rPr>
-                <w:t>youtube.com/watch?v=2irmxT0_0EA</w:t>
+                <w:t>youtube.com/</w:t>
+              </w:r>
+              <w:proofErr w:type="spellStart"/>
+              <w:r>
+                <w:rPr>
+                  <w:rStyle w:val="Hyperlink"/>
+                  <w:spacing w:val="0"/>
+                </w:rPr>
+                <w:t>watch?v</w:t>
+              </w:r>
+              <w:proofErr w:type="spellEnd"/>
+              <w:r>
+                <w:rPr>
+                  <w:rStyle w:val="Hyperlink"/>
+                  <w:spacing w:val="0"/>
+                </w:rPr>
+                <w:t>=2irmxT0_0EA</w:t>
               </w:r>
             </w:hyperlink>
           </w:p>
@@ -5181,15 +5385,19 @@
             <w:pPr>
               <w:pStyle w:val="Body"/>
             </w:pPr>
+            <w:proofErr w:type="spellStart"/>
             <w:r>
               <w:t>learn_reconsider_step</w:t>
             </w:r>
+            <w:proofErr w:type="spellEnd"/>
             <w:r>
               <w:t xml:space="preserve"> and </w:t>
             </w:r>
+            <w:proofErr w:type="spellStart"/>
             <w:r>
               <w:t>fill_reconsider_step</w:t>
             </w:r>
+            <w:proofErr w:type="spellEnd"/>
             <w:r>
               <w:t xml:space="preserve"> in </w:t>
             </w:r>
@@ -5220,11 +5428,16 @@
             <w:r>
               <w:t xml:space="preserve">{{ </w:t>
             </w:r>
+            <w:proofErr w:type="spellStart"/>
             <w:r>
               <w:t>learn_reconsider_step</w:t>
             </w:r>
             <w:r>
-              <w:t>.subject }}</w:t>
+              <w:t>.subject</w:t>
+            </w:r>
+            <w:proofErr w:type="spellEnd"/>
+            <w:r>
+              <w:t xml:space="preserve"> }}</w:t>
             </w:r>
           </w:p>
           <w:p/>
@@ -5282,13 +5495,21 @@
               <w:outlineLvl w:val="1"/>
             </w:pPr>
             <w:r>
-              <w:t>{{ fill</w:t>
+              <w:t xml:space="preserve">{{ </w:t>
+            </w:r>
+            <w:proofErr w:type="spellStart"/>
+            <w:r>
+              <w:t>fill</w:t>
             </w:r>
             <w:r>
               <w:t>_reconsider_step</w:t>
             </w:r>
             <w:r>
-              <w:t>.subject }}</w:t>
+              <w:t>.subject</w:t>
+            </w:r>
+            <w:proofErr w:type="spellEnd"/>
+            <w:r>
+              <w:t xml:space="preserve"> }}</w:t>
             </w:r>
           </w:p>
         </w:tc>
@@ -5421,7 +5642,6 @@
               <w:rPr>
                 <w:shd w:val="clear" w:color="auto" w:fill="FFFFFF"/>
               </w:rPr>
-              <w:lastRenderedPageBreak/>
               <w:t>{%tr</w:t>
             </w:r>
             <w:r>
@@ -5523,9 +5743,11 @@
             <w:pPr>
               <w:pStyle w:val="Body"/>
             </w:pPr>
+            <w:proofErr w:type="spellStart"/>
             <w:r>
               <w:t>standing_order_step</w:t>
             </w:r>
+            <w:proofErr w:type="spellEnd"/>
             <w:r>
               <w:t xml:space="preserve"> in </w:t>
             </w:r>
@@ -5705,6 +5927,7 @@
               <w:rPr>
                 <w:shd w:val="clear" w:color="auto" w:fill="FFFFFF"/>
               </w:rPr>
+              <w:lastRenderedPageBreak/>
               <w:t>{%tr</w:t>
             </w:r>
             <w:r>
@@ -6231,7 +6454,6 @@
               <w:rPr>
                 <w:shd w:val="clear" w:color="auto" w:fill="FFFFFF"/>
               </w:rPr>
-              <w:lastRenderedPageBreak/>
               <w:t>{{ appeal_step.subject }}</w:t>
             </w:r>
           </w:p>
@@ -6365,7 +6587,11 @@
               <w:t>if</w:t>
             </w:r>
             <w:r>
-              <w:t xml:space="preserve"> unknown_final_date['set aside'</w:t>
+              <w:t xml:space="preserve"> unknown_final_date['set </w:t>
+            </w:r>
+            <w:r>
+              <w:lastRenderedPageBreak/>
+              <w:t>aside'</w:t>
             </w:r>
             <w:r>
               <w:t>]</w:t>
@@ -6583,6 +6809,7 @@
               <w:pStyle w:val="Body"/>
             </w:pPr>
             <w:r>
+              <w:lastRenderedPageBreak/>
               <w:t>learn_set_aside_step</w:t>
             </w:r>
             <w:r>
@@ -6595,6 +6822,7 @@
               <w:t xml:space="preserve"> in </w:t>
             </w:r>
             <w:r>
+              <w:lastRenderedPageBreak/>
               <w:t>aka2j_mod_cust_div_templates.yml</w:t>
             </w:r>
           </w:p>
@@ -6625,6 +6853,7 @@
               <w:rPr>
                 <w:shd w:val="clear" w:color="auto" w:fill="FFFFFF"/>
               </w:rPr>
+              <w:lastRenderedPageBreak/>
               <w:t>{{ learn_set_aside_step.subject }}</w:t>
             </w:r>
           </w:p>
@@ -6794,7 +7023,6 @@
               <w:rPr>
                 <w:shd w:val="clear" w:color="auto" w:fill="FFFFFF"/>
               </w:rPr>
-              <w:lastRenderedPageBreak/>
               <w:t xml:space="preserve">{%tr if </w:t>
             </w:r>
             <w:r>
@@ -6886,7 +7114,14 @@
               <w:rPr>
                 <w:shd w:val="clear" w:color="auto" w:fill="FFFFFF"/>
               </w:rPr>
-              <w:t>respond_to_reconsider_step</w:t>
+              <w:t>respond_to_rec</w:t>
+            </w:r>
+            <w:r>
+              <w:rPr>
+                <w:shd w:val="clear" w:color="auto" w:fill="FFFFFF"/>
+              </w:rPr>
+              <w:lastRenderedPageBreak/>
+              <w:t>onsider_step</w:t>
             </w:r>
             <w:r>
               <w:rPr>
@@ -6925,7 +7160,14 @@
               <w:rPr>
                 <w:shd w:val="clear" w:color="auto" w:fill="FFFFFF"/>
               </w:rPr>
-              <w:t>respond_to_reconsider</w:t>
+              <w:t>respond_to_r</w:t>
+            </w:r>
+            <w:r>
+              <w:rPr>
+                <w:shd w:val="clear" w:color="auto" w:fill="FFFFFF"/>
+              </w:rPr>
+              <w:lastRenderedPageBreak/>
+              <w:t>econsider</w:t>
             </w:r>
             <w:r>
               <w:t>_content.docx")) }}</w:t>
@@ -6954,6 +7196,7 @@
               <w:rPr>
                 <w:shd w:val="clear" w:color="auto" w:fill="FFFFFF"/>
               </w:rPr>
+              <w:lastRenderedPageBreak/>
               <w:t>{%tr endif %}</w:t>
             </w:r>
           </w:p>
@@ -7373,7 +7616,6 @@
               <w:rPr>
                 <w:shd w:val="clear" w:color="auto" w:fill="FFFFFF"/>
               </w:rPr>
-              <w:lastRenderedPageBreak/>
               <w:t>{%tr endif %}</w:t>
             </w:r>
           </w:p>
@@ -7415,6 +7657,7 @@
               <w:rPr>
                 <w:shd w:val="clear" w:color="auto" w:fill="FFFFFF"/>
               </w:rPr>
+              <w:lastRenderedPageBreak/>
               <w:t xml:space="preserve">{%tr if user_need == 'change foreign custody order' or </w:t>
             </w:r>
             <w:r>
@@ -7733,9 +7976,6 @@
               <w:t>(include_docx_template("docassemble.AKA2JBranding:</w:t>
             </w:r>
             <w:r>
-              <w:t xml:space="preserve"> </w:t>
-            </w:r>
-            <w:r>
               <w:rPr>
                 <w:shd w:val="clear" w:color="auto" w:fill="FFFFFF"/>
               </w:rPr>
@@ -8289,11 +8529,16 @@
               </w:rPr>
               <w:t xml:space="preserve">{{ </w:t>
             </w:r>
+            <w:proofErr w:type="spellStart"/>
             <w:r>
               <w:t>expect_after_motion_or_answer</w:t>
             </w:r>
             <w:r>
-              <w:t>_step.subject }}</w:t>
+              <w:t>_step.subject</w:t>
+            </w:r>
+            <w:proofErr w:type="spellEnd"/>
+            <w:r>
+              <w:t xml:space="preserve"> }}</w:t>
             </w:r>
           </w:p>
         </w:tc>
@@ -8446,9 +8691,11 @@
             <w:pPr>
               <w:pStyle w:val="Body"/>
             </w:pPr>
+            <w:proofErr w:type="spellStart"/>
             <w:r>
               <w:t>expect_reconsider_step</w:t>
             </w:r>
+            <w:proofErr w:type="spellEnd"/>
             <w:r>
               <w:t xml:space="preserve"> in </w:t>
             </w:r>
@@ -8479,11 +8726,16 @@
             <w:r>
               <w:t xml:space="preserve">{{  </w:t>
             </w:r>
+            <w:proofErr w:type="spellStart"/>
             <w:r>
               <w:t>expect_reconsider_step</w:t>
             </w:r>
             <w:r>
-              <w:t>.subject }}</w:t>
+              <w:t>.subject</w:t>
+            </w:r>
+            <w:proofErr w:type="spellEnd"/>
+            <w:r>
+              <w:t xml:space="preserve"> }}</w:t>
             </w:r>
           </w:p>
         </w:tc>
@@ -8554,6 +8806,7 @@
               <w:rPr>
                 <w:shd w:val="clear" w:color="auto" w:fill="FFFFFF"/>
               </w:rPr>
+              <w:lastRenderedPageBreak/>
               <w:t>{%tr endif %}</w:t>
             </w:r>
           </w:p>
@@ -8598,7 +8851,6 @@
               <w:rPr>
                 <w:shd w:val="clear" w:color="auto" w:fill="FFFFFF"/>
               </w:rPr>
-              <w:lastRenderedPageBreak/>
               <w:t xml:space="preserve">{%tr if </w:t>
             </w:r>
             <w:r>
@@ -8631,12 +8883,14 @@
                 <w:shd w:val="clear" w:color="auto" w:fill="FFFFFF"/>
               </w:rPr>
             </w:pPr>
+            <w:proofErr w:type="spellStart"/>
             <w:r>
               <w:rPr>
                 <w:shd w:val="clear" w:color="auto" w:fill="FFFFFF"/>
               </w:rPr>
               <w:t>expect_after_response_step</w:t>
             </w:r>
+            <w:proofErr w:type="spellEnd"/>
             <w:r>
               <w:rPr>
                 <w:shd w:val="clear" w:color="auto" w:fill="FFFFFF"/>
@@ -8679,6 +8933,7 @@
               </w:rPr>
               <w:t xml:space="preserve">{{ </w:t>
             </w:r>
+            <w:proofErr w:type="spellStart"/>
             <w:r>
               <w:rPr>
                 <w:shd w:val="clear" w:color="auto" w:fill="FFFFFF"/>
@@ -8691,6 +8946,7 @@
               </w:rPr>
               <w:t>.subject</w:t>
             </w:r>
+            <w:proofErr w:type="spellEnd"/>
             <w:r>
               <w:rPr>
                 <w:shd w:val="clear" w:color="auto" w:fill="FFFFFF"/>
@@ -8914,6 +9170,7 @@
               </w:rPr>
               <w:t xml:space="preserve"> </w:t>
             </w:r>
+            <w:proofErr w:type="spellStart"/>
             <w:r>
               <w:t>contact_other_party_ste</w:t>
             </w:r>
@@ -8926,6 +9183,7 @@
               </w:rPr>
               <w:t>.subject</w:t>
             </w:r>
+            <w:proofErr w:type="spellEnd"/>
             <w:r>
               <w:rPr>
                 <w:shd w:val="clear" w:color="auto" w:fill="FFFFFF"/>
@@ -9029,9 +9287,6 @@
               <w:t>{{p (include_docx_template("docassemble.AKA2JBranding:</w:t>
             </w:r>
             <w:r>
-              <w:t xml:space="preserve"> </w:t>
-            </w:r>
-            <w:r>
               <w:t>file_agreement</w:t>
             </w:r>
             <w:r>
@@ -9114,6 +9369,7 @@
               <w:rPr>
                 <w:shd w:val="clear" w:color="auto" w:fill="FFFFFF"/>
               </w:rPr>
+              <w:lastRenderedPageBreak/>
               <w:t xml:space="preserve">{%tr if </w:t>
             </w:r>
             <w:r>
@@ -9156,9 +9412,11 @@
             <w:pPr>
               <w:pStyle w:val="Body"/>
             </w:pPr>
+            <w:proofErr w:type="spellStart"/>
             <w:r>
               <w:t>appeal_response_step</w:t>
             </w:r>
+            <w:proofErr w:type="spellEnd"/>
             <w:r>
               <w:t xml:space="preserve"> in </w:t>
             </w:r>
@@ -9190,7 +9448,6 @@
               <w:rPr>
                 <w:shd w:val="clear" w:color="auto" w:fill="FFFFFF"/>
               </w:rPr>
-              <w:lastRenderedPageBreak/>
               <w:t>{{ appeal_response_step.subject }</w:t>
             </w:r>
             <w:r>
@@ -9465,12 +9722,14 @@
               </w:rPr>
               <w:t xml:space="preserve">{{ </w:t>
             </w:r>
+            <w:proofErr w:type="spellStart"/>
             <w:r>
               <w:t>tell_supreme_court_step</w:t>
             </w:r>
             <w:r>
               <w:t>.subject</w:t>
             </w:r>
+            <w:proofErr w:type="spellEnd"/>
             <w:r>
               <w:rPr>
                 <w:shd w:val="clear" w:color="auto" w:fill="FFFFFF"/>
@@ -9559,8 +9818,13 @@
             <w:pPr>
               <w:pStyle w:val="Body"/>
             </w:pPr>
-            <w:r>
-              <w:t xml:space="preserve">get_help in </w:t>
+            <w:proofErr w:type="spellStart"/>
+            <w:r>
+              <w:t>get_help</w:t>
+            </w:r>
+            <w:proofErr w:type="spellEnd"/>
+            <w:r>
+              <w:t xml:space="preserve"> in </w:t>
             </w:r>
             <w:r>
               <w:t>aka2j_templates.yml</w:t>
@@ -9587,7 +9851,19 @@
               <w:outlineLvl w:val="1"/>
             </w:pPr>
             <w:r>
-              <w:t>{{ get_help_step.subject }}</w:t>
+              <w:t xml:space="preserve">{{ </w:t>
+            </w:r>
+            <w:proofErr w:type="spellStart"/>
+            <w:r>
+              <w:t>get_help_step.s</w:t>
+            </w:r>
+            <w:r>
+              <w:lastRenderedPageBreak/>
+              <w:t>ubject</w:t>
+            </w:r>
+            <w:proofErr w:type="spellEnd"/>
+            <w:r>
+              <w:t xml:space="preserve"> }}</w:t>
             </w:r>
           </w:p>
         </w:tc>
@@ -9623,7 +9899,11 @@
               <w:t>get_help</w:t>
             </w:r>
             <w:r>
-              <w:t>_content.docx")) }}</w:t>
+              <w:t>_co</w:t>
+            </w:r>
+            <w:r>
+              <w:lastRenderedPageBreak/>
+              <w:t>ntent.docx")) }}</w:t>
             </w:r>
           </w:p>
         </w:tc>
@@ -9635,7 +9915,12 @@
       </w:pPr>
     </w:p>
     <w:sectPr>
-      <w:footerReference w:type="default" r:id="rId18"/>
+      <w:headerReference w:type="even" r:id="rId18"/>
+      <w:headerReference w:type="default" r:id="rId19"/>
+      <w:footerReference w:type="even" r:id="rId20"/>
+      <w:footerReference w:type="default" r:id="rId21"/>
+      <w:headerReference w:type="first" r:id="rId22"/>
+      <w:footerReference w:type="first" r:id="rId23"/>
       <w:pgSz w:w="12240" w:h="15840"/>
       <w:pgMar w:top="245" w:right="1440" w:bottom="274" w:left="1440" w:header="720" w:footer="720" w:gutter="0"/>
       <w:cols w:space="720"/>
@@ -9676,6 +9961,16 @@
   <w:p>
     <w:pPr>
       <w:pStyle w:val="Footer"/>
+    </w:pPr>
+  </w:p>
+</w:ftr>
+</file>
+
+<file path=word/footer2.xml><?xml version="1.0" encoding="utf-8"?>
+<w:ftr xmlns:wpc="http://schemas.microsoft.com/office/word/2010/wordprocessingCanvas" xmlns:cx="http://schemas.microsoft.com/office/drawing/2014/chartex" xmlns:cx1="http://schemas.microsoft.com/office/drawing/2015/9/8/chartex" xmlns:cx2="http://schemas.microsoft.com/office/drawing/2015/10/21/chartex" xmlns:cx3="http://schemas.microsoft.com/office/drawing/2016/5/9/chartex" xmlns:cx4="http://schemas.microsoft.com/office/drawing/2016/5/10/chartex" xmlns:cx5="http://schemas.microsoft.com/office/drawing/2016/5/11/chartex" xmlns:cx6="http://schemas.microsoft.com/office/drawing/2016/5/12/chartex" xmlns:cx7="http://schemas.microsoft.com/office/drawing/2016/5/13/chartex" xmlns:cx8="http://schemas.microsoft.com/office/drawing/2016/5/14/chartex" xmlns:mc="http://schemas.openxmlformats.org/markup-compatibility/2006" xmlns:aink="http://schemas.microsoft.com/office/drawing/2016/ink" xmlns:am3d="http://schemas.microsoft.com/office/drawing/2017/model3d" xmlns:o="urn:schemas-microsoft-com:office:office" xmlns:r="http://schemas.openxmlformats.org/officeDocument/2006/relationships" xmlns:m="http://schemas.openxmlformats.org/officeDocument/2006/math" xmlns:v="urn:schemas-microsoft-com:vml" xmlns:wp14="http://schemas.microsoft.com/office/word/2010/wordprocessingDrawing" xmlns:wp="http://schemas.openxmlformats.org/drawingml/2006/wordprocessingDrawing" xmlns:w10="urn:schemas-microsoft-com:office:word" xmlns:w="http://schemas.openxmlformats.org/wordprocessingml/2006/main" xmlns:w14="http://schemas.microsoft.com/office/word/2010/wordml" xmlns:w15="http://schemas.microsoft.com/office/word/2012/wordml" xmlns:w16cex="http://schemas.microsoft.com/office/word/2018/wordml/cex" xmlns:w16cid="http://schemas.microsoft.com/office/word/2016/wordml/cid" xmlns:w16="http://schemas.microsoft.com/office/word/2018/wordml" xmlns:w16sdtdh="http://schemas.microsoft.com/office/word/2020/wordml/sdtdatahash" xmlns:w16se="http://schemas.microsoft.com/office/word/2015/wordml/symex" xmlns:wpg="http://schemas.microsoft.com/office/word/2010/wordprocessingGroup" xmlns:wpi="http://schemas.microsoft.com/office/word/2010/wordprocessingInk" xmlns:wne="http://schemas.microsoft.com/office/word/2006/wordml" xmlns:wps="http://schemas.microsoft.com/office/word/2010/wordprocessingShape" mc:Ignorable="w14 w15 w16se w16cid w16 w16cex w16sdtdh wp14">
+  <w:p>
+    <w:pPr>
+      <w:pStyle w:val="Footer"/>
       <w:spacing w:before="0" w:beforeAutospacing="0" w:after="0" w:afterAutospacing="0"/>
       <w:jc w:val="right"/>
     </w:pPr>
@@ -9700,27 +9995,14 @@
     <w:r>
       <w:t xml:space="preserve"> of </w:t>
     </w:r>
-    <w:r>
-      <w:fldChar w:fldCharType="begin"/>
-    </w:r>
-    <w:r>
-      <w:instrText xml:space="preserve"> NUMPAGES  \* Arabic  \* MERGEFORMAT </w:instrText>
-    </w:r>
-    <w:r>
-      <w:fldChar w:fldCharType="separate"/>
-    </w:r>
-    <w:r>
-      <w:rPr>
-        <w:noProof/>
-      </w:rPr>
-      <w:t>49</w:t>
-    </w:r>
-    <w:r>
-      <w:rPr>
-        <w:noProof/>
-      </w:rPr>
-      <w:fldChar w:fldCharType="end"/>
-    </w:r>
+    <w:fldSimple w:instr=" NUMPAGES  \* Arabic  \* MERGEFORMAT ">
+      <w:r>
+        <w:rPr>
+          <w:noProof/>
+        </w:rPr>
+        <w:t>49</w:t>
+      </w:r>
+    </w:fldSimple>
     <w:r>
       <w:t xml:space="preserve"> pages</w:t>
     </w:r>
@@ -9734,14 +10016,21 @@
       <w:t>June</w:t>
     </w:r>
     <w:r>
-      <w:t xml:space="preserve"> </w:t>
-    </w:r>
-    <w:r>
-      <w:t>4</w:t>
+      <w:t xml:space="preserve"> 5</w:t>
     </w:r>
     <w:r>
       <w:t>, 2025</w:t>
     </w:r>
+  </w:p>
+</w:ftr>
+</file>
+
+<file path=word/footer3.xml><?xml version="1.0" encoding="utf-8"?>
+<w:ftr xmlns:wpc="http://schemas.microsoft.com/office/word/2010/wordprocessingCanvas" xmlns:cx="http://schemas.microsoft.com/office/drawing/2014/chartex" xmlns:cx1="http://schemas.microsoft.com/office/drawing/2015/9/8/chartex" xmlns:cx2="http://schemas.microsoft.com/office/drawing/2015/10/21/chartex" xmlns:cx3="http://schemas.microsoft.com/office/drawing/2016/5/9/chartex" xmlns:cx4="http://schemas.microsoft.com/office/drawing/2016/5/10/chartex" xmlns:cx5="http://schemas.microsoft.com/office/drawing/2016/5/11/chartex" xmlns:cx6="http://schemas.microsoft.com/office/drawing/2016/5/12/chartex" xmlns:cx7="http://schemas.microsoft.com/office/drawing/2016/5/13/chartex" xmlns:cx8="http://schemas.microsoft.com/office/drawing/2016/5/14/chartex" xmlns:mc="http://schemas.openxmlformats.org/markup-compatibility/2006" xmlns:aink="http://schemas.microsoft.com/office/drawing/2016/ink" xmlns:am3d="http://schemas.microsoft.com/office/drawing/2017/model3d" xmlns:o="urn:schemas-microsoft-com:office:office" xmlns:r="http://schemas.openxmlformats.org/officeDocument/2006/relationships" xmlns:m="http://schemas.openxmlformats.org/officeDocument/2006/math" xmlns:v="urn:schemas-microsoft-com:vml" xmlns:wp14="http://schemas.microsoft.com/office/word/2010/wordprocessingDrawing" xmlns:wp="http://schemas.openxmlformats.org/drawingml/2006/wordprocessingDrawing" xmlns:w10="urn:schemas-microsoft-com:office:word" xmlns:w="http://schemas.openxmlformats.org/wordprocessingml/2006/main" xmlns:w14="http://schemas.microsoft.com/office/word/2010/wordml" xmlns:w15="http://schemas.microsoft.com/office/word/2012/wordml" xmlns:w16cex="http://schemas.microsoft.com/office/word/2018/wordml/cex" xmlns:w16cid="http://schemas.microsoft.com/office/word/2016/wordml/cid" xmlns:w16="http://schemas.microsoft.com/office/word/2018/wordml" xmlns:w16sdtdh="http://schemas.microsoft.com/office/word/2020/wordml/sdtdatahash" xmlns:w16se="http://schemas.microsoft.com/office/word/2015/wordml/symex" xmlns:wpg="http://schemas.microsoft.com/office/word/2010/wordprocessingGroup" xmlns:wpi="http://schemas.microsoft.com/office/word/2010/wordprocessingInk" xmlns:wne="http://schemas.microsoft.com/office/word/2006/wordml" xmlns:wps="http://schemas.microsoft.com/office/word/2010/wordprocessingShape" mc:Ignorable="w14 w15 w16se w16cid w16 w16cex w16sdtdh wp14">
+  <w:p>
+    <w:pPr>
+      <w:pStyle w:val="Footer"/>
+    </w:pPr>
   </w:p>
 </w:ftr>
 </file>
@@ -9770,6 +10059,36 @@
     </w:p>
   </w:footnote>
 </w:footnotes>
+</file>
+
+<file path=word/header1.xml><?xml version="1.0" encoding="utf-8"?>
+<w:hdr xmlns:wpc="http://schemas.microsoft.com/office/word/2010/wordprocessingCanvas" xmlns:cx="http://schemas.microsoft.com/office/drawing/2014/chartex" xmlns:cx1="http://schemas.microsoft.com/office/drawing/2015/9/8/chartex" xmlns:cx2="http://schemas.microsoft.com/office/drawing/2015/10/21/chartex" xmlns:cx3="http://schemas.microsoft.com/office/drawing/2016/5/9/chartex" xmlns:cx4="http://schemas.microsoft.com/office/drawing/2016/5/10/chartex" xmlns:cx5="http://schemas.microsoft.com/office/drawing/2016/5/11/chartex" xmlns:cx6="http://schemas.microsoft.com/office/drawing/2016/5/12/chartex" xmlns:cx7="http://schemas.microsoft.com/office/drawing/2016/5/13/chartex" xmlns:cx8="http://schemas.microsoft.com/office/drawing/2016/5/14/chartex" xmlns:mc="http://schemas.openxmlformats.org/markup-compatibility/2006" xmlns:aink="http://schemas.microsoft.com/office/drawing/2016/ink" xmlns:am3d="http://schemas.microsoft.com/office/drawing/2017/model3d" xmlns:o="urn:schemas-microsoft-com:office:office" xmlns:r="http://schemas.openxmlformats.org/officeDocument/2006/relationships" xmlns:m="http://schemas.openxmlformats.org/officeDocument/2006/math" xmlns:v="urn:schemas-microsoft-com:vml" xmlns:wp14="http://schemas.microsoft.com/office/word/2010/wordprocessingDrawing" xmlns:wp="http://schemas.openxmlformats.org/drawingml/2006/wordprocessingDrawing" xmlns:w10="urn:schemas-microsoft-com:office:word" xmlns:w="http://schemas.openxmlformats.org/wordprocessingml/2006/main" xmlns:w14="http://schemas.microsoft.com/office/word/2010/wordml" xmlns:w15="http://schemas.microsoft.com/office/word/2012/wordml" xmlns:w16cex="http://schemas.microsoft.com/office/word/2018/wordml/cex" xmlns:w16cid="http://schemas.microsoft.com/office/word/2016/wordml/cid" xmlns:w16="http://schemas.microsoft.com/office/word/2018/wordml" xmlns:w16sdtdh="http://schemas.microsoft.com/office/word/2020/wordml/sdtdatahash" xmlns:w16se="http://schemas.microsoft.com/office/word/2015/wordml/symex" xmlns:wpg="http://schemas.microsoft.com/office/word/2010/wordprocessingGroup" xmlns:wpi="http://schemas.microsoft.com/office/word/2010/wordprocessingInk" xmlns:wne="http://schemas.microsoft.com/office/word/2006/wordml" xmlns:wps="http://schemas.microsoft.com/office/word/2010/wordprocessingShape" mc:Ignorable="w14 w15 w16se w16cid w16 w16cex w16sdtdh wp14">
+  <w:p>
+    <w:pPr>
+      <w:pStyle w:val="Header"/>
+    </w:pPr>
+  </w:p>
+</w:hdr>
+</file>
+
+<file path=word/header2.xml><?xml version="1.0" encoding="utf-8"?>
+<w:hdr xmlns:wpc="http://schemas.microsoft.com/office/word/2010/wordprocessingCanvas" xmlns:cx="http://schemas.microsoft.com/office/drawing/2014/chartex" xmlns:cx1="http://schemas.microsoft.com/office/drawing/2015/9/8/chartex" xmlns:cx2="http://schemas.microsoft.com/office/drawing/2015/10/21/chartex" xmlns:cx3="http://schemas.microsoft.com/office/drawing/2016/5/9/chartex" xmlns:cx4="http://schemas.microsoft.com/office/drawing/2016/5/10/chartex" xmlns:cx5="http://schemas.microsoft.com/office/drawing/2016/5/11/chartex" xmlns:cx6="http://schemas.microsoft.com/office/drawing/2016/5/12/chartex" xmlns:cx7="http://schemas.microsoft.com/office/drawing/2016/5/13/chartex" xmlns:cx8="http://schemas.microsoft.com/office/drawing/2016/5/14/chartex" xmlns:mc="http://schemas.openxmlformats.org/markup-compatibility/2006" xmlns:aink="http://schemas.microsoft.com/office/drawing/2016/ink" xmlns:am3d="http://schemas.microsoft.com/office/drawing/2017/model3d" xmlns:o="urn:schemas-microsoft-com:office:office" xmlns:r="http://schemas.openxmlformats.org/officeDocument/2006/relationships" xmlns:m="http://schemas.openxmlformats.org/officeDocument/2006/math" xmlns:v="urn:schemas-microsoft-com:vml" xmlns:wp14="http://schemas.microsoft.com/office/word/2010/wordprocessingDrawing" xmlns:wp="http://schemas.openxmlformats.org/drawingml/2006/wordprocessingDrawing" xmlns:w10="urn:schemas-microsoft-com:office:word" xmlns:w="http://schemas.openxmlformats.org/wordprocessingml/2006/main" xmlns:w14="http://schemas.microsoft.com/office/word/2010/wordml" xmlns:w15="http://schemas.microsoft.com/office/word/2012/wordml" xmlns:w16cex="http://schemas.microsoft.com/office/word/2018/wordml/cex" xmlns:w16cid="http://schemas.microsoft.com/office/word/2016/wordml/cid" xmlns:w16="http://schemas.microsoft.com/office/word/2018/wordml" xmlns:w16sdtdh="http://schemas.microsoft.com/office/word/2020/wordml/sdtdatahash" xmlns:w16se="http://schemas.microsoft.com/office/word/2015/wordml/symex" xmlns:wpg="http://schemas.microsoft.com/office/word/2010/wordprocessingGroup" xmlns:wpi="http://schemas.microsoft.com/office/word/2010/wordprocessingInk" xmlns:wne="http://schemas.microsoft.com/office/word/2006/wordml" xmlns:wps="http://schemas.microsoft.com/office/word/2010/wordprocessingShape" mc:Ignorable="w14 w15 w16se w16cid w16 w16cex w16sdtdh wp14">
+  <w:p>
+    <w:pPr>
+      <w:pStyle w:val="Header"/>
+    </w:pPr>
+  </w:p>
+</w:hdr>
+</file>
+
+<file path=word/header3.xml><?xml version="1.0" encoding="utf-8"?>
+<w:hdr xmlns:wpc="http://schemas.microsoft.com/office/word/2010/wordprocessingCanvas" xmlns:cx="http://schemas.microsoft.com/office/drawing/2014/chartex" xmlns:cx1="http://schemas.microsoft.com/office/drawing/2015/9/8/chartex" xmlns:cx2="http://schemas.microsoft.com/office/drawing/2015/10/21/chartex" xmlns:cx3="http://schemas.microsoft.com/office/drawing/2016/5/9/chartex" xmlns:cx4="http://schemas.microsoft.com/office/drawing/2016/5/10/chartex" xmlns:cx5="http://schemas.microsoft.com/office/drawing/2016/5/11/chartex" xmlns:cx6="http://schemas.microsoft.com/office/drawing/2016/5/12/chartex" xmlns:cx7="http://schemas.microsoft.com/office/drawing/2016/5/13/chartex" xmlns:cx8="http://schemas.microsoft.com/office/drawing/2016/5/14/chartex" xmlns:mc="http://schemas.openxmlformats.org/markup-compatibility/2006" xmlns:aink="http://schemas.microsoft.com/office/drawing/2016/ink" xmlns:am3d="http://schemas.microsoft.com/office/drawing/2017/model3d" xmlns:o="urn:schemas-microsoft-com:office:office" xmlns:r="http://schemas.openxmlformats.org/officeDocument/2006/relationships" xmlns:m="http://schemas.openxmlformats.org/officeDocument/2006/math" xmlns:v="urn:schemas-microsoft-com:vml" xmlns:wp14="http://schemas.microsoft.com/office/word/2010/wordprocessingDrawing" xmlns:wp="http://schemas.openxmlformats.org/drawingml/2006/wordprocessingDrawing" xmlns:w10="urn:schemas-microsoft-com:office:word" xmlns:w="http://schemas.openxmlformats.org/wordprocessingml/2006/main" xmlns:w14="http://schemas.microsoft.com/office/word/2010/wordml" xmlns:w15="http://schemas.microsoft.com/office/word/2012/wordml" xmlns:w16cex="http://schemas.microsoft.com/office/word/2018/wordml/cex" xmlns:w16cid="http://schemas.microsoft.com/office/word/2016/wordml/cid" xmlns:w16="http://schemas.microsoft.com/office/word/2018/wordml" xmlns:w16sdtdh="http://schemas.microsoft.com/office/word/2020/wordml/sdtdatahash" xmlns:w16se="http://schemas.microsoft.com/office/word/2015/wordml/symex" xmlns:wpg="http://schemas.microsoft.com/office/word/2010/wordprocessingGroup" xmlns:wpi="http://schemas.microsoft.com/office/word/2010/wordprocessingInk" xmlns:wne="http://schemas.microsoft.com/office/word/2006/wordml" xmlns:wps="http://schemas.microsoft.com/office/word/2010/wordprocessingShape" mc:Ignorable="w14 w15 w16se w16cid w16 w16cex w16sdtdh wp14">
+  <w:p>
+    <w:pPr>
+      <w:pStyle w:val="Header"/>
+    </w:pPr>
+  </w:p>
+</w:hdr>
 </file>
 
 <file path=word/numbering.xml><?xml version="1.0" encoding="utf-8"?>

</xml_diff>

<commit_message>
Check w Jeannie keep both options for responding in mid case, fixed logic in modify_divorce_step and content.docx
</commit_message>
<xml_diff>
--- a/docassemble/ChangingDivorceOrder/data/templates/changing_divorce_order_action_plan.docx
+++ b/docassemble/ChangingDivorceOrder/data/templates/changing_divorce_order_action_plan.docx
@@ -4385,16 +4385,13 @@
               <w:rPr>
                 <w:color w:val="FF0000"/>
               </w:rPr>
-              <w:t xml:space="preserve"> if user_need == 'change foreign custody order' or (not user_need in('respond to motion in custody', 'respond to motion in divorce') and middle_of_case == 'no')</w:t>
+              <w:t xml:space="preserve"> if not user_need in('respond to motion in custody', 'respond to motion in divorce') </w:t>
             </w:r>
             <w:r>
               <w:rPr>
                 <w:color w:val="FF0000"/>
               </w:rPr>
-              <w:t xml:space="preserve"> %}</w:t>
-            </w:r>
-            <w:r>
-              <w:t>:</w:t>
+              <w:t>%}</w:t>
             </w:r>
           </w:p>
           <w:p>
@@ -4569,7 +4566,7 @@
               <w:rPr>
                 <w:shd w:val="clear" w:color="auto" w:fill="FFFFFF"/>
               </w:rPr>
-              <w:t>.any_true(</w:t>
+              <w:t>[</w:t>
             </w:r>
             <w:r>
               <w:rPr>
@@ -4581,26 +4578,19 @@
               <w:rPr>
                 <w:shd w:val="clear" w:color="auto" w:fill="FFFFFF"/>
               </w:rPr>
-              <w:t>spousal support', 'property or debt</w:t>
-            </w:r>
-            <w:r>
-              <w:rPr>
-                <w:shd w:val="clear" w:color="auto" w:fill="FFFFFF"/>
-              </w:rPr>
-              <w:t>'</w:t>
-            </w:r>
-            <w:r>
-              <w:rPr>
-                <w:shd w:val="clear" w:color="auto" w:fill="FFFFFF"/>
-              </w:rPr>
-              <w:t>) and why_change_divorce_or</w:t>
-            </w:r>
-            <w:r>
-              <w:rPr>
-                <w:shd w:val="clear" w:color="auto" w:fill="FFFFFF"/>
-              </w:rPr>
-              <w:lastRenderedPageBreak/>
-              <w:t>der == 'changed circumstances' %}</w:t>
+              <w:t>spousal support'</w:t>
+            </w:r>
+            <w:r>
+              <w:rPr>
+                <w:shd w:val="clear" w:color="auto" w:fill="FFFFFF"/>
+              </w:rPr>
+              <w:t>]</w:t>
+            </w:r>
+            <w:r>
+              <w:rPr>
+                <w:shd w:val="clear" w:color="auto" w:fill="FFFFFF"/>
+              </w:rPr>
+              <w:t xml:space="preserve"> and why_change_divorce_order == 'changed circumstances' %}</w:t>
             </w:r>
           </w:p>
         </w:tc>
@@ -4619,7 +4609,6 @@
             </w:pPr>
             <w:proofErr w:type="spellStart"/>
             <w:r>
-              <w:lastRenderedPageBreak/>
               <w:t>fill_modify_divorce_step</w:t>
             </w:r>
             <w:proofErr w:type="spellEnd"/>
@@ -4645,6 +4634,7 @@
               <w:outlineLvl w:val="1"/>
             </w:pPr>
             <w:r>
+              <w:lastRenderedPageBreak/>
               <w:t xml:space="preserve">{{ </w:t>
             </w:r>
             <w:proofErr w:type="spellStart"/>
@@ -5269,7 +5259,6 @@
               </w:rPr>
             </w:pPr>
             <w:r>
-              <w:lastRenderedPageBreak/>
               <w:t>{%</w:t>
             </w:r>
             <w:r>
@@ -5338,7 +5327,11 @@
               <w:t xml:space="preserve"> </w:t>
             </w:r>
             <w:r>
-              <w:t>interim_order_date_within_10_days</w:t>
+              <w:t>interim_order_date_withi</w:t>
+            </w:r>
+            <w:r>
+              <w:lastRenderedPageBreak/>
+              <w:t>n_10_days</w:t>
             </w:r>
             <w:r>
               <w:t xml:space="preserve"> </w:t>
@@ -5387,6 +5380,7 @@
             </w:pPr>
             <w:proofErr w:type="spellStart"/>
             <w:r>
+              <w:lastRenderedPageBreak/>
               <w:t>learn_reconsider_step</w:t>
             </w:r>
             <w:proofErr w:type="spellEnd"/>
@@ -5402,6 +5396,7 @@
               <w:t xml:space="preserve"> in </w:t>
             </w:r>
             <w:r>
+              <w:lastRenderedPageBreak/>
               <w:t>aka2j_mod_cust_div_templates.yml</w:t>
             </w:r>
           </w:p>
@@ -5426,6 +5421,7 @@
               <w:outlineLvl w:val="1"/>
             </w:pPr>
             <w:r>
+              <w:lastRenderedPageBreak/>
               <w:t xml:space="preserve">{{ </w:t>
             </w:r>
             <w:proofErr w:type="spellStart"/>
@@ -5927,43 +5923,109 @@
               <w:rPr>
                 <w:shd w:val="clear" w:color="auto" w:fill="FFFFFF"/>
               </w:rPr>
+              <w:t>{%tr</w:t>
+            </w:r>
+            <w:r>
+              <w:rPr>
+                <w:shd w:val="clear" w:color="auto" w:fill="FFFFFF"/>
+              </w:rPr>
+              <w:t xml:space="preserve"> </w:t>
+            </w:r>
+            <w:r>
+              <w:rPr>
+                <w:shd w:val="clear" w:color="auto" w:fill="FFFFFF"/>
+              </w:rPr>
+              <w:t>if</w:t>
+            </w:r>
+            <w:r>
+              <w:rPr>
+                <w:shd w:val="clear" w:color="auto" w:fill="FFFFFF"/>
+              </w:rPr>
+              <w:t xml:space="preserve"> </w:t>
+            </w:r>
+            <w:r>
+              <w:rPr>
+                <w:shd w:val="clear" w:color="auto" w:fill="FFFFFF"/>
+              </w:rPr>
+              <w:t>type_of_interim_order</w:t>
+            </w:r>
+            <w:r>
+              <w:rPr>
+                <w:shd w:val="clear" w:color="auto" w:fill="FFFFFF"/>
+              </w:rPr>
+              <w:t xml:space="preserve"> </w:t>
+            </w:r>
+            <w:r>
+              <w:rPr>
+                <w:shd w:val="clear" w:color="auto" w:fill="FFFFFF"/>
+              </w:rPr>
+              <w:t>==</w:t>
+            </w:r>
+            <w:r>
+              <w:rPr>
+                <w:shd w:val="clear" w:color="auto" w:fill="FFFFFF"/>
+              </w:rPr>
+              <w:t xml:space="preserve"> </w:t>
+            </w:r>
+            <w:r>
+              <w:rPr>
+                <w:shd w:val="clear" w:color="auto" w:fill="FFFFFF"/>
+              </w:rPr>
+              <w:t>'standing</w:t>
+            </w:r>
+            <w:r>
+              <w:rPr>
+                <w:shd w:val="clear" w:color="auto" w:fill="FFFFFF"/>
+              </w:rPr>
+              <w:t xml:space="preserve"> </w:t>
+            </w:r>
+            <w:r>
+              <w:rPr>
+                <w:shd w:val="clear" w:color="auto" w:fill="FFFFFF"/>
+              </w:rPr>
+              <w:t>order'</w:t>
+            </w:r>
+            <w:r>
+              <w:rPr>
+                <w:shd w:val="clear" w:color="auto" w:fill="FFFFFF"/>
+              </w:rPr>
+              <w:t xml:space="preserve"> </w:t>
+            </w:r>
+            <w:r>
+              <w:rPr>
+                <w:shd w:val="clear" w:color="auto" w:fill="FFFFFF"/>
+              </w:rPr>
+              <w:t>or</w:t>
+            </w:r>
+            <w:r>
+              <w:rPr>
+                <w:shd w:val="clear" w:color="auto" w:fill="FFFFFF"/>
+              </w:rPr>
+              <w:t xml:space="preserve"> </w:t>
+            </w:r>
+            <w:r>
+              <w:rPr>
+                <w:shd w:val="clear" w:color="auto" w:fill="FFFFFF"/>
+              </w:rPr>
+              <w:t>(</w:t>
+            </w:r>
+            <w:r>
+              <w:rPr>
+                <w:shd w:val="clear" w:color="auto" w:fill="FFFFFF"/>
+              </w:rPr>
+              <w:t>type_of_interim_order</w:t>
+            </w:r>
+            <w:r>
+              <w:rPr>
+                <w:shd w:val="clear" w:color="auto" w:fill="FFFFFF"/>
+              </w:rPr>
+              <w:t xml:space="preserve"> </w:t>
+            </w:r>
+            <w:r>
+              <w:rPr>
+                <w:shd w:val="clear" w:color="auto" w:fill="FFFFFF"/>
+              </w:rPr>
               <w:lastRenderedPageBreak/>
-              <w:t>{%tr</w:t>
-            </w:r>
-            <w:r>
-              <w:rPr>
-                <w:shd w:val="clear" w:color="auto" w:fill="FFFFFF"/>
-              </w:rPr>
-              <w:t xml:space="preserve"> </w:t>
-            </w:r>
-            <w:r>
-              <w:rPr>
-                <w:shd w:val="clear" w:color="auto" w:fill="FFFFFF"/>
-              </w:rPr>
-              <w:t>if</w:t>
-            </w:r>
-            <w:r>
-              <w:rPr>
-                <w:shd w:val="clear" w:color="auto" w:fill="FFFFFF"/>
-              </w:rPr>
-              <w:t xml:space="preserve"> </w:t>
-            </w:r>
-            <w:r>
-              <w:rPr>
-                <w:shd w:val="clear" w:color="auto" w:fill="FFFFFF"/>
-              </w:rPr>
-              <w:t>type_of_interim_order</w:t>
-            </w:r>
-            <w:r>
-              <w:rPr>
-                <w:shd w:val="clear" w:color="auto" w:fill="FFFFFF"/>
-              </w:rPr>
-              <w:t xml:space="preserve"> </w:t>
-            </w:r>
-            <w:r>
-              <w:rPr>
-                <w:shd w:val="clear" w:color="auto" w:fill="FFFFFF"/>
-              </w:rPr>
               <w:t>==</w:t>
             </w:r>
             <w:r>
@@ -5976,72 +6038,6 @@
               <w:rPr>
                 <w:shd w:val="clear" w:color="auto" w:fill="FFFFFF"/>
               </w:rPr>
-              <w:t>'standing</w:t>
-            </w:r>
-            <w:r>
-              <w:rPr>
-                <w:shd w:val="clear" w:color="auto" w:fill="FFFFFF"/>
-              </w:rPr>
-              <w:t xml:space="preserve"> </w:t>
-            </w:r>
-            <w:r>
-              <w:rPr>
-                <w:shd w:val="clear" w:color="auto" w:fill="FFFFFF"/>
-              </w:rPr>
-              <w:t>order'</w:t>
-            </w:r>
-            <w:r>
-              <w:rPr>
-                <w:shd w:val="clear" w:color="auto" w:fill="FFFFFF"/>
-              </w:rPr>
-              <w:t xml:space="preserve"> </w:t>
-            </w:r>
-            <w:r>
-              <w:rPr>
-                <w:shd w:val="clear" w:color="auto" w:fill="FFFFFF"/>
-              </w:rPr>
-              <w:t>or</w:t>
-            </w:r>
-            <w:r>
-              <w:rPr>
-                <w:shd w:val="clear" w:color="auto" w:fill="FFFFFF"/>
-              </w:rPr>
-              <w:t xml:space="preserve"> </w:t>
-            </w:r>
-            <w:r>
-              <w:rPr>
-                <w:shd w:val="clear" w:color="auto" w:fill="FFFFFF"/>
-              </w:rPr>
-              <w:t>(</w:t>
-            </w:r>
-            <w:r>
-              <w:rPr>
-                <w:shd w:val="clear" w:color="auto" w:fill="FFFFFF"/>
-              </w:rPr>
-              <w:t>type_of_interim_order</w:t>
-            </w:r>
-            <w:r>
-              <w:rPr>
-                <w:shd w:val="clear" w:color="auto" w:fill="FFFFFF"/>
-              </w:rPr>
-              <w:t xml:space="preserve"> </w:t>
-            </w:r>
-            <w:r>
-              <w:rPr>
-                <w:shd w:val="clear" w:color="auto" w:fill="FFFFFF"/>
-              </w:rPr>
-              <w:t>==</w:t>
-            </w:r>
-            <w:r>
-              <w:rPr>
-                <w:shd w:val="clear" w:color="auto" w:fill="FFFFFF"/>
-              </w:rPr>
-              <w:t xml:space="preserve"> </w:t>
-            </w:r>
-            <w:r>
-              <w:rPr>
-                <w:shd w:val="clear" w:color="auto" w:fill="FFFFFF"/>
-              </w:rPr>
               <w:t>'motion'</w:t>
             </w:r>
             <w:r>
@@ -6120,6 +6116,7 @@
               <w:rPr>
                 <w:shd w:val="clear" w:color="auto" w:fill="FFFFFF"/>
               </w:rPr>
+              <w:lastRenderedPageBreak/>
               <w:t xml:space="preserve">motion_forms_step </w:t>
             </w:r>
             <w:r>
@@ -6587,50 +6584,50 @@
               <w:t>if</w:t>
             </w:r>
             <w:r>
-              <w:t xml:space="preserve"> unknown_final_date['set </w:t>
+              <w:t xml:space="preserve"> unknown_final_date['set aside'</w:t>
+            </w:r>
+            <w:r>
+              <w:t>]</w:t>
+            </w:r>
+            <w:r>
+              <w:rPr>
+                <w:color w:val="FF0000"/>
+              </w:rPr>
+              <w:t xml:space="preserve"> </w:t>
+            </w:r>
+            <w:r>
+              <w:rPr>
+                <w:color w:val="FF0000"/>
+              </w:rPr>
+              <w:t xml:space="preserve">or </w:t>
+            </w:r>
+            <w:r>
+              <w:rPr>
+                <w:color w:val="FF0000"/>
+              </w:rPr>
+              <w:t>(</w:t>
+            </w:r>
+            <w:r>
+              <w:rPr>
+                <w:color w:val="92D050"/>
+              </w:rPr>
+              <w:t>(</w:t>
+            </w:r>
+            <w:r>
+              <w:rPr>
+                <w:color w:val="FFC000"/>
+              </w:rPr>
+              <w:t>(</w:t>
+            </w:r>
+            <w:r>
+              <w:t>type_of_final_order</w:t>
+            </w:r>
+            <w:r>
+              <w:t xml:space="preserve">['custody order'] and why_change == </w:t>
             </w:r>
             <w:r>
               <w:lastRenderedPageBreak/>
-              <w:t>aside'</w:t>
-            </w:r>
-            <w:r>
-              <w:t>]</w:t>
-            </w:r>
-            <w:r>
-              <w:rPr>
-                <w:color w:val="FF0000"/>
-              </w:rPr>
-              <w:t xml:space="preserve"> </w:t>
-            </w:r>
-            <w:r>
-              <w:rPr>
-                <w:color w:val="FF0000"/>
-              </w:rPr>
-              <w:t xml:space="preserve">or </w:t>
-            </w:r>
-            <w:r>
-              <w:rPr>
-                <w:color w:val="FF0000"/>
-              </w:rPr>
-              <w:t>(</w:t>
-            </w:r>
-            <w:r>
-              <w:rPr>
-                <w:color w:val="92D050"/>
-              </w:rPr>
-              <w:t>(</w:t>
-            </w:r>
-            <w:r>
-              <w:rPr>
-                <w:color w:val="FFC000"/>
-              </w:rPr>
-              <w:t>(</w:t>
-            </w:r>
-            <w:r>
-              <w:t>type_of_final_order</w:t>
-            </w:r>
-            <w:r>
-              <w:t>['custody order'] and why_change == 'problem'</w:t>
+              <w:t>'problem'</w:t>
             </w:r>
             <w:r>
               <w:rPr>
@@ -6822,7 +6819,6 @@
               <w:t xml:space="preserve"> in </w:t>
             </w:r>
             <w:r>
-              <w:lastRenderedPageBreak/>
               <w:t>aka2j_mod_cust_div_templates.yml</w:t>
             </w:r>
           </w:p>
@@ -7114,14 +7110,7 @@
               <w:rPr>
                 <w:shd w:val="clear" w:color="auto" w:fill="FFFFFF"/>
               </w:rPr>
-              <w:t>respond_to_rec</w:t>
-            </w:r>
-            <w:r>
-              <w:rPr>
-                <w:shd w:val="clear" w:color="auto" w:fill="FFFFFF"/>
-              </w:rPr>
-              <w:lastRenderedPageBreak/>
-              <w:t>onsider_step</w:t>
+              <w:t>respond_to_reconsider_step</w:t>
             </w:r>
             <w:r>
               <w:rPr>
@@ -7160,14 +7149,7 @@
               <w:rPr>
                 <w:shd w:val="clear" w:color="auto" w:fill="FFFFFF"/>
               </w:rPr>
-              <w:t>respond_to_r</w:t>
-            </w:r>
-            <w:r>
-              <w:rPr>
-                <w:shd w:val="clear" w:color="auto" w:fill="FFFFFF"/>
-              </w:rPr>
-              <w:lastRenderedPageBreak/>
-              <w:t>econsider</w:t>
+              <w:t>respond_to_reconsider</w:t>
             </w:r>
             <w:r>
               <w:t>_content.docx")) }}</w:t>
@@ -7657,58 +7639,71 @@
               <w:rPr>
                 <w:shd w:val="clear" w:color="auto" w:fill="FFFFFF"/>
               </w:rPr>
+              <w:t xml:space="preserve">{%tr if user_need == 'change foreign custody order' or </w:t>
+            </w:r>
+            <w:r>
+              <w:rPr>
+                <w:color w:val="FF0000"/>
+                <w:shd w:val="clear" w:color="auto" w:fill="FFFFFF"/>
+              </w:rPr>
+              <w:t>(</w:t>
+            </w:r>
+            <w:r>
+              <w:rPr>
+                <w:shd w:val="clear" w:color="auto" w:fill="FFFFFF"/>
+              </w:rPr>
+              <w:t xml:space="preserve">user_need in('change custody </w:t>
+            </w:r>
+            <w:r>
+              <w:rPr>
+                <w:shd w:val="clear" w:color="auto" w:fill="FFFFFF"/>
+              </w:rPr>
               <w:lastRenderedPageBreak/>
-              <w:t xml:space="preserve">{%tr if user_need == 'change foreign custody order' or </w:t>
+              <w:t xml:space="preserve">order', 'change divorce order') and not </w:t>
+            </w:r>
+            <w:r>
+              <w:rPr>
+                <w:shd w:val="clear" w:color="auto" w:fill="FFFFFF"/>
+              </w:rPr>
+              <w:t>unknown_final_date</w:t>
+            </w:r>
+            <w:r>
+              <w:rPr>
+                <w:shd w:val="clear" w:color="auto" w:fill="FFFFFF"/>
+              </w:rPr>
+              <w:t>.all_true</w:t>
+            </w:r>
+            <w:r>
+              <w:rPr>
+                <w:color w:val="00B0F0"/>
+                <w:shd w:val="clear" w:color="auto" w:fill="FFFFFF"/>
+              </w:rPr>
+              <w:t>(</w:t>
+            </w:r>
+            <w:r>
+              <w:rPr>
+                <w:shd w:val="clear" w:color="auto" w:fill="FFFFFF"/>
+              </w:rPr>
+              <w:t>'appeal'</w:t>
+            </w:r>
+            <w:r>
+              <w:rPr>
+                <w:shd w:val="clear" w:color="auto" w:fill="FFFFFF"/>
+              </w:rPr>
+              <w:t>, exclusive = True</w:t>
+            </w:r>
+            <w:r>
+              <w:rPr>
+                <w:color w:val="00B0F0"/>
+                <w:shd w:val="clear" w:color="auto" w:fill="FFFFFF"/>
+              </w:rPr>
+              <w:t>)</w:t>
             </w:r>
             <w:r>
               <w:rPr>
                 <w:color w:val="FF0000"/>
                 <w:shd w:val="clear" w:color="auto" w:fill="FFFFFF"/>
               </w:rPr>
-              <w:t>(</w:t>
-            </w:r>
-            <w:r>
-              <w:rPr>
-                <w:shd w:val="clear" w:color="auto" w:fill="FFFFFF"/>
-              </w:rPr>
-              <w:t xml:space="preserve">user_need in('change custody order', 'change divorce order') and not </w:t>
-            </w:r>
-            <w:r>
-              <w:rPr>
-                <w:shd w:val="clear" w:color="auto" w:fill="FFFFFF"/>
-              </w:rPr>
-              <w:t>unknown_final_date</w:t>
-            </w:r>
-            <w:r>
-              <w:rPr>
-                <w:shd w:val="clear" w:color="auto" w:fill="FFFFFF"/>
-              </w:rPr>
-              <w:t>.all_true</w:t>
-            </w:r>
-            <w:r>
-              <w:rPr>
-                <w:color w:val="00B0F0"/>
-                <w:shd w:val="clear" w:color="auto" w:fill="FFFFFF"/>
-              </w:rPr>
-              <w:t>(</w:t>
-            </w:r>
-            <w:r>
-              <w:rPr>
-                <w:shd w:val="clear" w:color="auto" w:fill="FFFFFF"/>
-              </w:rPr>
-              <w:t>'appeal'</w:t>
-            </w:r>
-            <w:r>
-              <w:rPr>
-                <w:shd w:val="clear" w:color="auto" w:fill="FFFFFF"/>
-              </w:rPr>
-              <w:t>, exclusive = True</w:t>
-            </w:r>
-            <w:r>
-              <w:rPr>
-                <w:color w:val="00B0F0"/>
-                <w:shd w:val="clear" w:color="auto" w:fill="FFFFFF"/>
-              </w:rPr>
               <w:t>)</w:t>
             </w:r>
             <w:r>
@@ -7716,69 +7711,62 @@
                 <w:color w:val="FF0000"/>
                 <w:shd w:val="clear" w:color="auto" w:fill="FFFFFF"/>
               </w:rPr>
+              <w:t xml:space="preserve"> or (</w:t>
+            </w:r>
+            <w:r>
+              <w:rPr>
+                <w:shd w:val="clear" w:color="auto" w:fill="FFFFFF"/>
+              </w:rPr>
+              <w:t>user_need in</w:t>
+            </w:r>
+            <w:r>
+              <w:t>('respond to motion in custody', 'respond to motion in divorce')</w:t>
+            </w:r>
+            <w:r>
+              <w:rPr>
+                <w:shd w:val="clear" w:color="auto" w:fill="FFFFFF"/>
+              </w:rPr>
+              <w:t xml:space="preserve"> </w:t>
+            </w:r>
+            <w:r>
+              <w:rPr>
+                <w:shd w:val="clear" w:color="auto" w:fill="FFFFFF"/>
+              </w:rPr>
+              <w:t>and type_of_response in(</w:t>
+            </w:r>
+            <w:r>
+              <w:rPr>
+                <w:shd w:val="clear" w:color="auto" w:fill="FFFFFF"/>
+              </w:rPr>
+              <w:t xml:space="preserve">'reconsider', </w:t>
+            </w:r>
+            <w:r>
+              <w:rPr>
+                <w:shd w:val="clear" w:color="auto" w:fill="FFFFFF"/>
+              </w:rPr>
+              <w:t>'modify',</w:t>
+            </w:r>
+            <w:r>
+              <w:rPr>
+                <w:shd w:val="clear" w:color="auto" w:fill="FFFFFF"/>
+              </w:rPr>
+              <w:t xml:space="preserve"> </w:t>
+            </w:r>
+            <w:r>
+              <w:rPr>
+                <w:shd w:val="clear" w:color="auto" w:fill="FFFFFF"/>
+              </w:rPr>
+              <w:t>'set aside')</w:t>
+            </w:r>
+            <w:r>
+              <w:rPr>
+                <w:color w:val="FF0000"/>
+                <w:shd w:val="clear" w:color="auto" w:fill="FFFFFF"/>
+              </w:rPr>
               <w:t>)</w:t>
             </w:r>
             <w:r>
               <w:rPr>
-                <w:color w:val="FF0000"/>
-                <w:shd w:val="clear" w:color="auto" w:fill="FFFFFF"/>
-              </w:rPr>
-              <w:t xml:space="preserve"> or (</w:t>
-            </w:r>
-            <w:r>
-              <w:rPr>
-                <w:shd w:val="clear" w:color="auto" w:fill="FFFFFF"/>
-              </w:rPr>
-              <w:t>user_need in</w:t>
-            </w:r>
-            <w:r>
-              <w:t>('respond to motion in custody', 'respond to motion in divorce')</w:t>
-            </w:r>
-            <w:r>
-              <w:rPr>
-                <w:shd w:val="clear" w:color="auto" w:fill="FFFFFF"/>
-              </w:rPr>
-              <w:t xml:space="preserve"> </w:t>
-            </w:r>
-            <w:r>
-              <w:rPr>
-                <w:shd w:val="clear" w:color="auto" w:fill="FFFFFF"/>
-              </w:rPr>
-              <w:t>and type_of_response in(</w:t>
-            </w:r>
-            <w:r>
-              <w:rPr>
-                <w:shd w:val="clear" w:color="auto" w:fill="FFFFFF"/>
-              </w:rPr>
-              <w:t xml:space="preserve">'reconsider', </w:t>
-            </w:r>
-            <w:r>
-              <w:rPr>
-                <w:shd w:val="clear" w:color="auto" w:fill="FFFFFF"/>
-              </w:rPr>
-              <w:t>'modify',</w:t>
-            </w:r>
-            <w:r>
-              <w:rPr>
-                <w:shd w:val="clear" w:color="auto" w:fill="FFFFFF"/>
-              </w:rPr>
-              <w:t xml:space="preserve"> </w:t>
-            </w:r>
-            <w:r>
-              <w:rPr>
-                <w:shd w:val="clear" w:color="auto" w:fill="FFFFFF"/>
-              </w:rPr>
-              <w:t>'set aside')</w:t>
-            </w:r>
-            <w:r>
-              <w:rPr>
-                <w:color w:val="FF0000"/>
-                <w:shd w:val="clear" w:color="auto" w:fill="FFFFFF"/>
-              </w:rPr>
-              <w:t>)</w:t>
-            </w:r>
-            <w:r>
-              <w:rPr>
                 <w:shd w:val="clear" w:color="auto" w:fill="FFFFFF"/>
               </w:rPr>
               <w:t xml:space="preserve"> </w:t>
@@ -7805,6 +7793,7 @@
               <w:pStyle w:val="Body"/>
             </w:pPr>
             <w:r>
+              <w:lastRenderedPageBreak/>
               <w:t>sign</w:t>
             </w:r>
             <w:r>
@@ -7850,6 +7839,7 @@
               <w:br/>
             </w:r>
             <w:r>
+              <w:lastRenderedPageBreak/>
               <w:t xml:space="preserve">in </w:t>
             </w:r>
             <w:r>
@@ -7880,6 +7870,7 @@
               <w:outlineLvl w:val="1"/>
             </w:pPr>
             <w:r>
+              <w:lastRenderedPageBreak/>
               <w:t>{{ sign_step.subject }}</w:t>
             </w:r>
           </w:p>
@@ -8186,51 +8177,51 @@
               <w:rPr>
                 <w:shd w:val="clear" w:color="auto" w:fill="FFFFFF"/>
               </w:rPr>
+              <w:t>final_order_date_within_10_day</w:t>
+            </w:r>
+            <w:r>
+              <w:rPr>
+                <w:shd w:val="clear" w:color="auto" w:fill="FFFFFF"/>
+              </w:rPr>
+              <w:t xml:space="preserve">s </w:t>
+            </w:r>
+            <w:r>
+              <w:rPr>
+                <w:color w:val="00B050"/>
+                <w:shd w:val="clear" w:color="auto" w:fill="FFFFFF"/>
+              </w:rPr>
+              <w:t xml:space="preserve">or </w:t>
+            </w:r>
+            <w:r>
+              <w:rPr>
+                <w:shd w:val="clear" w:color="auto" w:fill="FFFFFF"/>
+              </w:rPr>
+              <w:t>unknown_final_date.all_true</w:t>
+            </w:r>
+            <w:r>
+              <w:rPr>
+                <w:color w:val="00B0F0"/>
+                <w:shd w:val="clear" w:color="auto" w:fill="FFFFFF"/>
+              </w:rPr>
+              <w:t>(</w:t>
+            </w:r>
+            <w:r>
+              <w:rPr>
+                <w:shd w:val="clear" w:color="auto" w:fill="FFFFFF"/>
+              </w:rPr>
+              <w:t>'reconsider',</w:t>
+            </w:r>
+            <w:r>
+              <w:rPr>
+                <w:shd w:val="clear" w:color="auto" w:fill="FFFFFF"/>
+              </w:rPr>
+              <w:t xml:space="preserve"> </w:t>
+            </w:r>
+            <w:r>
+              <w:rPr>
+                <w:shd w:val="clear" w:color="auto" w:fill="FFFFFF"/>
+              </w:rPr>
               <w:lastRenderedPageBreak/>
-              <w:t>final_order_date_within_10_day</w:t>
-            </w:r>
-            <w:r>
-              <w:rPr>
-                <w:shd w:val="clear" w:color="auto" w:fill="FFFFFF"/>
-              </w:rPr>
-              <w:t xml:space="preserve">s </w:t>
-            </w:r>
-            <w:r>
-              <w:rPr>
-                <w:color w:val="00B050"/>
-                <w:shd w:val="clear" w:color="auto" w:fill="FFFFFF"/>
-              </w:rPr>
-              <w:t xml:space="preserve">or </w:t>
-            </w:r>
-            <w:r>
-              <w:rPr>
-                <w:shd w:val="clear" w:color="auto" w:fill="FFFFFF"/>
-              </w:rPr>
-              <w:t>unknown_final_date.all_true</w:t>
-            </w:r>
-            <w:r>
-              <w:rPr>
-                <w:color w:val="00B0F0"/>
-                <w:shd w:val="clear" w:color="auto" w:fill="FFFFFF"/>
-              </w:rPr>
-              <w:t>(</w:t>
-            </w:r>
-            <w:r>
-              <w:rPr>
-                <w:shd w:val="clear" w:color="auto" w:fill="FFFFFF"/>
-              </w:rPr>
-              <w:t>'reconsider',</w:t>
-            </w:r>
-            <w:r>
-              <w:rPr>
-                <w:shd w:val="clear" w:color="auto" w:fill="FFFFFF"/>
-              </w:rPr>
-              <w:t xml:space="preserve"> </w:t>
-            </w:r>
-            <w:r>
-              <w:rPr>
-                <w:shd w:val="clear" w:color="auto" w:fill="FFFFFF"/>
-              </w:rPr>
               <w:t>exclusive</w:t>
             </w:r>
             <w:r>
@@ -8806,7 +8797,6 @@
               <w:rPr>
                 <w:shd w:val="clear" w:color="auto" w:fill="FFFFFF"/>
               </w:rPr>
-              <w:lastRenderedPageBreak/>
               <w:t>{%tr endif %}</w:t>
             </w:r>
           </w:p>
@@ -8863,7 +8853,14 @@
               <w:rPr>
                 <w:shd w:val="clear" w:color="auto" w:fill="FFFFFF"/>
               </w:rPr>
-              <w:t xml:space="preserve"> in('modify', 'set aside') %}</w:t>
+              <w:t xml:space="preserve"> </w:t>
+            </w:r>
+            <w:r>
+              <w:rPr>
+                <w:shd w:val="clear" w:color="auto" w:fill="FFFFFF"/>
+              </w:rPr>
+              <w:lastRenderedPageBreak/>
+              <w:t>in('modify', 'set aside') %}</w:t>
             </w:r>
           </w:p>
         </w:tc>
@@ -8888,6 +8885,7 @@
               <w:rPr>
                 <w:shd w:val="clear" w:color="auto" w:fill="FFFFFF"/>
               </w:rPr>
+              <w:lastRenderedPageBreak/>
               <w:t>expect_after_response_step</w:t>
             </w:r>
             <w:proofErr w:type="spellEnd"/>
@@ -8901,6 +8899,7 @@
               <w:rPr>
                 <w:shd w:val="clear" w:color="auto" w:fill="FFFFFF"/>
               </w:rPr>
+              <w:lastRenderedPageBreak/>
               <w:t>aka2j_motion_response_templates.yml</w:t>
             </w:r>
           </w:p>
@@ -8931,6 +8930,7 @@
               <w:rPr>
                 <w:shd w:val="clear" w:color="auto" w:fill="FFFFFF"/>
               </w:rPr>
+              <w:lastRenderedPageBreak/>
               <w:t xml:space="preserve">{{ </w:t>
             </w:r>
             <w:proofErr w:type="spellStart"/>
@@ -9369,33 +9369,39 @@
               <w:rPr>
                 <w:shd w:val="clear" w:color="auto" w:fill="FFFFFF"/>
               </w:rPr>
+              <w:t xml:space="preserve">{%tr if </w:t>
+            </w:r>
+            <w:r>
+              <w:rPr>
+                <w:shd w:val="clear" w:color="auto" w:fill="FFFFFF"/>
+                <w:lang w:val="en"/>
+              </w:rPr>
+              <w:t>respond_to_appeal</w:t>
+            </w:r>
+            <w:r>
+              <w:rPr>
+                <w:shd w:val="clear" w:color="auto" w:fill="FFFFFF"/>
+              </w:rPr>
+              <w:t xml:space="preserve"> in ('agree',</w:t>
+            </w:r>
+            <w:r>
+              <w:rPr>
+                <w:shd w:val="clear" w:color="auto" w:fill="FFFFFF"/>
+              </w:rPr>
+              <w:t xml:space="preserve"> </w:t>
+            </w:r>
+            <w:r>
+              <w:rPr>
+                <w:shd w:val="clear" w:color="auto" w:fill="FFFFFF"/>
+              </w:rPr>
+              <w:t xml:space="preserve">'some', 'none') </w:t>
+            </w:r>
+            <w:r>
+              <w:rPr>
+                <w:shd w:val="clear" w:color="auto" w:fill="FFFFFF"/>
+              </w:rPr>
               <w:lastRenderedPageBreak/>
-              <w:t xml:space="preserve">{%tr if </w:t>
-            </w:r>
-            <w:r>
-              <w:rPr>
-                <w:shd w:val="clear" w:color="auto" w:fill="FFFFFF"/>
-                <w:lang w:val="en"/>
-              </w:rPr>
-              <w:t>respond_to_appeal</w:t>
-            </w:r>
-            <w:r>
-              <w:rPr>
-                <w:shd w:val="clear" w:color="auto" w:fill="FFFFFF"/>
-              </w:rPr>
-              <w:t xml:space="preserve"> in ('agree',</w:t>
-            </w:r>
-            <w:r>
-              <w:rPr>
-                <w:shd w:val="clear" w:color="auto" w:fill="FFFFFF"/>
-              </w:rPr>
-              <w:t xml:space="preserve"> </w:t>
-            </w:r>
-            <w:r>
-              <w:rPr>
-                <w:shd w:val="clear" w:color="auto" w:fill="FFFFFF"/>
-              </w:rPr>
-              <w:t>'some', 'none') %}</w:t>
+              <w:t>%}</w:t>
             </w:r>
           </w:p>
         </w:tc>
@@ -9414,6 +9420,7 @@
             </w:pPr>
             <w:proofErr w:type="spellStart"/>
             <w:r>
+              <w:lastRenderedPageBreak/>
               <w:t>appeal_response_step</w:t>
             </w:r>
             <w:proofErr w:type="spellEnd"/>
@@ -9855,11 +9862,7 @@
             </w:r>
             <w:proofErr w:type="spellStart"/>
             <w:r>
-              <w:t>get_help_step.s</w:t>
-            </w:r>
-            <w:r>
-              <w:lastRenderedPageBreak/>
-              <w:t>ubject</w:t>
+              <w:t>get_help_step.subject</w:t>
             </w:r>
             <w:proofErr w:type="spellEnd"/>
             <w:r>
@@ -9899,11 +9902,7 @@
               <w:t>get_help</w:t>
             </w:r>
             <w:r>
-              <w:t>_co</w:t>
-            </w:r>
-            <w:r>
-              <w:lastRenderedPageBreak/>
-              <w:t>ntent.docx")) }}</w:t>
+              <w:t>_content.docx")) }}</w:t>
             </w:r>
           </w:p>
         </w:tc>
@@ -9995,14 +9994,27 @@
     <w:r>
       <w:t xml:space="preserve"> of </w:t>
     </w:r>
-    <w:fldSimple w:instr=" NUMPAGES  \* Arabic  \* MERGEFORMAT ">
-      <w:r>
-        <w:rPr>
-          <w:noProof/>
-        </w:rPr>
-        <w:t>49</w:t>
-      </w:r>
-    </w:fldSimple>
+    <w:r>
+      <w:fldChar w:fldCharType="begin"/>
+    </w:r>
+    <w:r>
+      <w:instrText xml:space="preserve"> NUMPAGES  \* Arabic  \* MERGEFORMAT </w:instrText>
+    </w:r>
+    <w:r>
+      <w:fldChar w:fldCharType="separate"/>
+    </w:r>
+    <w:r>
+      <w:rPr>
+        <w:noProof/>
+      </w:rPr>
+      <w:t>49</w:t>
+    </w:r>
+    <w:r>
+      <w:rPr>
+        <w:noProof/>
+      </w:rPr>
+      <w:fldChar w:fldCharType="end"/>
+    </w:r>
     <w:r>
       <w:t xml:space="preserve"> pages</w:t>
     </w:r>
@@ -10016,7 +10028,10 @@
       <w:t>June</w:t>
     </w:r>
     <w:r>
-      <w:t xml:space="preserve"> 5</w:t>
+      <w:t xml:space="preserve"> </w:t>
+    </w:r>
+    <w:r>
+      <w:t>10</w:t>
     </w:r>
     <w:r>
       <w:t>, 2025</w:t>

</xml_diff>

<commit_message>
Uploaded latest docx template for testing
</commit_message>
<xml_diff>
--- a/docassemble/ChangingDivorceOrder/data/templates/changing_divorce_order_action_plan.docx
+++ b/docassemble/ChangingDivorceOrder/data/templates/changing_divorce_order_action_plan.docx
@@ -1908,14 +1908,17 @@
             </w:pPr>
             <w:proofErr w:type="spellStart"/>
             <w:r>
+              <w:rPr>
+                <w:color w:val="FF66FF"/>
+              </w:rPr>
               <w:t>register_order_step</w:t>
             </w:r>
             <w:proofErr w:type="spellEnd"/>
             <w:r>
-              <w:t xml:space="preserve"> in </w:t>
-            </w:r>
-            <w:r>
-              <w:t>aka2j_mod_cust_div_templates.yml</w:t>
+              <w:rPr>
+                <w:color w:val="FF66FF"/>
+              </w:rPr>
+              <w:t xml:space="preserve"> in aka2j_mod_cust_div_templates.yml</w:t>
             </w:r>
           </w:p>
         </w:tc>
@@ -6123,7 +6126,7 @@
               <w:rPr>
                 <w:shd w:val="clear" w:color="auto" w:fill="FFFFFF"/>
               </w:rPr>
-              <w:t xml:space="preserve"> in </w:t>
+              <w:t xml:space="preserve">in </w:t>
             </w:r>
             <w:r>
               <w:rPr>
@@ -6849,7 +6852,6 @@
               <w:rPr>
                 <w:shd w:val="clear" w:color="auto" w:fill="FFFFFF"/>
               </w:rPr>
-              <w:lastRenderedPageBreak/>
               <w:t>{{ learn_set_aside_step.subject }}</w:t>
             </w:r>
           </w:p>
@@ -7295,7 +7297,19 @@
               <w:rPr>
                 <w:color w:val="FF66FF"/>
               </w:rPr>
-              <w:t>https://github.com/A2JatAKCourts/docassemble-ChangingDivorceOrderInterviewIssues/issues/25</w:t>
+              <w:t xml:space="preserve">https://github.com/A2JatAKCourts/docassemble-ChangingDivorceOrderInterviewIssues/issues/25 </w:t>
+            </w:r>
+            <w:r>
+              <w:rPr>
+                <w:color w:val="9933FF"/>
+              </w:rPr>
+              <w:t>discussed w Jeannie 2026-06-10</w:t>
+            </w:r>
+            <w:r>
+              <w:rPr>
+                <w:color w:val="9933FF"/>
+              </w:rPr>
+              <w:t xml:space="preserve"> use TFs</w:t>
             </w:r>
           </w:p>
         </w:tc>
@@ -7491,19 +7505,25 @@
               <w:rPr>
                 <w:color w:val="FF66FF"/>
               </w:rPr>
-              <w:t xml:space="preserve"> see GitHub issue</w:t>
+              <w:t xml:space="preserve"> See GitHub issue </w:t>
             </w:r>
             <w:r>
               <w:rPr>
                 <w:color w:val="FF66FF"/>
               </w:rPr>
-              <w:t xml:space="preserve"> </w:t>
-            </w:r>
-            <w:r>
-              <w:rPr>
-                <w:color w:val="FF66FF"/>
-              </w:rPr>
-              <w:t>https://github.com/A2JatAKCourts/docassemble-ChangingDivorceOrderInterviewIssues/issues/25</w:t>
+              <w:t xml:space="preserve">https://github.com/A2JatAKCourts/docassemble-ChangingDivorceOrderInterviewIssues/issues/25 </w:t>
+            </w:r>
+            <w:r>
+              <w:rPr>
+                <w:color w:val="9933FF"/>
+              </w:rPr>
+              <w:t>discussed w Jeannie 2026-06-10</w:t>
+            </w:r>
+            <w:r>
+              <w:rPr>
+                <w:color w:val="9933FF"/>
+              </w:rPr>
+              <w:t xml:space="preserve"> use TFs</w:t>
             </w:r>
           </w:p>
         </w:tc>
@@ -7639,7 +7659,14 @@
               <w:rPr>
                 <w:shd w:val="clear" w:color="auto" w:fill="FFFFFF"/>
               </w:rPr>
-              <w:t xml:space="preserve">{%tr if user_need == 'change foreign custody order' or </w:t>
+              <w:t xml:space="preserve">{%tr if user_need == 'change foreign custody </w:t>
+            </w:r>
+            <w:r>
+              <w:rPr>
+                <w:shd w:val="clear" w:color="auto" w:fill="FFFFFF"/>
+              </w:rPr>
+              <w:lastRenderedPageBreak/>
+              <w:t xml:space="preserve">order' or </w:t>
             </w:r>
             <w:r>
               <w:rPr>
@@ -7652,14 +7679,7 @@
               <w:rPr>
                 <w:shd w:val="clear" w:color="auto" w:fill="FFFFFF"/>
               </w:rPr>
-              <w:t xml:space="preserve">user_need in('change custody </w:t>
-            </w:r>
-            <w:r>
-              <w:rPr>
-                <w:shd w:val="clear" w:color="auto" w:fill="FFFFFF"/>
-              </w:rPr>
-              <w:lastRenderedPageBreak/>
-              <w:t xml:space="preserve">order', 'change divorce order') and not </w:t>
+              <w:t xml:space="preserve">user_need in('change custody order', 'change divorce order') and not </w:t>
             </w:r>
             <w:r>
               <w:rPr>
@@ -7824,6 +7844,7 @@
               <w:rPr>
                 <w:shd w:val="clear" w:color="auto" w:fill="FFFFFF"/>
               </w:rPr>
+              <w:lastRenderedPageBreak/>
               <w:t>truefiling_serve</w:t>
             </w:r>
             <w:r>
@@ -7839,7 +7860,6 @@
               <w:br/>
             </w:r>
             <w:r>
-              <w:lastRenderedPageBreak/>
               <w:t xml:space="preserve">in </w:t>
             </w:r>
             <w:r>
@@ -8196,6 +8216,7 @@
               <w:rPr>
                 <w:shd w:val="clear" w:color="auto" w:fill="FFFFFF"/>
               </w:rPr>
+              <w:lastRenderedPageBreak/>
               <w:t>unknown_final_date.all_true</w:t>
             </w:r>
             <w:r>
@@ -8221,7 +8242,6 @@
               <w:rPr>
                 <w:shd w:val="clear" w:color="auto" w:fill="FFFFFF"/>
               </w:rPr>
-              <w:lastRenderedPageBreak/>
               <w:t>exclusive</w:t>
             </w:r>
             <w:r>
@@ -8715,7 +8735,7 @@
               <w:outlineLvl w:val="1"/>
             </w:pPr>
             <w:r>
-              <w:t xml:space="preserve">{{  </w:t>
+              <w:t xml:space="preserve">{{ </w:t>
             </w:r>
             <w:proofErr w:type="spellStart"/>
             <w:r>
@@ -8841,6 +8861,7 @@
               <w:rPr>
                 <w:shd w:val="clear" w:color="auto" w:fill="FFFFFF"/>
               </w:rPr>
+              <w:lastRenderedPageBreak/>
               <w:t xml:space="preserve">{%tr if </w:t>
             </w:r>
             <w:r>
@@ -8853,14 +8874,7 @@
               <w:rPr>
                 <w:shd w:val="clear" w:color="auto" w:fill="FFFFFF"/>
               </w:rPr>
-              <w:t xml:space="preserve"> </w:t>
-            </w:r>
-            <w:r>
-              <w:rPr>
-                <w:shd w:val="clear" w:color="auto" w:fill="FFFFFF"/>
-              </w:rPr>
-              <w:lastRenderedPageBreak/>
-              <w:t>in('modify', 'set aside') %}</w:t>
+              <w:t xml:space="preserve"> in('modify', 'set aside') %}</w:t>
             </w:r>
           </w:p>
         </w:tc>
@@ -8885,7 +8899,6 @@
               <w:rPr>
                 <w:shd w:val="clear" w:color="auto" w:fill="FFFFFF"/>
               </w:rPr>
-              <w:lastRenderedPageBreak/>
               <w:t>expect_after_response_step</w:t>
             </w:r>
             <w:proofErr w:type="spellEnd"/>
@@ -8899,7 +8912,6 @@
               <w:rPr>
                 <w:shd w:val="clear" w:color="auto" w:fill="FFFFFF"/>
               </w:rPr>
-              <w:lastRenderedPageBreak/>
               <w:t>aka2j_motion_response_templates.yml</w:t>
             </w:r>
           </w:p>
@@ -8930,7 +8942,6 @@
               <w:rPr>
                 <w:shd w:val="clear" w:color="auto" w:fill="FFFFFF"/>
               </w:rPr>
-              <w:lastRenderedPageBreak/>
               <w:t xml:space="preserve">{{ </w:t>
             </w:r>
             <w:proofErr w:type="spellStart"/>
@@ -9123,7 +9134,19 @@
               <w:t xml:space="preserve"> </w:t>
             </w:r>
             <w:r>
-              <w:t xml:space="preserve">and in </w:t>
+              <w:t>and</w:t>
+            </w:r>
+            <w:r>
+              <w:br/>
+            </w:r>
+            <w:r>
+              <w:t>file_agreement_step</w:t>
+            </w:r>
+            <w:r>
+              <w:br/>
+            </w:r>
+            <w:r>
+              <w:t xml:space="preserve"> in </w:t>
             </w:r>
             <w:r>
               <w:t>aka2j_motion_response_templates.yml</w:t>
@@ -9382,26 +9405,26 @@
               <w:rPr>
                 <w:shd w:val="clear" w:color="auto" w:fill="FFFFFF"/>
               </w:rPr>
-              <w:t xml:space="preserve"> in ('agree',</w:t>
-            </w:r>
-            <w:r>
-              <w:rPr>
-                <w:shd w:val="clear" w:color="auto" w:fill="FFFFFF"/>
-              </w:rPr>
-              <w:t xml:space="preserve"> </w:t>
-            </w:r>
-            <w:r>
-              <w:rPr>
-                <w:shd w:val="clear" w:color="auto" w:fill="FFFFFF"/>
-              </w:rPr>
-              <w:t xml:space="preserve">'some', 'none') </w:t>
+              <w:t xml:space="preserve"> in </w:t>
             </w:r>
             <w:r>
               <w:rPr>
                 <w:shd w:val="clear" w:color="auto" w:fill="FFFFFF"/>
               </w:rPr>
               <w:lastRenderedPageBreak/>
-              <w:t>%}</w:t>
+              <w:t>('agree',</w:t>
+            </w:r>
+            <w:r>
+              <w:rPr>
+                <w:shd w:val="clear" w:color="auto" w:fill="FFFFFF"/>
+              </w:rPr>
+              <w:t xml:space="preserve"> </w:t>
+            </w:r>
+            <w:r>
+              <w:rPr>
+                <w:shd w:val="clear" w:color="auto" w:fill="FFFFFF"/>
+              </w:rPr>
+              <w:t>'some', 'none') %}</w:t>
             </w:r>
           </w:p>
         </w:tc>
@@ -9680,10 +9703,12 @@
           <w:p>
             <w:pPr>
               <w:pStyle w:val="Body"/>
-              <w:spacing w:before="0" w:after="60"/>
-            </w:pPr>
-          </w:p>
-          <w:p>
+            </w:pPr>
+          </w:p>
+          <w:p>
+            <w:pPr>
+              <w:pStyle w:val="Body"/>
+            </w:pPr>
             <w:r>
               <w:t xml:space="preserve">{{p </w:t>
             </w:r>

</xml_diff>

<commit_message>
updated docx to include serve step
</commit_message>
<xml_diff>
--- a/docassemble/ChangingDivorceOrder/data/templates/changing_divorce_order_action_plan.docx
+++ b/docassemble/ChangingDivorceOrder/data/templates/changing_divorce_order_action_plan.docx
@@ -1172,14 +1172,12 @@
               </w:rPr>
               <w:t>') and (</w:t>
             </w:r>
-            <w:proofErr w:type="spellStart"/>
             <w:r>
               <w:rPr>
                 <w:color w:val="FF0000"/>
               </w:rPr>
               <w:t>parents_agree</w:t>
             </w:r>
-            <w:proofErr w:type="spellEnd"/>
             <w:r>
               <w:rPr>
                 <w:color w:val="FF0000"/>
@@ -1471,14 +1469,12 @@
               </w:rPr>
               <w:t xml:space="preserve"> </w:t>
             </w:r>
-            <w:proofErr w:type="spellStart"/>
             <w:r>
               <w:rPr>
                 <w:color w:val="FFC000"/>
               </w:rPr>
               <w:t>parents_agree</w:t>
             </w:r>
-            <w:proofErr w:type="spellEnd"/>
             <w:r>
               <w:rPr>
                 <w:color w:val="FFC000"/>
@@ -3355,23 +3351,7 @@
                 <w:color w:val="C00000"/>
                 <w:shd w:val="clear" w:color="auto" w:fill="FFFFFF"/>
               </w:rPr>
-              <w:t xml:space="preserve">and </w:t>
-            </w:r>
-            <w:proofErr w:type="spellStart"/>
-            <w:r>
-              <w:rPr>
-                <w:color w:val="C00000"/>
-                <w:shd w:val="clear" w:color="auto" w:fill="FFFFFF"/>
-              </w:rPr>
-              <w:t>parents_agree</w:t>
-            </w:r>
-            <w:proofErr w:type="spellEnd"/>
-            <w:r>
-              <w:rPr>
-                <w:color w:val="C00000"/>
-                <w:shd w:val="clear" w:color="auto" w:fill="FFFFFF"/>
-              </w:rPr>
-              <w:t xml:space="preserve"> and </w:t>
+              <w:t xml:space="preserve">and parents_agree and </w:t>
             </w:r>
             <w:r>
               <w:rPr>
@@ -8055,435 +8035,13 @@
           <w:p>
             <w:pPr>
               <w:pStyle w:val="Body"/>
-              <w:rPr>
-                <w:shd w:val="clear" w:color="auto" w:fill="FFFFFF"/>
-              </w:rPr>
-            </w:pPr>
-            <w:r>
-              <w:rPr>
-                <w:shd w:val="clear" w:color="auto" w:fill="FFFFFF"/>
-              </w:rPr>
-              <w:t>{%tr</w:t>
-            </w:r>
-            <w:r>
-              <w:rPr>
-                <w:shd w:val="clear" w:color="auto" w:fill="FFFFFF"/>
-              </w:rPr>
-              <w:t xml:space="preserve"> </w:t>
-            </w:r>
-            <w:r>
-              <w:rPr>
-                <w:shd w:val="clear" w:color="auto" w:fill="FFFFFF"/>
-              </w:rPr>
-              <w:t>if</w:t>
-            </w:r>
-            <w:r>
-              <w:rPr>
-                <w:shd w:val="clear" w:color="auto" w:fill="FFFFFF"/>
-              </w:rPr>
-              <w:t xml:space="preserve"> user_need == '</w:t>
-            </w:r>
-            <w:r>
-              <w:rPr>
-                <w:shd w:val="clear" w:color="auto" w:fill="FFFFFF"/>
-              </w:rPr>
-              <w:t>change</w:t>
-            </w:r>
-            <w:r>
-              <w:rPr>
-                <w:shd w:val="clear" w:color="auto" w:fill="FFFFFF"/>
-              </w:rPr>
-              <w:t xml:space="preserve"> </w:t>
-            </w:r>
-            <w:r>
-              <w:rPr>
-                <w:shd w:val="clear" w:color="auto" w:fill="FFFFFF"/>
-              </w:rPr>
-              <w:t>foreign</w:t>
-            </w:r>
-            <w:r>
-              <w:rPr>
-                <w:shd w:val="clear" w:color="auto" w:fill="FFFFFF"/>
-              </w:rPr>
-              <w:t xml:space="preserve"> </w:t>
-            </w:r>
-            <w:r>
-              <w:rPr>
-                <w:shd w:val="clear" w:color="auto" w:fill="FFFFFF"/>
-              </w:rPr>
-              <w:t>custody</w:t>
-            </w:r>
-            <w:r>
-              <w:rPr>
-                <w:shd w:val="clear" w:color="auto" w:fill="FFFFFF"/>
-              </w:rPr>
-              <w:t xml:space="preserve"> </w:t>
-            </w:r>
-            <w:r>
-              <w:rPr>
-                <w:shd w:val="clear" w:color="auto" w:fill="FFFFFF"/>
-              </w:rPr>
-              <w:t>order</w:t>
-            </w:r>
-            <w:r>
-              <w:rPr>
-                <w:shd w:val="clear" w:color="auto" w:fill="FFFFFF"/>
-              </w:rPr>
-              <w:t xml:space="preserve">' </w:t>
-            </w:r>
-            <w:r>
-              <w:rPr>
-                <w:color w:val="FF0000"/>
-                <w:shd w:val="clear" w:color="auto" w:fill="FFFFFF"/>
-              </w:rPr>
-              <w:t>or</w:t>
-            </w:r>
-            <w:r>
-              <w:rPr>
-                <w:shd w:val="clear" w:color="auto" w:fill="FFFFFF"/>
-              </w:rPr>
-              <w:t xml:space="preserve"> </w:t>
-            </w:r>
-            <w:r>
-              <w:t>(user_need == 'change divorce order'</w:t>
-            </w:r>
-            <w:r>
-              <w:rPr>
-                <w:shd w:val="clear" w:color="auto" w:fill="FFFFFF"/>
-              </w:rPr>
-              <w:t xml:space="preserve"> </w:t>
-            </w:r>
-            <w:r>
-              <w:rPr>
-                <w:color w:val="FFC000"/>
-                <w:shd w:val="clear" w:color="auto" w:fill="FFFFFF"/>
-              </w:rPr>
-              <w:t>and</w:t>
-            </w:r>
-            <w:r>
-              <w:rPr>
-                <w:color w:val="FFC000"/>
-                <w:shd w:val="clear" w:color="auto" w:fill="FFFFFF"/>
-              </w:rPr>
-              <w:t xml:space="preserve"> </w:t>
-            </w:r>
-            <w:r>
-              <w:rPr>
-                <w:color w:val="FFC000"/>
-                <w:shd w:val="clear" w:color="auto" w:fill="FFFFFF"/>
-              </w:rPr>
-              <w:t>not (</w:t>
-            </w:r>
-            <w:r>
-              <w:rPr>
-                <w:shd w:val="clear" w:color="auto" w:fill="FFFFFF"/>
-              </w:rPr>
-              <w:t>interim_order_date_within_10_days</w:t>
-            </w:r>
-            <w:r>
-              <w:rPr>
-                <w:shd w:val="clear" w:color="auto" w:fill="FFFFFF"/>
-              </w:rPr>
-              <w:t xml:space="preserve"> </w:t>
-            </w:r>
-            <w:r>
-              <w:rPr>
-                <w:color w:val="00B050"/>
-                <w:shd w:val="clear" w:color="auto" w:fill="FFFFFF"/>
-              </w:rPr>
-              <w:t xml:space="preserve">or </w:t>
-            </w:r>
-            <w:r>
-              <w:rPr>
-                <w:shd w:val="clear" w:color="auto" w:fill="FFFFFF"/>
-              </w:rPr>
-              <w:t>final_order_date_within_10_day</w:t>
-            </w:r>
-            <w:r>
-              <w:rPr>
-                <w:shd w:val="clear" w:color="auto" w:fill="FFFFFF"/>
-              </w:rPr>
-              <w:t xml:space="preserve">s </w:t>
-            </w:r>
-            <w:r>
-              <w:rPr>
-                <w:color w:val="00B050"/>
-                <w:shd w:val="clear" w:color="auto" w:fill="FFFFFF"/>
-              </w:rPr>
-              <w:t xml:space="preserve">or </w:t>
-            </w:r>
-            <w:r>
-              <w:rPr>
-                <w:shd w:val="clear" w:color="auto" w:fill="FFFFFF"/>
-              </w:rPr>
+            </w:pPr>
+            <w:r>
+              <w:t xml:space="preserve">{%tr if user_need == 'change foreign custody order' or (user_need in('change custody order', 'change divorce order') and not unknown_final_date.all_true('appeal', exclusive = True)) or </w:t>
+            </w:r>
+            <w:r>
               <w:lastRenderedPageBreak/>
-              <w:t>unknown_final_date.all_true</w:t>
-            </w:r>
-            <w:r>
-              <w:rPr>
-                <w:color w:val="00B0F0"/>
-                <w:shd w:val="clear" w:color="auto" w:fill="FFFFFF"/>
-              </w:rPr>
-              <w:t>(</w:t>
-            </w:r>
-            <w:r>
-              <w:rPr>
-                <w:shd w:val="clear" w:color="auto" w:fill="FFFFFF"/>
-              </w:rPr>
-              <w:t>'reconsider',</w:t>
-            </w:r>
-            <w:r>
-              <w:rPr>
-                <w:shd w:val="clear" w:color="auto" w:fill="FFFFFF"/>
-              </w:rPr>
-              <w:t xml:space="preserve"> </w:t>
-            </w:r>
-            <w:r>
-              <w:rPr>
-                <w:shd w:val="clear" w:color="auto" w:fill="FFFFFF"/>
-              </w:rPr>
-              <w:t>exclusive</w:t>
-            </w:r>
-            <w:r>
-              <w:rPr>
-                <w:shd w:val="clear" w:color="auto" w:fill="FFFFFF"/>
-              </w:rPr>
-              <w:t xml:space="preserve"> </w:t>
-            </w:r>
-            <w:r>
-              <w:rPr>
-                <w:shd w:val="clear" w:color="auto" w:fill="FFFFFF"/>
-              </w:rPr>
-              <w:t>=</w:t>
-            </w:r>
-            <w:r>
-              <w:rPr>
-                <w:shd w:val="clear" w:color="auto" w:fill="FFFFFF"/>
-              </w:rPr>
-              <w:t xml:space="preserve"> </w:t>
-            </w:r>
-            <w:r>
-              <w:rPr>
-                <w:shd w:val="clear" w:color="auto" w:fill="FFFFFF"/>
-              </w:rPr>
-              <w:t>True</w:t>
-            </w:r>
-            <w:r>
-              <w:rPr>
-                <w:color w:val="00B0F0"/>
-                <w:shd w:val="clear" w:color="auto" w:fill="FFFFFF"/>
-              </w:rPr>
-              <w:t>)</w:t>
-            </w:r>
-            <w:r>
-              <w:rPr>
-                <w:color w:val="00B0F0"/>
-                <w:shd w:val="clear" w:color="auto" w:fill="FFFFFF"/>
-              </w:rPr>
-              <w:t xml:space="preserve"> </w:t>
-            </w:r>
-            <w:r>
-              <w:rPr>
-                <w:color w:val="00B050"/>
-                <w:shd w:val="clear" w:color="auto" w:fill="FFFFFF"/>
-              </w:rPr>
-              <w:t>or</w:t>
-            </w:r>
-            <w:r>
-              <w:rPr>
-                <w:color w:val="92D050"/>
-                <w:shd w:val="clear" w:color="auto" w:fill="FFFFFF"/>
-              </w:rPr>
-              <w:t xml:space="preserve"> </w:t>
-            </w:r>
-            <w:r>
-              <w:rPr>
-                <w:shd w:val="clear" w:color="auto" w:fill="FFFFFF"/>
-              </w:rPr>
-              <w:t>unknown_final_date.all_true</w:t>
-            </w:r>
-            <w:r>
-              <w:rPr>
-                <w:color w:val="00B0F0"/>
-                <w:shd w:val="clear" w:color="auto" w:fill="FFFFFF"/>
-              </w:rPr>
-              <w:t>(</w:t>
-            </w:r>
-            <w:r>
-              <w:rPr>
-                <w:shd w:val="clear" w:color="auto" w:fill="FFFFFF"/>
-              </w:rPr>
-              <w:t>'</w:t>
-            </w:r>
-            <w:r>
-              <w:rPr>
-                <w:shd w:val="clear" w:color="auto" w:fill="FFFFFF"/>
-              </w:rPr>
-              <w:t>appeal</w:t>
-            </w:r>
-            <w:r>
-              <w:rPr>
-                <w:shd w:val="clear" w:color="auto" w:fill="FFFFFF"/>
-              </w:rPr>
-              <w:t>',</w:t>
-            </w:r>
-            <w:r>
-              <w:rPr>
-                <w:shd w:val="clear" w:color="auto" w:fill="FFFFFF"/>
-              </w:rPr>
-              <w:t xml:space="preserve"> </w:t>
-            </w:r>
-            <w:r>
-              <w:rPr>
-                <w:shd w:val="clear" w:color="auto" w:fill="FFFFFF"/>
-              </w:rPr>
-              <w:t>exclusive</w:t>
-            </w:r>
-            <w:r>
-              <w:rPr>
-                <w:shd w:val="clear" w:color="auto" w:fill="FFFFFF"/>
-              </w:rPr>
-              <w:t xml:space="preserve"> </w:t>
-            </w:r>
-            <w:r>
-              <w:rPr>
-                <w:shd w:val="clear" w:color="auto" w:fill="FFFFFF"/>
-              </w:rPr>
-              <w:t>=</w:t>
-            </w:r>
-            <w:r>
-              <w:rPr>
-                <w:shd w:val="clear" w:color="auto" w:fill="FFFFFF"/>
-              </w:rPr>
-              <w:t xml:space="preserve"> </w:t>
-            </w:r>
-            <w:r>
-              <w:rPr>
-                <w:shd w:val="clear" w:color="auto" w:fill="FFFFFF"/>
-              </w:rPr>
-              <w:t>True</w:t>
-            </w:r>
-            <w:r>
-              <w:rPr>
-                <w:color w:val="00B0F0"/>
-                <w:shd w:val="clear" w:color="auto" w:fill="FFFFFF"/>
-              </w:rPr>
-              <w:t>)</w:t>
-            </w:r>
-            <w:r>
-              <w:rPr>
-                <w:color w:val="92D050"/>
-                <w:shd w:val="clear" w:color="auto" w:fill="FFFFFF"/>
-              </w:rPr>
-              <w:t xml:space="preserve"> </w:t>
-            </w:r>
-            <w:r>
-              <w:rPr>
-                <w:color w:val="00B050"/>
-                <w:shd w:val="clear" w:color="auto" w:fill="FFFFFF"/>
-              </w:rPr>
-              <w:t xml:space="preserve">or </w:t>
-            </w:r>
-            <w:r>
-              <w:rPr>
-                <w:shd w:val="clear" w:color="auto" w:fill="FFFFFF"/>
-              </w:rPr>
-              <w:t>unknown_final_date.all_true</w:t>
-            </w:r>
-            <w:r>
-              <w:rPr>
-                <w:color w:val="00B0F0"/>
-                <w:shd w:val="clear" w:color="auto" w:fill="FFFFFF"/>
-              </w:rPr>
-              <w:t>(</w:t>
-            </w:r>
-            <w:r>
-              <w:rPr>
-                <w:shd w:val="clear" w:color="auto" w:fill="FFFFFF"/>
-              </w:rPr>
-              <w:t>'reconsider',</w:t>
-            </w:r>
-            <w:r>
-              <w:rPr>
-                <w:shd w:val="clear" w:color="auto" w:fill="FFFFFF"/>
-              </w:rPr>
-              <w:t xml:space="preserve"> </w:t>
-            </w:r>
-            <w:r>
-              <w:rPr>
-                <w:shd w:val="clear" w:color="auto" w:fill="FFFFFF"/>
-              </w:rPr>
-              <w:t>'appeal',</w:t>
-            </w:r>
-            <w:r>
-              <w:rPr>
-                <w:shd w:val="clear" w:color="auto" w:fill="FFFFFF"/>
-              </w:rPr>
-              <w:t xml:space="preserve"> </w:t>
-            </w:r>
-            <w:r>
-              <w:rPr>
-                <w:shd w:val="clear" w:color="auto" w:fill="FFFFFF"/>
-              </w:rPr>
-              <w:t>exclusive</w:t>
-            </w:r>
-            <w:r>
-              <w:rPr>
-                <w:shd w:val="clear" w:color="auto" w:fill="FFFFFF"/>
-              </w:rPr>
-              <w:t xml:space="preserve"> </w:t>
-            </w:r>
-            <w:r>
-              <w:rPr>
-                <w:shd w:val="clear" w:color="auto" w:fill="FFFFFF"/>
-              </w:rPr>
-              <w:t>=</w:t>
-            </w:r>
-            <w:r>
-              <w:rPr>
-                <w:shd w:val="clear" w:color="auto" w:fill="FFFFFF"/>
-              </w:rPr>
-              <w:t xml:space="preserve"> </w:t>
-            </w:r>
-            <w:r>
-              <w:rPr>
-                <w:shd w:val="clear" w:color="auto" w:fill="FFFFFF"/>
-              </w:rPr>
-              <w:t>True</w:t>
-            </w:r>
-            <w:r>
-              <w:rPr>
-                <w:color w:val="00B0F0"/>
-                <w:shd w:val="clear" w:color="auto" w:fill="FFFFFF"/>
-              </w:rPr>
-              <w:t>)</w:t>
-            </w:r>
-            <w:r>
-              <w:rPr>
-                <w:color w:val="FFC000"/>
-                <w:shd w:val="clear" w:color="auto" w:fill="FFFFFF"/>
-              </w:rPr>
-              <w:t>)</w:t>
-            </w:r>
-            <w:r>
-              <w:rPr>
-                <w:color w:val="FF0000"/>
-                <w:shd w:val="clear" w:color="auto" w:fill="FFFFFF"/>
-              </w:rPr>
-              <w:t>)</w:t>
-            </w:r>
-            <w:r>
-              <w:rPr>
-                <w:color w:val="92D050"/>
-                <w:shd w:val="clear" w:color="auto" w:fill="FFFFFF"/>
-              </w:rPr>
-              <w:t xml:space="preserve"> </w:t>
-            </w:r>
-            <w:r>
-              <w:rPr>
-                <w:shd w:val="clear" w:color="auto" w:fill="FFFFFF"/>
-              </w:rPr>
-              <w:t>%}</w:t>
+              <w:t>type_of_response in('reconsider', 'modify', 'set aside') %}</w:t>
             </w:r>
           </w:p>
         </w:tc>
@@ -8500,16 +8058,6 @@
             <w:pPr>
               <w:pStyle w:val="Body"/>
             </w:pPr>
-            <w:r>
-              <w:lastRenderedPageBreak/>
-              <w:t xml:space="preserve">expect_after_motion_or_answer_step </w:t>
-            </w:r>
-            <w:r>
-              <w:t xml:space="preserve">in </w:t>
-            </w:r>
-            <w:r>
-              <w:t>aka2j_templates.yml</w:t>
-            </w:r>
           </w:p>
         </w:tc>
       </w:tr>
@@ -8529,27 +8077,9 @@
           <w:p>
             <w:pPr>
               <w:pStyle w:val="Heading2"/>
-              <w:outlineLvl w:val="1"/>
-              <w:rPr>
-                <w:shd w:val="clear" w:color="auto" w:fill="FFFFFF"/>
-              </w:rPr>
-            </w:pPr>
-            <w:r>
-              <w:rPr>
-                <w:shd w:val="clear" w:color="auto" w:fill="FFFFFF"/>
-              </w:rPr>
-              <w:t xml:space="preserve">{{ </w:t>
-            </w:r>
-            <w:proofErr w:type="spellStart"/>
-            <w:r>
-              <w:t>expect_after_motion_or_answer</w:t>
-            </w:r>
-            <w:r>
-              <w:t>_step.subject</w:t>
-            </w:r>
-            <w:proofErr w:type="spellEnd"/>
-            <w:r>
-              <w:t xml:space="preserve"> }}</w:t>
+            </w:pPr>
+            <w:r>
+              <w:t>{{ truefiling_serve_step.subject }}</w:t>
             </w:r>
           </w:p>
         </w:tc>
@@ -8565,27 +8095,14 @@
           <w:p>
             <w:pPr>
               <w:pStyle w:val="Body"/>
-              <w:spacing w:before="0" w:after="60"/>
-            </w:pPr>
-          </w:p>
-          <w:p>
-            <w:pPr>
-              <w:pStyle w:val="Body"/>
-            </w:pPr>
-            <w:r>
-              <w:t xml:space="preserve">{{p </w:t>
-            </w:r>
-            <w:r>
-              <w:t>(include_docx_template("docassemble.AKA2JBranding:</w:t>
-            </w:r>
-            <w:r>
-              <w:rPr>
-                <w:shd w:val="clear" w:color="auto" w:fill="FFFFFF"/>
-              </w:rPr>
-              <w:t>expect_after_motion_or_answer</w:t>
-            </w:r>
-            <w:r>
-              <w:t>_content.docx")) }}</w:t>
+            </w:pPr>
+          </w:p>
+          <w:p>
+            <w:pPr>
+              <w:pStyle w:val="Body"/>
+            </w:pPr>
+            <w:r>
+              <w:t>{{p (include_docx_template("docassemble.AKA2JBranding:truefiling_file_and_serve_content.docx")) }}</w:t>
             </w:r>
           </w:p>
         </w:tc>
@@ -8606,9 +8123,6 @@
           <w:p>
             <w:pPr>
               <w:pStyle w:val="Body"/>
-              <w:rPr>
-                <w:shd w:val="clear" w:color="auto" w:fill="FFFFFF"/>
-              </w:rPr>
             </w:pPr>
             <w:r>
               <w:rPr>
@@ -8655,36 +8169,428 @@
               </w:rPr>
             </w:pPr>
             <w:r>
+              <w:rPr>
+                <w:shd w:val="clear" w:color="auto" w:fill="FFFFFF"/>
+              </w:rPr>
               <w:t>{%tr</w:t>
             </w:r>
             <w:r>
-              <w:t xml:space="preserve"> </w:t>
-            </w:r>
-            <w:r>
+              <w:rPr>
+                <w:shd w:val="clear" w:color="auto" w:fill="FFFFFF"/>
+              </w:rPr>
+              <w:t xml:space="preserve"> </w:t>
+            </w:r>
+            <w:r>
+              <w:rPr>
+                <w:shd w:val="clear" w:color="auto" w:fill="FFFFFF"/>
+              </w:rPr>
               <w:t>if</w:t>
             </w:r>
             <w:r>
-              <w:t xml:space="preserve"> interim</w:t>
-            </w:r>
-            <w:r>
-              <w:t>_order_date_within_10_days</w:t>
-            </w:r>
-            <w:r>
-              <w:t xml:space="preserve"> </w:t>
-            </w:r>
-            <w:r>
+              <w:rPr>
+                <w:shd w:val="clear" w:color="auto" w:fill="FFFFFF"/>
+              </w:rPr>
+              <w:t xml:space="preserve"> user_need == '</w:t>
+            </w:r>
+            <w:r>
+              <w:rPr>
+                <w:shd w:val="clear" w:color="auto" w:fill="FFFFFF"/>
+              </w:rPr>
+              <w:t>change</w:t>
+            </w:r>
+            <w:r>
+              <w:rPr>
+                <w:shd w:val="clear" w:color="auto" w:fill="FFFFFF"/>
+              </w:rPr>
+              <w:t xml:space="preserve"> </w:t>
+            </w:r>
+            <w:r>
+              <w:rPr>
+                <w:shd w:val="clear" w:color="auto" w:fill="FFFFFF"/>
+              </w:rPr>
+              <w:t>foreign</w:t>
+            </w:r>
+            <w:r>
+              <w:rPr>
+                <w:shd w:val="clear" w:color="auto" w:fill="FFFFFF"/>
+              </w:rPr>
+              <w:t xml:space="preserve"> </w:t>
+            </w:r>
+            <w:r>
+              <w:rPr>
+                <w:shd w:val="clear" w:color="auto" w:fill="FFFFFF"/>
+              </w:rPr>
+              <w:t>custody</w:t>
+            </w:r>
+            <w:r>
+              <w:rPr>
+                <w:shd w:val="clear" w:color="auto" w:fill="FFFFFF"/>
+              </w:rPr>
+              <w:t xml:space="preserve"> </w:t>
+            </w:r>
+            <w:r>
+              <w:rPr>
+                <w:shd w:val="clear" w:color="auto" w:fill="FFFFFF"/>
+              </w:rPr>
+              <w:t>order</w:t>
+            </w:r>
+            <w:r>
+              <w:rPr>
+                <w:shd w:val="clear" w:color="auto" w:fill="FFFFFF"/>
+              </w:rPr>
+              <w:t xml:space="preserve">' </w:t>
+            </w:r>
+            <w:r>
+              <w:rPr>
+                <w:color w:val="FF0000"/>
+                <w:shd w:val="clear" w:color="auto" w:fill="FFFFFF"/>
+              </w:rPr>
               <w:t>or</w:t>
             </w:r>
             <w:r>
-              <w:t xml:space="preserve"> </w:t>
-            </w:r>
-            <w:r>
-              <w:t>final_order_date_within_10_days</w:t>
-            </w:r>
-            <w:r>
-              <w:t xml:space="preserve"> or unknown_final_date['reconsider'] </w:t>
-            </w:r>
-            <w:r>
+              <w:rPr>
+                <w:shd w:val="clear" w:color="auto" w:fill="FFFFFF"/>
+              </w:rPr>
+              <w:t xml:space="preserve"> </w:t>
+            </w:r>
+            <w:r>
+              <w:t>(user_need == 'change divorce order'</w:t>
+            </w:r>
+            <w:r>
+              <w:rPr>
+                <w:shd w:val="clear" w:color="auto" w:fill="FFFFFF"/>
+              </w:rPr>
+              <w:t xml:space="preserve"> </w:t>
+            </w:r>
+            <w:r>
+              <w:rPr>
+                <w:color w:val="FFC000"/>
+                <w:shd w:val="clear" w:color="auto" w:fill="FFFFFF"/>
+              </w:rPr>
+              <w:t>and</w:t>
+            </w:r>
+            <w:r>
+              <w:rPr>
+                <w:color w:val="FFC000"/>
+                <w:shd w:val="clear" w:color="auto" w:fill="FFFFFF"/>
+              </w:rPr>
+              <w:t xml:space="preserve"> </w:t>
+            </w:r>
+            <w:r>
+              <w:rPr>
+                <w:color w:val="FFC000"/>
+                <w:shd w:val="clear" w:color="auto" w:fill="FFFFFF"/>
+              </w:rPr>
+              <w:t>not (</w:t>
+            </w:r>
+            <w:r>
+              <w:rPr>
+                <w:shd w:val="clear" w:color="auto" w:fill="FFFFFF"/>
+              </w:rPr>
+              <w:t>interim_order_date_within_10_days</w:t>
+            </w:r>
+            <w:r>
+              <w:rPr>
+                <w:shd w:val="clear" w:color="auto" w:fill="FFFFFF"/>
+              </w:rPr>
+              <w:t xml:space="preserve"> </w:t>
+            </w:r>
+            <w:r>
+              <w:rPr>
+                <w:color w:val="00B050"/>
+                <w:shd w:val="clear" w:color="auto" w:fill="FFFFFF"/>
+              </w:rPr>
+              <w:t xml:space="preserve">or </w:t>
+            </w:r>
+            <w:r>
+              <w:rPr>
+                <w:shd w:val="clear" w:color="auto" w:fill="FFFFFF"/>
+              </w:rPr>
+              <w:t>final_order_date_within_10_day</w:t>
+            </w:r>
+            <w:r>
+              <w:rPr>
+                <w:shd w:val="clear" w:color="auto" w:fill="FFFFFF"/>
+              </w:rPr>
+              <w:t xml:space="preserve">s </w:t>
+            </w:r>
+            <w:r>
+              <w:rPr>
+                <w:color w:val="00B050"/>
+                <w:shd w:val="clear" w:color="auto" w:fill="FFFFFF"/>
+              </w:rPr>
+              <w:t xml:space="preserve">or </w:t>
+            </w:r>
+            <w:r>
+              <w:rPr>
+                <w:shd w:val="clear" w:color="auto" w:fill="FFFFFF"/>
+              </w:rPr>
+              <w:t>unknown_final_date.all_true</w:t>
+            </w:r>
+            <w:r>
+              <w:rPr>
+                <w:color w:val="00B0F0"/>
+                <w:shd w:val="clear" w:color="auto" w:fill="FFFFFF"/>
+              </w:rPr>
+              <w:t>(</w:t>
+            </w:r>
+            <w:r>
+              <w:rPr>
+                <w:shd w:val="clear" w:color="auto" w:fill="FFFFFF"/>
+              </w:rPr>
+              <w:t>'reconsider',</w:t>
+            </w:r>
+            <w:r>
+              <w:rPr>
+                <w:shd w:val="clear" w:color="auto" w:fill="FFFFFF"/>
+              </w:rPr>
+              <w:t xml:space="preserve"> </w:t>
+            </w:r>
+            <w:r>
+              <w:rPr>
+                <w:shd w:val="clear" w:color="auto" w:fill="FFFFFF"/>
+              </w:rPr>
+              <w:t>exclusive</w:t>
+            </w:r>
+            <w:r>
+              <w:rPr>
+                <w:shd w:val="clear" w:color="auto" w:fill="FFFFFF"/>
+              </w:rPr>
+              <w:t xml:space="preserve"> </w:t>
+            </w:r>
+            <w:r>
+              <w:rPr>
+                <w:shd w:val="clear" w:color="auto" w:fill="FFFFFF"/>
+              </w:rPr>
+              <w:t>=</w:t>
+            </w:r>
+            <w:r>
+              <w:rPr>
+                <w:shd w:val="clear" w:color="auto" w:fill="FFFFFF"/>
+              </w:rPr>
+              <w:t xml:space="preserve"> </w:t>
+            </w:r>
+            <w:r>
+              <w:rPr>
+                <w:shd w:val="clear" w:color="auto" w:fill="FFFFFF"/>
+              </w:rPr>
+              <w:t>True</w:t>
+            </w:r>
+            <w:r>
+              <w:rPr>
+                <w:color w:val="00B0F0"/>
+                <w:shd w:val="clear" w:color="auto" w:fill="FFFFFF"/>
+              </w:rPr>
+              <w:t>)</w:t>
+            </w:r>
+            <w:r>
+              <w:rPr>
+                <w:color w:val="00B0F0"/>
+                <w:shd w:val="clear" w:color="auto" w:fill="FFFFFF"/>
+              </w:rPr>
+              <w:t xml:space="preserve"> </w:t>
+            </w:r>
+            <w:r>
+              <w:rPr>
+                <w:color w:val="00B050"/>
+                <w:shd w:val="clear" w:color="auto" w:fill="FFFFFF"/>
+              </w:rPr>
+              <w:t>or</w:t>
+            </w:r>
+            <w:r>
+              <w:rPr>
+                <w:color w:val="92D050"/>
+                <w:shd w:val="clear" w:color="auto" w:fill="FFFFFF"/>
+              </w:rPr>
+              <w:t xml:space="preserve"> </w:t>
+            </w:r>
+            <w:r>
+              <w:rPr>
+                <w:shd w:val="clear" w:color="auto" w:fill="FFFFFF"/>
+              </w:rPr>
+              <w:t>unknown_final_date.all_true</w:t>
+            </w:r>
+            <w:r>
+              <w:rPr>
+                <w:color w:val="00B0F0"/>
+                <w:shd w:val="clear" w:color="auto" w:fill="FFFFFF"/>
+              </w:rPr>
+              <w:t>(</w:t>
+            </w:r>
+            <w:r>
+              <w:rPr>
+                <w:shd w:val="clear" w:color="auto" w:fill="FFFFFF"/>
+              </w:rPr>
+              <w:t>'</w:t>
+            </w:r>
+            <w:r>
+              <w:rPr>
+                <w:shd w:val="clear" w:color="auto" w:fill="FFFFFF"/>
+              </w:rPr>
+              <w:t>appeal</w:t>
+            </w:r>
+            <w:r>
+              <w:rPr>
+                <w:shd w:val="clear" w:color="auto" w:fill="FFFFFF"/>
+              </w:rPr>
+              <w:t>',</w:t>
+            </w:r>
+            <w:r>
+              <w:rPr>
+                <w:shd w:val="clear" w:color="auto" w:fill="FFFFFF"/>
+              </w:rPr>
+              <w:t xml:space="preserve"> </w:t>
+            </w:r>
+            <w:r>
+              <w:rPr>
+                <w:shd w:val="clear" w:color="auto" w:fill="FFFFFF"/>
+              </w:rPr>
+              <w:t>exclusive</w:t>
+            </w:r>
+            <w:r>
+              <w:rPr>
+                <w:shd w:val="clear" w:color="auto" w:fill="FFFFFF"/>
+              </w:rPr>
+              <w:t xml:space="preserve"> </w:t>
+            </w:r>
+            <w:r>
+              <w:rPr>
+                <w:shd w:val="clear" w:color="auto" w:fill="FFFFFF"/>
+              </w:rPr>
+              <w:t>=</w:t>
+            </w:r>
+            <w:r>
+              <w:rPr>
+                <w:shd w:val="clear" w:color="auto" w:fill="FFFFFF"/>
+              </w:rPr>
+              <w:t xml:space="preserve"> </w:t>
+            </w:r>
+            <w:r>
+              <w:rPr>
+                <w:shd w:val="clear" w:color="auto" w:fill="FFFFFF"/>
+              </w:rPr>
+              <w:t>True</w:t>
+            </w:r>
+            <w:r>
+              <w:rPr>
+                <w:color w:val="00B0F0"/>
+                <w:shd w:val="clear" w:color="auto" w:fill="FFFFFF"/>
+              </w:rPr>
+              <w:t>)</w:t>
+            </w:r>
+            <w:r>
+              <w:rPr>
+                <w:color w:val="92D050"/>
+                <w:shd w:val="clear" w:color="auto" w:fill="FFFFFF"/>
+              </w:rPr>
+              <w:t xml:space="preserve"> </w:t>
+            </w:r>
+            <w:r>
+              <w:rPr>
+                <w:color w:val="00B050"/>
+                <w:shd w:val="clear" w:color="auto" w:fill="FFFFFF"/>
+              </w:rPr>
+              <w:t xml:space="preserve">or </w:t>
+            </w:r>
+            <w:r>
+              <w:rPr>
+                <w:shd w:val="clear" w:color="auto" w:fill="FFFFFF"/>
+              </w:rPr>
+              <w:t>unknown_final_date.all_true</w:t>
+            </w:r>
+            <w:r>
+              <w:rPr>
+                <w:color w:val="00B0F0"/>
+                <w:shd w:val="clear" w:color="auto" w:fill="FFFFFF"/>
+              </w:rPr>
+              <w:t>(</w:t>
+            </w:r>
+            <w:r>
+              <w:rPr>
+                <w:shd w:val="clear" w:color="auto" w:fill="FFFFFF"/>
+              </w:rPr>
+              <w:t>'reconsider',</w:t>
+            </w:r>
+            <w:r>
+              <w:rPr>
+                <w:shd w:val="clear" w:color="auto" w:fill="FFFFFF"/>
+              </w:rPr>
+              <w:t xml:space="preserve"> </w:t>
+            </w:r>
+            <w:r>
+              <w:rPr>
+                <w:shd w:val="clear" w:color="auto" w:fill="FFFFFF"/>
+              </w:rPr>
+              <w:t>'appeal',</w:t>
+            </w:r>
+            <w:r>
+              <w:rPr>
+                <w:shd w:val="clear" w:color="auto" w:fill="FFFFFF"/>
+              </w:rPr>
+              <w:t xml:space="preserve"> </w:t>
+            </w:r>
+            <w:r>
+              <w:rPr>
+                <w:shd w:val="clear" w:color="auto" w:fill="FFFFFF"/>
+              </w:rPr>
+              <w:t>exclusive</w:t>
+            </w:r>
+            <w:r>
+              <w:rPr>
+                <w:shd w:val="clear" w:color="auto" w:fill="FFFFFF"/>
+              </w:rPr>
+              <w:t xml:space="preserve"> </w:t>
+            </w:r>
+            <w:r>
+              <w:rPr>
+                <w:shd w:val="clear" w:color="auto" w:fill="FFFFFF"/>
+              </w:rPr>
+              <w:t>=</w:t>
+            </w:r>
+            <w:r>
+              <w:rPr>
+                <w:shd w:val="clear" w:color="auto" w:fill="FFFFFF"/>
+              </w:rPr>
+              <w:t xml:space="preserve"> </w:t>
+            </w:r>
+            <w:r>
+              <w:rPr>
+                <w:shd w:val="clear" w:color="auto" w:fill="FFFFFF"/>
+              </w:rPr>
+              <w:t>True</w:t>
+            </w:r>
+            <w:r>
+              <w:rPr>
+                <w:color w:val="00B0F0"/>
+                <w:shd w:val="clear" w:color="auto" w:fill="FFFFFF"/>
+              </w:rPr>
+              <w:t>)</w:t>
+            </w:r>
+            <w:r>
+              <w:rPr>
+                <w:color w:val="FFC000"/>
+                <w:shd w:val="clear" w:color="auto" w:fill="FFFFFF"/>
+              </w:rPr>
+              <w:t>)</w:t>
+            </w:r>
+            <w:r>
+              <w:rPr>
+                <w:color w:val="FF0000"/>
+                <w:shd w:val="clear" w:color="auto" w:fill="FFFFFF"/>
+              </w:rPr>
+              <w:t>)</w:t>
+            </w:r>
+            <w:r>
+              <w:rPr>
+                <w:color w:val="92D050"/>
+                <w:shd w:val="clear" w:color="auto" w:fill="FFFFFF"/>
+              </w:rPr>
+              <w:t xml:space="preserve"> </w:t>
+            </w:r>
+            <w:r>
+              <w:rPr>
+                <w:shd w:val="clear" w:color="auto" w:fill="FFFFFF"/>
+              </w:rPr>
               <w:t>%}</w:t>
             </w:r>
           </w:p>
@@ -8702,16 +8608,14 @@
             <w:pPr>
               <w:pStyle w:val="Body"/>
             </w:pPr>
-            <w:proofErr w:type="spellStart"/>
-            <w:r>
-              <w:t>expect_reconsider_step</w:t>
-            </w:r>
-            <w:proofErr w:type="spellEnd"/>
-            <w:r>
-              <w:t xml:space="preserve"> in </w:t>
-            </w:r>
-            <w:r>
-              <w:t>aka2j_mod_cust_div_templates.yml</w:t>
+            <w:r>
+              <w:t xml:space="preserve">expect_after_motion_or_answer_step </w:t>
+            </w:r>
+            <w:r>
+              <w:t xml:space="preserve">in </w:t>
+            </w:r>
+            <w:r>
+              <w:t>aka2j_templates.yml</w:t>
             </w:r>
           </w:p>
         </w:tc>
@@ -8733,16 +8637,23 @@
             <w:pPr>
               <w:pStyle w:val="Heading2"/>
               <w:outlineLvl w:val="1"/>
-            </w:pPr>
-            <w:r>
+              <w:rPr>
+                <w:shd w:val="clear" w:color="auto" w:fill="FFFFFF"/>
+              </w:rPr>
+            </w:pPr>
+            <w:r>
+              <w:rPr>
+                <w:shd w:val="clear" w:color="auto" w:fill="FFFFFF"/>
+              </w:rPr>
               <w:t xml:space="preserve">{{ </w:t>
             </w:r>
             <w:proofErr w:type="spellStart"/>
             <w:r>
-              <w:t>expect_reconsider_step</w:t>
-            </w:r>
-            <w:r>
-              <w:t>.subject</w:t>
+              <w:t>expect_after_motion_or_answer</w:t>
+            </w:r>
+            <w:r>
+              <w:lastRenderedPageBreak/>
+              <w:t>_step.subject</w:t>
             </w:r>
             <w:proofErr w:type="spellEnd"/>
             <w:r>
@@ -8779,13 +8690,7 @@
               <w:rPr>
                 <w:shd w:val="clear" w:color="auto" w:fill="FFFFFF"/>
               </w:rPr>
-              <w:t>expect_</w:t>
-            </w:r>
-            <w:r>
-              <w:rPr>
-                <w:shd w:val="clear" w:color="auto" w:fill="FFFFFF"/>
-              </w:rPr>
-              <w:t>reconsider</w:t>
+              <w:t>expect_after_motion_or_answer</w:t>
             </w:r>
             <w:r>
               <w:t>_content.docx")) }}</w:t>
@@ -8858,23 +8763,37 @@
               </w:rPr>
             </w:pPr>
             <w:r>
-              <w:rPr>
-                <w:shd w:val="clear" w:color="auto" w:fill="FFFFFF"/>
-              </w:rPr>
-              <w:lastRenderedPageBreak/>
-              <w:t xml:space="preserve">{%tr if </w:t>
-            </w:r>
-            <w:r>
-              <w:rPr>
-                <w:shd w:val="clear" w:color="auto" w:fill="FFFFFF"/>
-              </w:rPr>
-              <w:t>type_of_response</w:t>
-            </w:r>
-            <w:r>
-              <w:rPr>
-                <w:shd w:val="clear" w:color="auto" w:fill="FFFFFF"/>
-              </w:rPr>
-              <w:t xml:space="preserve"> in('modify', 'set aside') %}</w:t>
+              <w:t>{%tr</w:t>
+            </w:r>
+            <w:r>
+              <w:t xml:space="preserve"> </w:t>
+            </w:r>
+            <w:r>
+              <w:t>if</w:t>
+            </w:r>
+            <w:r>
+              <w:t xml:space="preserve"> interim</w:t>
+            </w:r>
+            <w:r>
+              <w:t>_order_date_within_10_days</w:t>
+            </w:r>
+            <w:r>
+              <w:t xml:space="preserve"> </w:t>
+            </w:r>
+            <w:r>
+              <w:t>or</w:t>
+            </w:r>
+            <w:r>
+              <w:t xml:space="preserve"> </w:t>
+            </w:r>
+            <w:r>
+              <w:t>final_order_date_within_10_days</w:t>
+            </w:r>
+            <w:r>
+              <w:t xml:space="preserve"> or unknown_final_date['reconsider'] </w:t>
+            </w:r>
+            <w:r>
+              <w:t>%}</w:t>
             </w:r>
           </w:p>
         </w:tc>
@@ -8890,29 +8809,17 @@
           <w:p>
             <w:pPr>
               <w:pStyle w:val="Body"/>
-              <w:rPr>
-                <w:shd w:val="clear" w:color="auto" w:fill="FFFFFF"/>
-              </w:rPr>
             </w:pPr>
             <w:proofErr w:type="spellStart"/>
             <w:r>
-              <w:rPr>
-                <w:shd w:val="clear" w:color="auto" w:fill="FFFFFF"/>
-              </w:rPr>
-              <w:t>expect_after_response_step</w:t>
+              <w:t>expect_reconsider_step</w:t>
             </w:r>
             <w:proofErr w:type="spellEnd"/>
             <w:r>
-              <w:rPr>
-                <w:shd w:val="clear" w:color="auto" w:fill="FFFFFF"/>
-              </w:rPr>
               <w:t xml:space="preserve"> in </w:t>
             </w:r>
             <w:r>
-              <w:rPr>
-                <w:shd w:val="clear" w:color="auto" w:fill="FFFFFF"/>
-              </w:rPr>
-              <w:t>aka2j_motion_response_templates.yml</w:t>
+              <w:t>aka2j_mod_cust_div_templates.yml</w:t>
             </w:r>
           </w:p>
         </w:tc>
@@ -8934,34 +8841,19 @@
             <w:pPr>
               <w:pStyle w:val="Heading2"/>
               <w:outlineLvl w:val="1"/>
-              <w:rPr>
-                <w:shd w:val="clear" w:color="auto" w:fill="FFFFFF"/>
-              </w:rPr>
-            </w:pPr>
-            <w:r>
-              <w:rPr>
-                <w:shd w:val="clear" w:color="auto" w:fill="FFFFFF"/>
-              </w:rPr>
+            </w:pPr>
+            <w:r>
               <w:t xml:space="preserve">{{ </w:t>
             </w:r>
             <w:proofErr w:type="spellStart"/>
             <w:r>
-              <w:rPr>
-                <w:shd w:val="clear" w:color="auto" w:fill="FFFFFF"/>
-              </w:rPr>
-              <w:t>expect_after_response_step</w:t>
-            </w:r>
-            <w:r>
-              <w:rPr>
-                <w:shd w:val="clear" w:color="auto" w:fill="FFFFFF"/>
-              </w:rPr>
+              <w:t>expect_reconsider_step</w:t>
+            </w:r>
+            <w:r>
               <w:t>.subject</w:t>
             </w:r>
             <w:proofErr w:type="spellEnd"/>
             <w:r>
-              <w:rPr>
-                <w:shd w:val="clear" w:color="auto" w:fill="FFFFFF"/>
-              </w:rPr>
               <w:t xml:space="preserve"> }}</w:t>
             </w:r>
           </w:p>
@@ -8995,13 +8887,13 @@
               <w:rPr>
                 <w:shd w:val="clear" w:color="auto" w:fill="FFFFFF"/>
               </w:rPr>
-              <w:t>expect_after_</w:t>
-            </w:r>
-            <w:r>
-              <w:rPr>
-                <w:shd w:val="clear" w:color="auto" w:fill="FFFFFF"/>
-              </w:rPr>
-              <w:t>response</w:t>
+              <w:t>expect_</w:t>
+            </w:r>
+            <w:r>
+              <w:rPr>
+                <w:shd w:val="clear" w:color="auto" w:fill="FFFFFF"/>
+              </w:rPr>
+              <w:t>reconsider</w:t>
             </w:r>
             <w:r>
               <w:t>_content.docx")) }}</w:t>
@@ -9025,6 +8917,9 @@
           <w:p>
             <w:pPr>
               <w:pStyle w:val="Body"/>
+              <w:rPr>
+                <w:shd w:val="clear" w:color="auto" w:fill="FFFFFF"/>
+              </w:rPr>
             </w:pPr>
             <w:r>
               <w:rPr>
@@ -9080,37 +8975,13 @@
               <w:rPr>
                 <w:shd w:val="clear" w:color="auto" w:fill="FFFFFF"/>
               </w:rPr>
-              <w:t>respond_to_</w:t>
-            </w:r>
-            <w:r>
-              <w:rPr>
-                <w:shd w:val="clear" w:color="auto" w:fill="FFFFFF"/>
-              </w:rPr>
-              <w:t xml:space="preserve">modify == 'agree' or </w:t>
-            </w:r>
-            <w:r>
-              <w:t>respond_to_set_aside</w:t>
-            </w:r>
-            <w:r>
-              <w:t xml:space="preserve"> =</w:t>
-            </w:r>
-            <w:r>
-              <w:t>=</w:t>
-            </w:r>
-            <w:r>
-              <w:t xml:space="preserve"> </w:t>
-            </w:r>
-            <w:r>
-              <w:t>'agree'</w:t>
-            </w:r>
-            <w:r>
-              <w:t xml:space="preserve"> </w:t>
-            </w:r>
-            <w:r>
-              <w:rPr>
-                <w:shd w:val="clear" w:color="auto" w:fill="FFFFFF"/>
-              </w:rPr>
-              <w:t>%}</w:t>
+              <w:t>type_of_response</w:t>
+            </w:r>
+            <w:r>
+              <w:rPr>
+                <w:shd w:val="clear" w:color="auto" w:fill="FFFFFF"/>
+              </w:rPr>
+              <w:t xml:space="preserve"> in('modify', 'set aside') %}</w:t>
             </w:r>
           </w:p>
         </w:tc>
@@ -9126,29 +8997,28 @@
           <w:p>
             <w:pPr>
               <w:pStyle w:val="Body"/>
-            </w:pPr>
-            <w:r>
-              <w:t>contact_other_party_step</w:t>
-            </w:r>
-            <w:r>
-              <w:t xml:space="preserve"> </w:t>
-            </w:r>
-            <w:r>
-              <w:t>and</w:t>
-            </w:r>
-            <w:r>
-              <w:br/>
-            </w:r>
-            <w:r>
-              <w:t>file_agreement_step</w:t>
-            </w:r>
-            <w:r>
-              <w:br/>
-            </w:r>
-            <w:r>
+              <w:rPr>
+                <w:shd w:val="clear" w:color="auto" w:fill="FFFFFF"/>
+              </w:rPr>
+            </w:pPr>
+            <w:proofErr w:type="spellStart"/>
+            <w:r>
+              <w:rPr>
+                <w:shd w:val="clear" w:color="auto" w:fill="FFFFFF"/>
+              </w:rPr>
+              <w:t>expect_after_response_step</w:t>
+            </w:r>
+            <w:proofErr w:type="spellEnd"/>
+            <w:r>
+              <w:rPr>
+                <w:shd w:val="clear" w:color="auto" w:fill="FFFFFF"/>
+              </w:rPr>
               <w:t xml:space="preserve"> in </w:t>
             </w:r>
             <w:r>
+              <w:rPr>
+                <w:shd w:val="clear" w:color="auto" w:fill="FFFFFF"/>
+              </w:rPr>
               <w:t>aka2j_motion_response_templates.yml</w:t>
             </w:r>
           </w:p>
@@ -9179,26 +9049,14 @@
               <w:rPr>
                 <w:shd w:val="clear" w:color="auto" w:fill="FFFFFF"/>
               </w:rPr>
-              <w:t>{</w:t>
-            </w:r>
-            <w:r>
-              <w:rPr>
-                <w:shd w:val="clear" w:color="auto" w:fill="FFFFFF"/>
-              </w:rPr>
-              <w:t>{</w:t>
-            </w:r>
-            <w:r>
-              <w:rPr>
-                <w:shd w:val="clear" w:color="auto" w:fill="FFFFFF"/>
-              </w:rPr>
-              <w:t xml:space="preserve"> </w:t>
+              <w:t xml:space="preserve">{{ </w:t>
             </w:r>
             <w:proofErr w:type="spellStart"/>
             <w:r>
-              <w:t>contact_other_party_ste</w:t>
-            </w:r>
-            <w:r>
-              <w:t>p</w:t>
+              <w:rPr>
+                <w:shd w:val="clear" w:color="auto" w:fill="FFFFFF"/>
+              </w:rPr>
+              <w:t>expect_after_response_step</w:t>
             </w:r>
             <w:r>
               <w:rPr>
@@ -9211,19 +9069,7 @@
               <w:rPr>
                 <w:shd w:val="clear" w:color="auto" w:fill="FFFFFF"/>
               </w:rPr>
-              <w:t xml:space="preserve"> </w:t>
-            </w:r>
-            <w:r>
-              <w:rPr>
-                <w:shd w:val="clear" w:color="auto" w:fill="FFFFFF"/>
-              </w:rPr>
-              <w:t>}</w:t>
-            </w:r>
-            <w:r>
-              <w:rPr>
-                <w:shd w:val="clear" w:color="auto" w:fill="FFFFFF"/>
-              </w:rPr>
-              <w:t>}</w:t>
+              <w:t xml:space="preserve"> }}</w:t>
             </w:r>
           </w:p>
         </w:tc>
@@ -9245,15 +9091,27 @@
           <w:p>
             <w:pPr>
               <w:pStyle w:val="Body"/>
-              <w:rPr>
-                <w:color w:val="FF00FF"/>
-              </w:rPr>
-            </w:pPr>
-            <w:r>
-              <w:rPr>
-                <w:color w:val="FF00FF"/>
-              </w:rPr>
-              <w:t>contact_other_party_content.docx</w:t>
+            </w:pPr>
+            <w:r>
+              <w:t xml:space="preserve">{{p </w:t>
+            </w:r>
+            <w:r>
+              <w:t>(include_docx_template("docassemble.AKA2JBranding:</w:t>
+            </w:r>
+            <w:r>
+              <w:rPr>
+                <w:shd w:val="clear" w:color="auto" w:fill="FFFFFF"/>
+              </w:rPr>
+              <w:t>expect_after_</w:t>
+            </w:r>
+            <w:r>
+              <w:rPr>
+                <w:shd w:val="clear" w:color="auto" w:fill="FFFFFF"/>
+              </w:rPr>
+              <w:t>response</w:t>
+            </w:r>
+            <w:r>
+              <w:t>_content.docx")) }}</w:t>
             </w:r>
           </w:p>
         </w:tc>
@@ -9273,17 +9131,13 @@
           </w:tcPr>
           <w:p>
             <w:pPr>
-              <w:pStyle w:val="Heading2"/>
-              <w:outlineLvl w:val="1"/>
-              <w:rPr>
-                <w:shd w:val="clear" w:color="auto" w:fill="FFFFFF"/>
-              </w:rPr>
-            </w:pPr>
-            <w:r>
-              <w:rPr>
-                <w:shd w:val="clear" w:color="auto" w:fill="FFFFFF"/>
-              </w:rPr>
-              <w:t>{{ file_agreement_step.subject }}</w:t>
+              <w:pStyle w:val="Body"/>
+            </w:pPr>
+            <w:r>
+              <w:rPr>
+                <w:shd w:val="clear" w:color="auto" w:fill="FFFFFF"/>
+              </w:rPr>
+              <w:t>{%tr endif %}</w:t>
             </w:r>
           </w:p>
         </w:tc>
@@ -9299,28 +9153,7 @@
           <w:p>
             <w:pPr>
               <w:pStyle w:val="Body"/>
-              <w:spacing w:before="0" w:after="60"/>
-            </w:pPr>
-          </w:p>
-          <w:p>
-            <w:pPr>
-              <w:pStyle w:val="Body"/>
-            </w:pPr>
-            <w:r>
-              <w:t>{{p (include_docx_template("docassemble.AKA2JBranding:</w:t>
-            </w:r>
-            <w:r>
-              <w:t>file_agreement</w:t>
-            </w:r>
-            <w:r>
-              <w:t xml:space="preserve">_content.docx")) </w:t>
-            </w:r>
-            <w:r>
-              <w:t>}</w:t>
-            </w:r>
-            <w:r>
-              <w:t>}</w:t>
-            </w:r>
+            </w:pPr>
           </w:p>
         </w:tc>
       </w:tr>
@@ -9348,7 +9181,44 @@
               <w:rPr>
                 <w:shd w:val="clear" w:color="auto" w:fill="FFFFFF"/>
               </w:rPr>
-              <w:t>{%tr endif %}</w:t>
+              <w:lastRenderedPageBreak/>
+              <w:t xml:space="preserve">{%tr if </w:t>
+            </w:r>
+            <w:r>
+              <w:rPr>
+                <w:shd w:val="clear" w:color="auto" w:fill="FFFFFF"/>
+              </w:rPr>
+              <w:t>respond_to_</w:t>
+            </w:r>
+            <w:r>
+              <w:rPr>
+                <w:shd w:val="clear" w:color="auto" w:fill="FFFFFF"/>
+              </w:rPr>
+              <w:t xml:space="preserve">modify == 'agree' or </w:t>
+            </w:r>
+            <w:r>
+              <w:t>respond_to_set_aside</w:t>
+            </w:r>
+            <w:r>
+              <w:t xml:space="preserve"> =</w:t>
+            </w:r>
+            <w:r>
+              <w:t>=</w:t>
+            </w:r>
+            <w:r>
+              <w:t xml:space="preserve"> </w:t>
+            </w:r>
+            <w:r>
+              <w:t>'agree'</w:t>
+            </w:r>
+            <w:r>
+              <w:t xml:space="preserve"> </w:t>
+            </w:r>
+            <w:r>
+              <w:rPr>
+                <w:shd w:val="clear" w:color="auto" w:fill="FFFFFF"/>
+              </w:rPr>
+              <w:t>%}</w:t>
             </w:r>
           </w:p>
         </w:tc>
@@ -9365,6 +9235,30 @@
             <w:pPr>
               <w:pStyle w:val="Body"/>
             </w:pPr>
+            <w:r>
+              <w:t>contact_other_party_step</w:t>
+            </w:r>
+            <w:r>
+              <w:t xml:space="preserve"> </w:t>
+            </w:r>
+            <w:r>
+              <w:t>and</w:t>
+            </w:r>
+            <w:r>
+              <w:br/>
+            </w:r>
+            <w:r>
+              <w:t>file_agreement_step</w:t>
+            </w:r>
+            <w:r>
+              <w:br/>
+            </w:r>
+            <w:r>
+              <w:t xml:space="preserve"> in </w:t>
+            </w:r>
+            <w:r>
+              <w:t>aka2j_motion_response_templates.yml</w:t>
+            </w:r>
           </w:p>
         </w:tc>
       </w:tr>
@@ -9383,48 +9277,61 @@
           </w:tcPr>
           <w:p>
             <w:pPr>
-              <w:pStyle w:val="Body"/>
-              <w:rPr>
-                <w:shd w:val="clear" w:color="auto" w:fill="FFFFFF"/>
-              </w:rPr>
-            </w:pPr>
-            <w:r>
-              <w:rPr>
-                <w:shd w:val="clear" w:color="auto" w:fill="FFFFFF"/>
-              </w:rPr>
-              <w:t xml:space="preserve">{%tr if </w:t>
-            </w:r>
-            <w:r>
-              <w:rPr>
-                <w:shd w:val="clear" w:color="auto" w:fill="FFFFFF"/>
-                <w:lang w:val="en"/>
-              </w:rPr>
-              <w:t>respond_to_appeal</w:t>
-            </w:r>
-            <w:r>
-              <w:rPr>
-                <w:shd w:val="clear" w:color="auto" w:fill="FFFFFF"/>
-              </w:rPr>
-              <w:t xml:space="preserve"> in </w:t>
-            </w:r>
-            <w:r>
-              <w:rPr>
-                <w:shd w:val="clear" w:color="auto" w:fill="FFFFFF"/>
-              </w:rPr>
-              <w:lastRenderedPageBreak/>
-              <w:t>('agree',</w:t>
-            </w:r>
-            <w:r>
-              <w:rPr>
-                <w:shd w:val="clear" w:color="auto" w:fill="FFFFFF"/>
-              </w:rPr>
-              <w:t xml:space="preserve"> </w:t>
-            </w:r>
-            <w:r>
-              <w:rPr>
-                <w:shd w:val="clear" w:color="auto" w:fill="FFFFFF"/>
-              </w:rPr>
-              <w:t>'some', 'none') %}</w:t>
+              <w:pStyle w:val="Heading2"/>
+              <w:outlineLvl w:val="1"/>
+              <w:rPr>
+                <w:shd w:val="clear" w:color="auto" w:fill="FFFFFF"/>
+              </w:rPr>
+            </w:pPr>
+            <w:r>
+              <w:rPr>
+                <w:shd w:val="clear" w:color="auto" w:fill="FFFFFF"/>
+              </w:rPr>
+              <w:t>{</w:t>
+            </w:r>
+            <w:r>
+              <w:rPr>
+                <w:shd w:val="clear" w:color="auto" w:fill="FFFFFF"/>
+              </w:rPr>
+              <w:t>{</w:t>
+            </w:r>
+            <w:r>
+              <w:rPr>
+                <w:shd w:val="clear" w:color="auto" w:fill="FFFFFF"/>
+              </w:rPr>
+              <w:t xml:space="preserve"> </w:t>
+            </w:r>
+            <w:proofErr w:type="spellStart"/>
+            <w:r>
+              <w:t>contact_other_party_ste</w:t>
+            </w:r>
+            <w:r>
+              <w:t>p</w:t>
+            </w:r>
+            <w:r>
+              <w:rPr>
+                <w:shd w:val="clear" w:color="auto" w:fill="FFFFFF"/>
+              </w:rPr>
+              <w:t>.subject</w:t>
+            </w:r>
+            <w:proofErr w:type="spellEnd"/>
+            <w:r>
+              <w:rPr>
+                <w:shd w:val="clear" w:color="auto" w:fill="FFFFFF"/>
+              </w:rPr>
+              <w:t xml:space="preserve"> </w:t>
+            </w:r>
+            <w:r>
+              <w:rPr>
+                <w:shd w:val="clear" w:color="auto" w:fill="FFFFFF"/>
+              </w:rPr>
+              <w:t>}</w:t>
+            </w:r>
+            <w:r>
+              <w:rPr>
+                <w:shd w:val="clear" w:color="auto" w:fill="FFFFFF"/>
+              </w:rPr>
+              <w:t>}</w:t>
             </w:r>
           </w:p>
         </w:tc>
@@ -9440,18 +9347,21 @@
           <w:p>
             <w:pPr>
               <w:pStyle w:val="Body"/>
-            </w:pPr>
-            <w:proofErr w:type="spellStart"/>
-            <w:r>
-              <w:lastRenderedPageBreak/>
-              <w:t>appeal_response_step</w:t>
-            </w:r>
-            <w:proofErr w:type="spellEnd"/>
-            <w:r>
-              <w:t xml:space="preserve"> in </w:t>
-            </w:r>
-            <w:r>
-              <w:t>aka2j_motion_response_templates.yml</w:t>
+              <w:spacing w:before="0" w:after="60"/>
+            </w:pPr>
+          </w:p>
+          <w:p>
+            <w:pPr>
+              <w:pStyle w:val="Body"/>
+              <w:rPr>
+                <w:color w:val="FF00FF"/>
+              </w:rPr>
+            </w:pPr>
+            <w:r>
+              <w:rPr>
+                <w:color w:val="FF00FF"/>
+              </w:rPr>
+              <w:t>contact_other_party_content.docx</w:t>
             </w:r>
           </w:p>
         </w:tc>
@@ -9473,54 +9383,51 @@
             <w:pPr>
               <w:pStyle w:val="Heading2"/>
               <w:outlineLvl w:val="1"/>
-            </w:pPr>
-            <w:r>
-              <w:rPr>
-                <w:shd w:val="clear" w:color="auto" w:fill="FFFFFF"/>
-              </w:rPr>
-              <w:t>{{ appeal_response_step.subject }</w:t>
-            </w:r>
-            <w:r>
-              <w:rPr>
-                <w:shd w:val="clear" w:color="auto" w:fill="FFFFFF"/>
-              </w:rPr>
+              <w:rPr>
+                <w:shd w:val="clear" w:color="auto" w:fill="FFFFFF"/>
+              </w:rPr>
+            </w:pPr>
+            <w:r>
+              <w:rPr>
+                <w:shd w:val="clear" w:color="auto" w:fill="FFFFFF"/>
+              </w:rPr>
+              <w:t>{{ file_agreement_step.subject }}</w:t>
+            </w:r>
+          </w:p>
+        </w:tc>
+        <w:tc>
+          <w:tcPr>
+            <w:tcW w:w="7612" w:type="dxa"/>
+            <w:tcMar>
+              <w:top w:w="432" w:type="dxa"/>
+              <w:left w:w="115" w:type="dxa"/>
+              <w:right w:w="115" w:type="dxa"/>
+            </w:tcMar>
+          </w:tcPr>
+          <w:p>
+            <w:pPr>
+              <w:pStyle w:val="Body"/>
+              <w:spacing w:before="0" w:after="60"/>
+            </w:pPr>
+          </w:p>
+          <w:p>
+            <w:pPr>
+              <w:pStyle w:val="Body"/>
+            </w:pPr>
+            <w:r>
+              <w:t>{{p (include_docx_template("docassemble.AKA2JBranding:</w:t>
+            </w:r>
+            <w:r>
+              <w:t>file_agreement</w:t>
+            </w:r>
+            <w:r>
+              <w:t xml:space="preserve">_content.docx")) </w:t>
+            </w:r>
+            <w:r>
               <w:t>}</w:t>
             </w:r>
-          </w:p>
-        </w:tc>
-        <w:tc>
-          <w:tcPr>
-            <w:tcW w:w="7612" w:type="dxa"/>
-            <w:tcMar>
-              <w:top w:w="432" w:type="dxa"/>
-              <w:left w:w="115" w:type="dxa"/>
-              <w:right w:w="115" w:type="dxa"/>
-            </w:tcMar>
-          </w:tcPr>
-          <w:p>
-            <w:pPr>
-              <w:pStyle w:val="Body"/>
-              <w:spacing w:before="0" w:after="60"/>
-            </w:pPr>
-          </w:p>
-          <w:p>
-            <w:pPr>
-              <w:pStyle w:val="Body"/>
-            </w:pPr>
-            <w:r>
-              <w:t xml:space="preserve">{{p </w:t>
-            </w:r>
-            <w:r>
-              <w:t>(include_docx_template("docassemble.AKA2JBranding:</w:t>
-            </w:r>
-            <w:r>
-              <w:rPr>
-                <w:shd w:val="clear" w:color="auto" w:fill="FFFFFF"/>
-              </w:rPr>
-              <w:t>appeal_response</w:t>
-            </w:r>
-            <w:r>
-              <w:t>_content.docx")) }}</w:t>
+            <w:r>
+              <w:t>}</w:t>
             </w:r>
           </w:p>
         </w:tc>
@@ -9606,7 +9513,19 @@
               <w:rPr>
                 <w:shd w:val="clear" w:color="auto" w:fill="FFFFFF"/>
               </w:rPr>
-              <w:t xml:space="preserve"> == 'agree' %}</w:t>
+              <w:t xml:space="preserve"> in ('agree',</w:t>
+            </w:r>
+            <w:r>
+              <w:rPr>
+                <w:shd w:val="clear" w:color="auto" w:fill="FFFFFF"/>
+              </w:rPr>
+              <w:t xml:space="preserve"> </w:t>
+            </w:r>
+            <w:r>
+              <w:rPr>
+                <w:shd w:val="clear" w:color="auto" w:fill="FFFFFF"/>
+              </w:rPr>
+              <w:t>'some', 'none') %}</w:t>
             </w:r>
           </w:p>
         </w:tc>
@@ -9623,17 +9542,13 @@
             <w:pPr>
               <w:pStyle w:val="Body"/>
             </w:pPr>
-            <w:r>
-              <w:t>appeal_contact_parent_step</w:t>
-            </w:r>
-            <w:r>
-              <w:t xml:space="preserve"> and </w:t>
-            </w:r>
-            <w:r>
-              <w:t xml:space="preserve">tell_supreme_court_step </w:t>
-            </w:r>
-            <w:r>
-              <w:t xml:space="preserve">in </w:t>
+            <w:proofErr w:type="spellStart"/>
+            <w:r>
+              <w:t>appeal_response_step</w:t>
+            </w:r>
+            <w:proofErr w:type="spellEnd"/>
+            <w:r>
+              <w:t xml:space="preserve"> in </w:t>
             </w:r>
             <w:r>
               <w:t>aka2j_motion_response_templates.yml</w:t>
@@ -9663,31 +9578,13 @@
               <w:rPr>
                 <w:shd w:val="clear" w:color="auto" w:fill="FFFFFF"/>
               </w:rPr>
-              <w:t>{{</w:t>
-            </w:r>
-            <w:r>
-              <w:rPr>
-                <w:shd w:val="clear" w:color="auto" w:fill="FFFFFF"/>
-              </w:rPr>
-              <w:t xml:space="preserve"> </w:t>
-            </w:r>
-            <w:r>
-              <w:t>appeal_contact_parent_step</w:t>
-            </w:r>
-            <w:r>
-              <w:t>.subject</w:t>
-            </w:r>
-            <w:r>
-              <w:rPr>
-                <w:shd w:val="clear" w:color="auto" w:fill="FFFFFF"/>
-              </w:rPr>
-              <w:t xml:space="preserve"> </w:t>
-            </w:r>
-            <w:r>
-              <w:rPr>
-                <w:shd w:val="clear" w:color="auto" w:fill="FFFFFF"/>
-              </w:rPr>
-              <w:t>}}</w:t>
+              <w:t>{{ appeal_response_step.subject }</w:t>
+            </w:r>
+            <w:r>
+              <w:rPr>
+                <w:shd w:val="clear" w:color="auto" w:fill="FFFFFF"/>
+              </w:rPr>
+              <w:t>}</w:t>
             </w:r>
           </w:p>
         </w:tc>
@@ -9703,6 +9600,7 @@
           <w:p>
             <w:pPr>
               <w:pStyle w:val="Body"/>
+              <w:spacing w:before="0" w:after="60"/>
             </w:pPr>
           </w:p>
           <w:p>
@@ -9719,7 +9617,7 @@
               <w:rPr>
                 <w:shd w:val="clear" w:color="auto" w:fill="FFFFFF"/>
               </w:rPr>
-              <w:t>appeal_contact_parent</w:t>
+              <w:t>appeal_response</w:t>
             </w:r>
             <w:r>
               <w:t>_content.docx")) }}</w:t>
@@ -9742,31 +9640,16 @@
           </w:tcPr>
           <w:p>
             <w:pPr>
-              <w:pStyle w:val="Heading2"/>
-              <w:outlineLvl w:val="1"/>
-              <w:rPr>
-                <w:shd w:val="clear" w:color="auto" w:fill="FFFFFF"/>
-              </w:rPr>
-            </w:pPr>
-            <w:r>
-              <w:rPr>
-                <w:shd w:val="clear" w:color="auto" w:fill="FFFFFF"/>
-              </w:rPr>
-              <w:t xml:space="preserve">{{ </w:t>
-            </w:r>
-            <w:proofErr w:type="spellStart"/>
-            <w:r>
-              <w:t>tell_supreme_court_step</w:t>
-            </w:r>
-            <w:r>
-              <w:t>.subject</w:t>
-            </w:r>
-            <w:proofErr w:type="spellEnd"/>
-            <w:r>
-              <w:rPr>
-                <w:shd w:val="clear" w:color="auto" w:fill="FFFFFF"/>
-              </w:rPr>
-              <w:t xml:space="preserve"> }}</w:t>
+              <w:pStyle w:val="Body"/>
+              <w:rPr>
+                <w:shd w:val="clear" w:color="auto" w:fill="FFFFFF"/>
+              </w:rPr>
+            </w:pPr>
+            <w:r>
+              <w:rPr>
+                <w:shd w:val="clear" w:color="auto" w:fill="FFFFFF"/>
+              </w:rPr>
+              <w:t>{%tr endif %}</w:t>
             </w:r>
           </w:p>
         </w:tc>
@@ -9782,30 +9665,7 @@
           <w:p>
             <w:pPr>
               <w:pStyle w:val="Body"/>
-              <w:spacing w:before="0" w:after="60"/>
-            </w:pPr>
-          </w:p>
-          <w:p>
-            <w:pPr>
-              <w:pStyle w:val="Body"/>
-              <w:keepNext/>
-              <w:keepLines/>
-            </w:pPr>
-            <w:r>
-              <w:t xml:space="preserve">{{p </w:t>
-            </w:r>
-            <w:r>
-              <w:t>(include_docx_template("docassemble.AKA2JBranding:</w:t>
-            </w:r>
-            <w:r>
-              <w:rPr>
-                <w:shd w:val="clear" w:color="auto" w:fill="FFFFFF"/>
-              </w:rPr>
-              <w:t>tell_supreme_court</w:t>
-            </w:r>
-            <w:r>
-              <w:t>_content.docx")) }}</w:t>
-            </w:r>
+            </w:pPr>
           </w:p>
         </w:tc>
       </w:tr>
@@ -9833,7 +9693,27 @@
               <w:rPr>
                 <w:shd w:val="clear" w:color="auto" w:fill="FFFFFF"/>
               </w:rPr>
-              <w:t>{%tr endif %}</w:t>
+              <w:t xml:space="preserve">{%tr if </w:t>
+            </w:r>
+            <w:r>
+              <w:rPr>
+                <w:shd w:val="clear" w:color="auto" w:fill="FFFFFF"/>
+                <w:lang w:val="en"/>
+              </w:rPr>
+              <w:t>respond_to_appeal</w:t>
+            </w:r>
+            <w:r>
+              <w:rPr>
+                <w:shd w:val="clear" w:color="auto" w:fill="FFFFFF"/>
+              </w:rPr>
+              <w:t xml:space="preserve"> == </w:t>
+            </w:r>
+            <w:r>
+              <w:rPr>
+                <w:shd w:val="clear" w:color="auto" w:fill="FFFFFF"/>
+              </w:rPr>
+              <w:lastRenderedPageBreak/>
+              <w:t>'agree' %}</w:t>
             </w:r>
           </w:p>
         </w:tc>
@@ -9850,16 +9730,21 @@
             <w:pPr>
               <w:pStyle w:val="Body"/>
             </w:pPr>
-            <w:proofErr w:type="spellStart"/>
-            <w:r>
-              <w:t>get_help</w:t>
-            </w:r>
-            <w:proofErr w:type="spellEnd"/>
-            <w:r>
-              <w:t xml:space="preserve"> in </w:t>
-            </w:r>
-            <w:r>
-              <w:t>aka2j_templates.yml</w:t>
+            <w:r>
+              <w:lastRenderedPageBreak/>
+              <w:t>appeal_contact_parent_step</w:t>
+            </w:r>
+            <w:r>
+              <w:t xml:space="preserve"> and </w:t>
+            </w:r>
+            <w:r>
+              <w:t xml:space="preserve">tell_supreme_court_step </w:t>
+            </w:r>
+            <w:r>
+              <w:t xml:space="preserve">in </w:t>
+            </w:r>
+            <w:r>
+              <w:t>aka2j_motion_response_templates.yml</w:t>
             </w:r>
           </w:p>
         </w:tc>
@@ -9883,15 +9768,230 @@
               <w:outlineLvl w:val="1"/>
             </w:pPr>
             <w:r>
+              <w:rPr>
+                <w:shd w:val="clear" w:color="auto" w:fill="FFFFFF"/>
+              </w:rPr>
+              <w:t>{{</w:t>
+            </w:r>
+            <w:r>
+              <w:rPr>
+                <w:shd w:val="clear" w:color="auto" w:fill="FFFFFF"/>
+              </w:rPr>
+              <w:t xml:space="preserve"> </w:t>
+            </w:r>
+            <w:r>
+              <w:t>appeal_contact_parent_step</w:t>
+            </w:r>
+            <w:r>
+              <w:t>.subject</w:t>
+            </w:r>
+            <w:r>
+              <w:rPr>
+                <w:shd w:val="clear" w:color="auto" w:fill="FFFFFF"/>
+              </w:rPr>
+              <w:t xml:space="preserve"> </w:t>
+            </w:r>
+            <w:r>
+              <w:rPr>
+                <w:shd w:val="clear" w:color="auto" w:fill="FFFFFF"/>
+              </w:rPr>
+              <w:t>}}</w:t>
+            </w:r>
+          </w:p>
+        </w:tc>
+        <w:tc>
+          <w:tcPr>
+            <w:tcW w:w="7612" w:type="dxa"/>
+            <w:tcMar>
+              <w:top w:w="432" w:type="dxa"/>
+              <w:left w:w="115" w:type="dxa"/>
+              <w:right w:w="115" w:type="dxa"/>
+            </w:tcMar>
+          </w:tcPr>
+          <w:p>
+            <w:pPr>
+              <w:pStyle w:val="Body"/>
+            </w:pPr>
+          </w:p>
+          <w:p>
+            <w:pPr>
+              <w:pStyle w:val="Body"/>
+            </w:pPr>
+            <w:r>
+              <w:t xml:space="preserve">{{p </w:t>
+            </w:r>
+            <w:r>
+              <w:t>(include_docx_template("docassemble.AKA2JBranding:</w:t>
+            </w:r>
+            <w:r>
+              <w:rPr>
+                <w:shd w:val="clear" w:color="auto" w:fill="FFFFFF"/>
+              </w:rPr>
+              <w:t>appeal_contact_parent</w:t>
+            </w:r>
+            <w:r>
+              <w:t>_content.docx")) }}</w:t>
+            </w:r>
+          </w:p>
+        </w:tc>
+      </w:tr>
+      <w:tr>
+        <w:trPr>
+          <w:jc w:val="center"/>
+        </w:trPr>
+        <w:tc>
+          <w:tcPr>
+            <w:tcW w:w="2880" w:type="dxa"/>
+            <w:tcMar>
+              <w:top w:w="360" w:type="dxa"/>
+              <w:left w:w="115" w:type="dxa"/>
+              <w:right w:w="115" w:type="dxa"/>
+            </w:tcMar>
+          </w:tcPr>
+          <w:p>
+            <w:pPr>
+              <w:pStyle w:val="Heading2"/>
+              <w:outlineLvl w:val="1"/>
+              <w:rPr>
+                <w:shd w:val="clear" w:color="auto" w:fill="FFFFFF"/>
+              </w:rPr>
+            </w:pPr>
+            <w:r>
+              <w:rPr>
+                <w:shd w:val="clear" w:color="auto" w:fill="FFFFFF"/>
+              </w:rPr>
               <w:t xml:space="preserve">{{ </w:t>
             </w:r>
             <w:proofErr w:type="spellStart"/>
             <w:r>
-              <w:t>get_help_step.subject</w:t>
+              <w:t>tell_supreme_court_step</w:t>
+            </w:r>
+            <w:r>
+              <w:t>.subject</w:t>
             </w:r>
             <w:proofErr w:type="spellEnd"/>
             <w:r>
+              <w:rPr>
+                <w:shd w:val="clear" w:color="auto" w:fill="FFFFFF"/>
+              </w:rPr>
               <w:t xml:space="preserve"> }}</w:t>
+            </w:r>
+          </w:p>
+        </w:tc>
+        <w:tc>
+          <w:tcPr>
+            <w:tcW w:w="7612" w:type="dxa"/>
+            <w:tcMar>
+              <w:top w:w="432" w:type="dxa"/>
+              <w:left w:w="115" w:type="dxa"/>
+              <w:right w:w="115" w:type="dxa"/>
+            </w:tcMar>
+          </w:tcPr>
+          <w:p>
+            <w:pPr>
+              <w:pStyle w:val="Body"/>
+              <w:spacing w:before="0" w:after="60"/>
+            </w:pPr>
+          </w:p>
+          <w:p>
+            <w:pPr>
+              <w:pStyle w:val="Body"/>
+              <w:keepNext/>
+              <w:keepLines/>
+            </w:pPr>
+            <w:r>
+              <w:t xml:space="preserve">{{p </w:t>
+            </w:r>
+            <w:r>
+              <w:t>(include_docx_template("docassemble.AKA2JBranding:</w:t>
+            </w:r>
+            <w:r>
+              <w:rPr>
+                <w:shd w:val="clear" w:color="auto" w:fill="FFFFFF"/>
+              </w:rPr>
+              <w:t>tell_supreme_court</w:t>
+            </w:r>
+            <w:r>
+              <w:t>_content.docx")) }}</w:t>
+            </w:r>
+          </w:p>
+        </w:tc>
+      </w:tr>
+      <w:tr>
+        <w:trPr>
+          <w:jc w:val="center"/>
+        </w:trPr>
+        <w:tc>
+          <w:tcPr>
+            <w:tcW w:w="2880" w:type="dxa"/>
+            <w:tcMar>
+              <w:top w:w="360" w:type="dxa"/>
+              <w:left w:w="115" w:type="dxa"/>
+              <w:right w:w="115" w:type="dxa"/>
+            </w:tcMar>
+          </w:tcPr>
+          <w:p>
+            <w:pPr>
+              <w:pStyle w:val="Body"/>
+              <w:rPr>
+                <w:shd w:val="clear" w:color="auto" w:fill="FFFFFF"/>
+              </w:rPr>
+            </w:pPr>
+            <w:r>
+              <w:rPr>
+                <w:shd w:val="clear" w:color="auto" w:fill="FFFFFF"/>
+              </w:rPr>
+              <w:t>{%tr endif %}</w:t>
+            </w:r>
+          </w:p>
+        </w:tc>
+        <w:tc>
+          <w:tcPr>
+            <w:tcW w:w="7612" w:type="dxa"/>
+            <w:tcMar>
+              <w:top w:w="432" w:type="dxa"/>
+              <w:left w:w="115" w:type="dxa"/>
+              <w:right w:w="115" w:type="dxa"/>
+            </w:tcMar>
+          </w:tcPr>
+          <w:p>
+            <w:pPr>
+              <w:pStyle w:val="Body"/>
+            </w:pPr>
+            <w:proofErr w:type="spellStart"/>
+            <w:r>
+              <w:t>get_help</w:t>
+            </w:r>
+            <w:proofErr w:type="spellEnd"/>
+            <w:r>
+              <w:t xml:space="preserve"> in </w:t>
+            </w:r>
+            <w:r>
+              <w:t>aka2j_templates.yml</w:t>
+            </w:r>
+          </w:p>
+        </w:tc>
+      </w:tr>
+      <w:tr>
+        <w:trPr>
+          <w:jc w:val="center"/>
+        </w:trPr>
+        <w:tc>
+          <w:tcPr>
+            <w:tcW w:w="2880" w:type="dxa"/>
+            <w:tcMar>
+              <w:top w:w="360" w:type="dxa"/>
+              <w:left w:w="115" w:type="dxa"/>
+              <w:right w:w="115" w:type="dxa"/>
+            </w:tcMar>
+          </w:tcPr>
+          <w:p>
+            <w:pPr>
+              <w:pStyle w:val="Heading2"/>
+              <w:outlineLvl w:val="1"/>
+            </w:pPr>
+            <w:r>
+              <w:t>{{ get_help.subject }}</w:t>
             </w:r>
           </w:p>
         </w:tc>
@@ -10050,16 +10150,22 @@
       <w:spacing w:before="0" w:beforeAutospacing="0" w:after="0" w:afterAutospacing="0"/>
     </w:pPr>
     <w:r>
-      <w:t>June</w:t>
+      <w:t>Ju</w:t>
+    </w:r>
+    <w:r>
+      <w:t>ly</w:t>
     </w:r>
     <w:r>
       <w:t xml:space="preserve"> </w:t>
     </w:r>
     <w:r>
-      <w:t>10</w:t>
+      <w:t>23</w:t>
     </w:r>
     <w:r>
-      <w:t>, 2025</w:t>
+      <w:t>, 202</w:t>
+    </w:r>
+    <w:r>
+      <w:t>6</w:t>
     </w:r>
   </w:p>
 </w:ftr>

</xml_diff>

<commit_message>
added contact_other_parent_content include in docx - not sure why it wasn't there, but it's working
</commit_message>
<xml_diff>
--- a/docassemble/ChangingDivorceOrder/data/templates/changing_divorce_order_action_plan.docx
+++ b/docassemble/ChangingDivorceOrder/data/templates/changing_divorce_order_action_plan.docx
@@ -11367,14 +11367,14 @@
               </w:rPr>
               <w:t xml:space="preserve">not </w:t>
             </w:r>
-            <w:bookmarkStart w:id="1" w:name="_GoBack"/>
-            <w:bookmarkEnd w:id="1"/>
+            <w:proofErr w:type="spellStart"/>
             <w:r>
               <w:rPr>
                 <w:shd w:val="clear" w:color="auto" w:fill="FFFFFF"/>
               </w:rPr>
               <w:t>parents_agree</w:t>
             </w:r>
+            <w:proofErr w:type="spellEnd"/>
             <w:r>
               <w:rPr>
                 <w:color w:val="FFC000"/>
@@ -13718,22 +13718,23 @@
           <w:p>
             <w:pPr>
               <w:pStyle w:val="Body"/>
-              <w:spacing w:before="0" w:after="60"/>
             </w:pPr>
           </w:p>
           <w:p>
             <w:pPr>
               <w:pStyle w:val="Body"/>
-              <w:rPr>
-                <w:color w:val="FF00FF"/>
-              </w:rPr>
-            </w:pPr>
-            <w:r>
-              <w:rPr>
-                <w:color w:val="FF00FF"/>
-              </w:rPr>
+            </w:pPr>
+            <w:r>
+              <w:t>{{p (include_docx_template("docassemble.AKA2JBranding:</w:t>
+            </w:r>
+            <w:r>
               <w:t>contact_other_party_content.docx</w:t>
             </w:r>
+            <w:r>
+              <w:t>")) }}</w:t>
+            </w:r>
+            <w:bookmarkStart w:id="1" w:name="_GoBack"/>
+            <w:bookmarkEnd w:id="1"/>
           </w:p>
         </w:tc>
       </w:tr>
@@ -13806,7 +13807,6 @@
           <w:p>
             <w:pPr>
               <w:pStyle w:val="Body"/>
-              <w:spacing w:before="0" w:after="60"/>
             </w:pPr>
           </w:p>
           <w:p>
@@ -13814,13 +13814,7 @@
               <w:pStyle w:val="Body"/>
             </w:pPr>
             <w:r>
-              <w:t>{{p (include_docx_template("docassemble.AKA2JBranding:</w:t>
-            </w:r>
-            <w:r>
-              <w:t>file_agreement</w:t>
-            </w:r>
-            <w:r>
-              <w:t xml:space="preserve">_content.docx")) </w:t>
+              <w:t xml:space="preserve">{{p (include_docx_template("docassemble.AKA2JBranding:file_agreement_content.docx")) </w:t>
             </w:r>
             <w:r>
               <w:t>}</w:t>
@@ -14769,7 +14763,7 @@
       <w:rPr>
         <w:noProof/>
       </w:rPr>
-      <w:t>12</w:t>
+      <w:t>16</w:t>
     </w:r>
     <w:r>
       <w:fldChar w:fldCharType="end"/>
@@ -21430,7 +21424,7 @@
 </file>
 
 <file path=customXml/itemProps1.xml><?xml version="1.0" encoding="utf-8"?>
-<ds:datastoreItem xmlns:ds="http://schemas.openxmlformats.org/officeDocument/2006/customXml" ds:itemID="{984ECF5D-F9C8-41DC-9457-D103509902DC}">
+<ds:datastoreItem xmlns:ds="http://schemas.openxmlformats.org/officeDocument/2006/customXml" ds:itemID="{07B4B706-4604-4A78-92EA-EACA13EE95A3}">
   <ds:schemaRefs>
     <ds:schemaRef ds:uri="http://schemas.openxmlformats.org/officeDocument/2006/bibliography"/>
   </ds:schemaRefs>

</xml_diff>

<commit_message>
fixed standing_order_step.subject heading in docx template to change_standing_order_step.subject
</commit_message>
<xml_diff>
--- a/docassemble/ChangingDivorceOrder/data/templates/changing_divorce_order_action_plan.docx
+++ b/docassemble/ChangingDivorceOrder/data/templates/changing_divorce_order_action_plan.docx
@@ -338,21 +338,7 @@
               <w:rPr>
                 <w:color w:val="FF0000"/>
               </w:rPr>
-              <w:t xml:space="preserve">) and </w:t>
-            </w:r>
-            <w:proofErr w:type="spellStart"/>
-            <w:r>
-              <w:rPr>
-                <w:color w:val="FF0000"/>
-              </w:rPr>
-              <w:t>type_of_final_order.all_true</w:t>
-            </w:r>
-            <w:proofErr w:type="spellEnd"/>
-            <w:r>
-              <w:rPr>
-                <w:color w:val="FF0000"/>
-              </w:rPr>
-              <w:t>(</w:t>
+              <w:t>) and type_of_final_order.all_true(</w:t>
             </w:r>
             <w:r>
               <w:rPr>
@@ -1179,15 +1165,7 @@
               <w:t xml:space="preserve"> </w:t>
             </w:r>
             <w:r>
-              <w:t xml:space="preserve">{{ </w:t>
-            </w:r>
-            <w:proofErr w:type="spellStart"/>
-            <w:r>
-              <w:t>step_list</w:t>
-            </w:r>
-            <w:proofErr w:type="spellEnd"/>
-            <w:r>
-              <w:t xml:space="preserve"> | length }}</w:t>
+              <w:t>{{ step_list | length }}</w:t>
             </w:r>
             <w:r>
               <w:t xml:space="preserve"> </w:t>
@@ -1416,30 +1394,8 @@
               <w:rPr>
                 <w:color w:val="FF0000"/>
               </w:rPr>
-              <w:t>(</w:t>
-            </w:r>
-            <w:proofErr w:type="spellStart"/>
-            <w:r>
-              <w:rPr>
-                <w:color w:val="FF0000"/>
-              </w:rPr>
-              <w:t>unknown_final_date.true_values</w:t>
-            </w:r>
-            <w:proofErr w:type="spellEnd"/>
-            <w:r>
-              <w:rPr>
-                <w:color w:val="FF0000"/>
-              </w:rPr>
-              <w:t>())|</w:t>
-            </w:r>
-            <w:proofErr w:type="spellStart"/>
-            <w:r>
-              <w:rPr>
-                <w:color w:val="FF0000"/>
-              </w:rPr>
-              <w:t>list|length</w:t>
-            </w:r>
-            <w:proofErr w:type="spellEnd"/>
+              <w:t>(unknown_final_date.true_values())|list|length</w:t>
+            </w:r>
             <w:r>
               <w:rPr>
                 <w:color w:val="FF0000"/>
@@ -1497,11 +1453,9 @@
             <w:pPr>
               <w:pStyle w:val="Body"/>
             </w:pPr>
-            <w:proofErr w:type="spellStart"/>
             <w:r>
               <w:t>pick_a_step_step</w:t>
             </w:r>
-            <w:proofErr w:type="spellEnd"/>
             <w:r>
               <w:t xml:space="preserve"> in </w:t>
             </w:r>
@@ -1533,18 +1487,10 @@
               <w:t>{{</w:t>
             </w:r>
             <w:r>
-              <w:t xml:space="preserve"> </w:t>
-            </w:r>
-            <w:proofErr w:type="spellStart"/>
-            <w:r>
-              <w:t>pick_a_step</w:t>
-            </w:r>
-            <w:r>
-              <w:t>_step.subject</w:t>
-            </w:r>
-            <w:proofErr w:type="spellEnd"/>
-            <w:r>
-              <w:t xml:space="preserve"> }}</w:t>
+              <w:t xml:space="preserve"> pick_a_step</w:t>
+            </w:r>
+            <w:r>
+              <w:t>_step.subject }}</w:t>
             </w:r>
           </w:p>
         </w:tc>
@@ -1718,22 +1664,18 @@
             <w:pPr>
               <w:pStyle w:val="Body"/>
             </w:pPr>
-            <w:proofErr w:type="spellStart"/>
             <w:r>
               <w:t>parents_agree_step</w:t>
             </w:r>
-            <w:proofErr w:type="spellEnd"/>
             <w:r>
               <w:t xml:space="preserve"> and</w:t>
             </w:r>
             <w:r>
               <w:br/>
             </w:r>
-            <w:proofErr w:type="spellStart"/>
             <w:r>
               <w:t>tell_the_court_step</w:t>
             </w:r>
-            <w:proofErr w:type="spellEnd"/>
             <w:r>
               <w:t xml:space="preserve"> </w:t>
             </w:r>
@@ -1778,15 +1720,7 @@
               <w:outlineLvl w:val="1"/>
             </w:pPr>
             <w:r>
-              <w:t xml:space="preserve">{{ </w:t>
-            </w:r>
-            <w:proofErr w:type="spellStart"/>
-            <w:r>
-              <w:t>parents_agree_step.subject</w:t>
-            </w:r>
-            <w:proofErr w:type="spellEnd"/>
-            <w:r>
-              <w:t xml:space="preserve"> }}</w:t>
+              <w:t>{{ parents_agree_step.subject }}</w:t>
             </w:r>
           </w:p>
         </w:tc>
@@ -1841,21 +1775,13 @@
             </w:pPr>
             <w:r>
               <w:lastRenderedPageBreak/>
-              <w:t xml:space="preserve">{{ </w:t>
-            </w:r>
-            <w:proofErr w:type="spellStart"/>
-            <w:r>
-              <w:t>tell_the_court_</w:t>
+              <w:t>{{ tell_the_court_</w:t>
             </w:r>
             <w:r>
               <w:t>step.</w:t>
             </w:r>
             <w:r>
-              <w:t>subject</w:t>
-            </w:r>
-            <w:proofErr w:type="spellEnd"/>
-            <w:r>
-              <w:t xml:space="preserve"> }}</w:t>
+              <w:t>subject }}</w:t>
             </w:r>
           </w:p>
         </w:tc>
@@ -2098,11 +2024,9 @@
             <w:pPr>
               <w:pStyle w:val="Body"/>
             </w:pPr>
-            <w:proofErr w:type="spellStart"/>
             <w:r>
               <w:t>foreign_order_step</w:t>
             </w:r>
-            <w:proofErr w:type="spellEnd"/>
             <w:r>
               <w:t xml:space="preserve"> in </w:t>
             </w:r>
@@ -2114,11 +2038,9 @@
             <w:pPr>
               <w:pStyle w:val="Body"/>
             </w:pPr>
-            <w:proofErr w:type="spellStart"/>
             <w:r>
               <w:t>ak_jurisdiction_step</w:t>
             </w:r>
-            <w:proofErr w:type="spellEnd"/>
             <w:r>
               <w:t xml:space="preserve"> in </w:t>
             </w:r>
@@ -2130,19 +2052,11 @@
             <w:pPr>
               <w:pStyle w:val="Body"/>
             </w:pPr>
-            <w:proofErr w:type="spellStart"/>
             <w:r>
               <w:rPr>
                 <w:color w:val="FF66FF"/>
               </w:rPr>
-              <w:t>register_order_step</w:t>
-            </w:r>
-            <w:proofErr w:type="spellEnd"/>
-            <w:r>
-              <w:rPr>
-                <w:color w:val="FF66FF"/>
-              </w:rPr>
-              <w:t xml:space="preserve"> in aka2j_mod_cust_div_templates.yml</w:t>
+              <w:t>register_order_step in aka2j_mod_cust_div_templates.yml</w:t>
             </w:r>
           </w:p>
         </w:tc>
@@ -2171,16 +2085,11 @@
             <w:r>
               <w:t xml:space="preserve">{{ </w:t>
             </w:r>
-            <w:proofErr w:type="spellStart"/>
             <w:r>
               <w:t>foreign_order_step</w:t>
             </w:r>
             <w:r>
-              <w:t>.subject</w:t>
-            </w:r>
-            <w:proofErr w:type="spellEnd"/>
-            <w:r>
-              <w:t xml:space="preserve"> }}</w:t>
+              <w:t>.subject }}</w:t>
             </w:r>
           </w:p>
         </w:tc>
@@ -2235,7 +2144,6 @@
               </w:rPr>
               <w:t xml:space="preserve">{{ </w:t>
             </w:r>
-            <w:proofErr w:type="spellStart"/>
             <w:r>
               <w:rPr>
                 <w:shd w:val="clear" w:color="auto" w:fill="FFFFFF"/>
@@ -2246,14 +2154,7 @@
               <w:rPr>
                 <w:shd w:val="clear" w:color="auto" w:fill="FFFFFF"/>
               </w:rPr>
-              <w:t>.subject</w:t>
-            </w:r>
-            <w:proofErr w:type="spellEnd"/>
-            <w:r>
-              <w:rPr>
-                <w:shd w:val="clear" w:color="auto" w:fill="FFFFFF"/>
-              </w:rPr>
-              <w:t xml:space="preserve"> }}</w:t>
+              <w:t>.subject }}</w:t>
             </w:r>
           </w:p>
         </w:tc>
@@ -2318,7 +2219,6 @@
               </w:rPr>
               <w:t xml:space="preserve">{{ </w:t>
             </w:r>
-            <w:proofErr w:type="spellStart"/>
             <w:r>
               <w:rPr>
                 <w:shd w:val="clear" w:color="auto" w:fill="FFFFFF"/>
@@ -2329,14 +2229,7 @@
               <w:rPr>
                 <w:shd w:val="clear" w:color="auto" w:fill="FFFFFF"/>
               </w:rPr>
-              <w:t>.subject</w:t>
-            </w:r>
-            <w:proofErr w:type="spellEnd"/>
-            <w:r>
-              <w:rPr>
-                <w:shd w:val="clear" w:color="auto" w:fill="FFFFFF"/>
-              </w:rPr>
-              <w:t xml:space="preserve"> }}</w:t>
+              <w:t>.subject }}</w:t>
             </w:r>
           </w:p>
         </w:tc>
@@ -3035,12 +2928,10 @@
             <w:pPr>
               <w:pStyle w:val="Body"/>
             </w:pPr>
-            <w:proofErr w:type="spellStart"/>
             <w:r>
               <w:lastRenderedPageBreak/>
               <w:t>modify_step</w:t>
             </w:r>
-            <w:proofErr w:type="spellEnd"/>
             <w:r>
               <w:t xml:space="preserve"> in </w:t>
             </w:r>
@@ -3075,21 +2966,7 @@
               <w:rPr>
                 <w:shd w:val="clear" w:color="auto" w:fill="FFFFFF"/>
               </w:rPr>
-              <w:t xml:space="preserve">{{ </w:t>
-            </w:r>
-            <w:proofErr w:type="spellStart"/>
-            <w:r>
-              <w:rPr>
-                <w:shd w:val="clear" w:color="auto" w:fill="FFFFFF"/>
-              </w:rPr>
-              <w:t>modify_step.subject</w:t>
-            </w:r>
-            <w:proofErr w:type="spellEnd"/>
-            <w:r>
-              <w:rPr>
-                <w:shd w:val="clear" w:color="auto" w:fill="FFFFFF"/>
-              </w:rPr>
-              <w:t xml:space="preserve"> }}</w:t>
+              <w:t>{{ modify_step.subject }}</w:t>
             </w:r>
           </w:p>
         </w:tc>
@@ -3386,11 +3263,9 @@
             <w:pPr>
               <w:pStyle w:val="Body"/>
             </w:pPr>
-            <w:proofErr w:type="spellStart"/>
             <w:r>
               <w:t>fill_modify_step</w:t>
             </w:r>
-            <w:proofErr w:type="spellEnd"/>
             <w:r>
               <w:t xml:space="preserve"> in </w:t>
             </w:r>
@@ -3402,16 +3277,11 @@
             <w:pPr>
               <w:pStyle w:val="Body"/>
             </w:pPr>
-            <w:proofErr w:type="spellStart"/>
             <w:r>
               <w:t>calculate_child_support_</w:t>
             </w:r>
             <w:r>
-              <w:t>step</w:t>
-            </w:r>
-            <w:proofErr w:type="spellEnd"/>
-            <w:r>
-              <w:t xml:space="preserve"> in </w:t>
+              <w:t xml:space="preserve">step in </w:t>
             </w:r>
             <w:r>
               <w:t>aka2j_templates.yml</w:t>
@@ -3444,21 +3314,7 @@
               <w:rPr>
                 <w:shd w:val="clear" w:color="auto" w:fill="FFFFFF"/>
               </w:rPr>
-              <w:t xml:space="preserve">{{ </w:t>
-            </w:r>
-            <w:proofErr w:type="spellStart"/>
-            <w:r>
-              <w:rPr>
-                <w:shd w:val="clear" w:color="auto" w:fill="FFFFFF"/>
-              </w:rPr>
-              <w:t>fill_modify_step.subject</w:t>
-            </w:r>
-            <w:proofErr w:type="spellEnd"/>
-            <w:r>
-              <w:rPr>
-                <w:shd w:val="clear" w:color="auto" w:fill="FFFFFF"/>
-              </w:rPr>
-              <w:t xml:space="preserve"> }}</w:t>
+              <w:t>{{ fill_modify_step.subject }}</w:t>
             </w:r>
           </w:p>
         </w:tc>
@@ -3524,14 +3380,12 @@
               <w:lastRenderedPageBreak/>
               <w:t xml:space="preserve">{{ </w:t>
             </w:r>
-            <w:proofErr w:type="spellStart"/>
             <w:r>
               <w:t>calculate_child_support_</w:t>
             </w:r>
             <w:r>
               <w:t>step.subject</w:t>
             </w:r>
-            <w:proofErr w:type="spellEnd"/>
             <w:r>
               <w:rPr>
                 <w:shd w:val="clear" w:color="auto" w:fill="FFFFFF"/>
@@ -3712,7 +3566,6 @@
             <w:pPr>
               <w:pStyle w:val="Body"/>
             </w:pPr>
-            <w:proofErr w:type="spellStart"/>
             <w:r>
               <w:t>dont_wait_modify_</w:t>
             </w:r>
@@ -3722,7 +3575,6 @@
             <w:r>
               <w:t>_step</w:t>
             </w:r>
-            <w:proofErr w:type="spellEnd"/>
             <w:r>
               <w:t xml:space="preserve"> in </w:t>
             </w:r>
@@ -4113,7 +3965,6 @@
             <w:r>
               <w:t xml:space="preserve">{{ </w:t>
             </w:r>
-            <w:proofErr w:type="spellStart"/>
             <w:r>
               <w:t>dont_wait_modify_custody_divor</w:t>
             </w:r>
@@ -4122,11 +3973,7 @@
               <w:t>ce_step</w:t>
             </w:r>
             <w:r>
-              <w:t>.subject</w:t>
-            </w:r>
-            <w:proofErr w:type="spellEnd"/>
-            <w:r>
-              <w:t xml:space="preserve"> }}</w:t>
+              <w:t>.subject }}</w:t>
             </w:r>
           </w:p>
         </w:tc>
@@ -4642,11 +4489,9 @@
             <w:pPr>
               <w:pStyle w:val="Body"/>
             </w:pPr>
-            <w:proofErr w:type="spellStart"/>
             <w:r>
               <w:t>modify_divorce_step</w:t>
             </w:r>
-            <w:proofErr w:type="spellEnd"/>
           </w:p>
         </w:tc>
       </w:tr>
@@ -4669,15 +4514,7 @@
               <w:outlineLvl w:val="1"/>
             </w:pPr>
             <w:r>
-              <w:t xml:space="preserve">{{ </w:t>
-            </w:r>
-            <w:proofErr w:type="spellStart"/>
-            <w:r>
-              <w:t>modify_divorce_step.subject</w:t>
-            </w:r>
-            <w:proofErr w:type="spellEnd"/>
-            <w:r>
-              <w:t xml:space="preserve"> }}</w:t>
+              <w:t>{{ modify_divorce_step.subject }}</w:t>
             </w:r>
           </w:p>
         </w:tc>
@@ -5715,11 +5552,9 @@
             <w:pPr>
               <w:pStyle w:val="Body"/>
             </w:pPr>
-            <w:proofErr w:type="spellStart"/>
             <w:r>
               <w:t>fill_modify_divorce_step</w:t>
             </w:r>
-            <w:proofErr w:type="spellEnd"/>
           </w:p>
         </w:tc>
       </w:tr>
@@ -5743,15 +5578,7 @@
             </w:pPr>
             <w:r>
               <w:lastRenderedPageBreak/>
-              <w:t xml:space="preserve">{{ </w:t>
-            </w:r>
-            <w:proofErr w:type="spellStart"/>
-            <w:r>
-              <w:t>fill_modify_divorce_step.subject</w:t>
-            </w:r>
-            <w:proofErr w:type="spellEnd"/>
-            <w:r>
-              <w:t xml:space="preserve"> }}</w:t>
+              <w:t>{{ fill_modify_divorce_step.subject }}</w:t>
             </w:r>
           </w:p>
         </w:tc>
@@ -6606,23 +6433,7 @@
                   <w:rStyle w:val="Hyperlink"/>
                   <w:spacing w:val="0"/>
                 </w:rPr>
-                <w:t>youtube.com/</w:t>
-              </w:r>
-              <w:proofErr w:type="spellStart"/>
-              <w:r>
-                <w:rPr>
-                  <w:rStyle w:val="Hyperlink"/>
-                  <w:spacing w:val="0"/>
-                </w:rPr>
-                <w:t>watch?v</w:t>
-              </w:r>
-              <w:proofErr w:type="spellEnd"/>
-              <w:r>
-                <w:rPr>
-                  <w:rStyle w:val="Hyperlink"/>
-                  <w:spacing w:val="0"/>
-                </w:rPr>
-                <w:t>=2irmxT0_0EA</w:t>
+                <w:t>youtube.com/watch?v=2irmxT0_0EA</w:t>
               </w:r>
             </w:hyperlink>
           </w:p>
@@ -6780,20 +6591,16 @@
             <w:pPr>
               <w:pStyle w:val="Body"/>
             </w:pPr>
-            <w:proofErr w:type="spellStart"/>
             <w:r>
               <w:lastRenderedPageBreak/>
               <w:t>learn_reconsider_step</w:t>
             </w:r>
-            <w:proofErr w:type="spellEnd"/>
             <w:r>
               <w:t xml:space="preserve"> and </w:t>
             </w:r>
-            <w:proofErr w:type="spellStart"/>
             <w:r>
               <w:t>fill_reconsider_step</w:t>
             </w:r>
-            <w:proofErr w:type="spellEnd"/>
             <w:r>
               <w:t xml:space="preserve"> in </w:t>
             </w:r>
@@ -6826,16 +6633,11 @@
               <w:lastRenderedPageBreak/>
               <w:t xml:space="preserve">{{ </w:t>
             </w:r>
-            <w:proofErr w:type="spellStart"/>
             <w:r>
               <w:t>learn_reconsider_step</w:t>
             </w:r>
             <w:r>
-              <w:t>.subject</w:t>
-            </w:r>
-            <w:proofErr w:type="spellEnd"/>
-            <w:r>
-              <w:t xml:space="preserve"> }}</w:t>
+              <w:t>.subject }}</w:t>
             </w:r>
           </w:p>
           <w:p/>
@@ -6893,21 +6695,13 @@
               <w:outlineLvl w:val="1"/>
             </w:pPr>
             <w:r>
-              <w:t xml:space="preserve">{{ </w:t>
-            </w:r>
-            <w:proofErr w:type="spellStart"/>
-            <w:r>
-              <w:t>fill</w:t>
+              <w:t>{{ fill</w:t>
             </w:r>
             <w:r>
               <w:t>_reconsider_step</w:t>
             </w:r>
             <w:r>
-              <w:t>.subject</w:t>
-            </w:r>
-            <w:proofErr w:type="spellEnd"/>
-            <w:r>
-              <w:t xml:space="preserve"> }}</w:t>
+              <w:t>.subject }}</w:t>
             </w:r>
           </w:p>
         </w:tc>
@@ -7141,14 +6935,12 @@
             <w:pPr>
               <w:pStyle w:val="Body"/>
             </w:pPr>
-            <w:proofErr w:type="spellStart"/>
             <w:r>
               <w:t>change_</w:t>
             </w:r>
             <w:r>
               <w:t>standing_order_step</w:t>
             </w:r>
-            <w:proofErr w:type="spellEnd"/>
             <w:r>
               <w:t xml:space="preserve"> in </w:t>
             </w:r>
@@ -7183,7 +6975,19 @@
               <w:rPr>
                 <w:shd w:val="clear" w:color="auto" w:fill="FFFFFF"/>
               </w:rPr>
-              <w:t>{{ standing_order_step.subject</w:t>
+              <w:t xml:space="preserve">{{ </w:t>
+            </w:r>
+            <w:r>
+              <w:rPr>
+                <w:shd w:val="clear" w:color="auto" w:fill="FFFFFF"/>
+              </w:rPr>
+              <w:t>change_</w:t>
+            </w:r>
+            <w:r>
+              <w:rPr>
+                <w:shd w:val="clear" w:color="auto" w:fill="FFFFFF"/>
+              </w:rPr>
+              <w:t>standing_order_step.subject</w:t>
             </w:r>
             <w:r>
               <w:rPr>
@@ -7427,6 +7231,7 @@
               <w:rPr>
                 <w:shd w:val="clear" w:color="auto" w:fill="FFFFFF"/>
               </w:rPr>
+              <w:lastRenderedPageBreak/>
               <w:t>(</w:t>
             </w:r>
             <w:r>
@@ -7445,7 +7250,6 @@
               <w:rPr>
                 <w:shd w:val="clear" w:color="auto" w:fill="FFFFFF"/>
               </w:rPr>
-              <w:lastRenderedPageBreak/>
               <w:t>==</w:t>
             </w:r>
             <w:r>
@@ -8155,20 +7959,28 @@
                 <w:color w:val="00B0F0"/>
                 <w:shd w:val="clear" w:color="auto" w:fill="FFFFFF"/>
               </w:rPr>
-              <w:t xml:space="preserve">] and why_change_divorce_order == </w:t>
+              <w:t>] and why_change_divorce_or</w:t>
             </w:r>
             <w:r>
               <w:rPr>
                 <w:color w:val="00B0F0"/>
                 <w:shd w:val="clear" w:color="auto" w:fill="FFFFFF"/>
               </w:rPr>
-              <w:t>'</w:t>
+              <w:lastRenderedPageBreak/>
+              <w:t xml:space="preserve">der == </w:t>
             </w:r>
             <w:r>
               <w:rPr>
                 <w:color w:val="00B0F0"/>
                 <w:shd w:val="clear" w:color="auto" w:fill="FFFFFF"/>
               </w:rPr>
+              <w:t>'</w:t>
+            </w:r>
+            <w:r>
+              <w:rPr>
+                <w:color w:val="00B0F0"/>
+                <w:shd w:val="clear" w:color="auto" w:fill="FFFFFF"/>
+              </w:rPr>
               <w:t>problem</w:t>
             </w:r>
             <w:r>
@@ -8183,15 +7995,7 @@
                 <w:color w:val="00B050"/>
                 <w:shd w:val="clear" w:color="auto" w:fill="FFFFFF"/>
               </w:rPr>
-              <w:t xml:space="preserve">) or </w:t>
-            </w:r>
-            <w:r>
-              <w:rPr>
-                <w:color w:val="00B050"/>
-                <w:shd w:val="clear" w:color="auto" w:fill="FFFFFF"/>
-              </w:rPr>
-              <w:lastRenderedPageBreak/>
-              <w:t>type_of_final_order[</w:t>
+              <w:t>) or type_of_final_order[</w:t>
             </w:r>
             <w:r>
               <w:rPr>
@@ -8717,19 +8521,11 @@
               </w:rPr>
               <w:t>(</w:t>
             </w:r>
-            <w:proofErr w:type="spellStart"/>
             <w:r>
               <w:rPr>
                 <w:color w:val="00B050"/>
               </w:rPr>
-              <w:t>final_order_period</w:t>
-            </w:r>
-            <w:proofErr w:type="spellEnd"/>
-            <w:r>
-              <w:rPr>
-                <w:color w:val="00B050"/>
-              </w:rPr>
-              <w:t xml:space="preserve"> </w:t>
+              <w:t xml:space="preserve">final_order_period </w:t>
             </w:r>
             <w:r>
               <w:rPr>
@@ -11070,16 +10866,11 @@
               <w:lastRenderedPageBreak/>
               <w:t xml:space="preserve">{{ </w:t>
             </w:r>
-            <w:proofErr w:type="spellStart"/>
             <w:r>
               <w:t>expect_after_motion_or_answer</w:t>
             </w:r>
             <w:r>
-              <w:t>_step.subject</w:t>
-            </w:r>
-            <w:proofErr w:type="spellEnd"/>
-            <w:r>
-              <w:t xml:space="preserve"> }}</w:t>
+              <w:t>_step.subject }}</w:t>
             </w:r>
           </w:p>
         </w:tc>
@@ -11244,11 +11035,9 @@
             <w:pPr>
               <w:pStyle w:val="Body"/>
             </w:pPr>
-            <w:proofErr w:type="spellStart"/>
             <w:r>
               <w:t>expect_reconsider_step</w:t>
             </w:r>
-            <w:proofErr w:type="spellEnd"/>
             <w:r>
               <w:t xml:space="preserve"> in </w:t>
             </w:r>
@@ -11279,16 +11068,11 @@
             <w:r>
               <w:t xml:space="preserve">{{ </w:t>
             </w:r>
-            <w:proofErr w:type="spellStart"/>
             <w:r>
               <w:t>expect_reconsider_step</w:t>
             </w:r>
             <w:r>
-              <w:t>.subject</w:t>
-            </w:r>
-            <w:proofErr w:type="spellEnd"/>
-            <w:r>
-              <w:t xml:space="preserve"> }}</w:t>
+              <w:t>.subject }}</w:t>
             </w:r>
           </w:p>
         </w:tc>
@@ -11483,14 +11267,12 @@
                 <w:shd w:val="clear" w:color="auto" w:fill="FFFFFF"/>
               </w:rPr>
             </w:pPr>
-            <w:proofErr w:type="spellStart"/>
             <w:r>
               <w:rPr>
                 <w:shd w:val="clear" w:color="auto" w:fill="FFFFFF"/>
               </w:rPr>
               <w:t>expect_after_response_step</w:t>
             </w:r>
-            <w:proofErr w:type="spellEnd"/>
             <w:r>
               <w:rPr>
                 <w:shd w:val="clear" w:color="auto" w:fill="FFFFFF"/>
@@ -11533,7 +11315,6 @@
               </w:rPr>
               <w:t xml:space="preserve">{{ </w:t>
             </w:r>
-            <w:proofErr w:type="spellStart"/>
             <w:r>
               <w:rPr>
                 <w:shd w:val="clear" w:color="auto" w:fill="FFFFFF"/>
@@ -11546,7 +11327,6 @@
               </w:rPr>
               <w:t>.subject</w:t>
             </w:r>
-            <w:proofErr w:type="spellEnd"/>
             <w:r>
               <w:rPr>
                 <w:shd w:val="clear" w:color="auto" w:fill="FFFFFF"/>
@@ -11813,7 +11593,6 @@
               </w:rPr>
               <w:t xml:space="preserve"> </w:t>
             </w:r>
-            <w:proofErr w:type="spellStart"/>
             <w:r>
               <w:t>contact_other_party_ste</w:t>
             </w:r>
@@ -11826,7 +11605,6 @@
               </w:rPr>
               <w:t>.subject</w:t>
             </w:r>
-            <w:proofErr w:type="spellEnd"/>
             <w:r>
               <w:rPr>
                 <w:shd w:val="clear" w:color="auto" w:fill="FFFFFF"/>
@@ -12120,11 +11898,9 @@
             <w:pPr>
               <w:pStyle w:val="Body"/>
             </w:pPr>
-            <w:proofErr w:type="spellStart"/>
             <w:r>
               <w:t>appeal_response_step</w:t>
             </w:r>
-            <w:proofErr w:type="spellEnd"/>
             <w:r>
               <w:t xml:space="preserve"> in </w:t>
             </w:r>
@@ -12457,14 +12233,12 @@
               </w:rPr>
               <w:t xml:space="preserve">{{ </w:t>
             </w:r>
-            <w:proofErr w:type="spellStart"/>
             <w:r>
               <w:t>tell_supreme_court_step</w:t>
             </w:r>
             <w:r>
               <w:t>.subject</w:t>
             </w:r>
-            <w:proofErr w:type="spellEnd"/>
             <w:r>
               <w:rPr>
                 <w:shd w:val="clear" w:color="auto" w:fill="FFFFFF"/>
@@ -12553,13 +12327,8 @@
             <w:pPr>
               <w:pStyle w:val="Body"/>
             </w:pPr>
-            <w:proofErr w:type="spellStart"/>
-            <w:r>
-              <w:t>get_help</w:t>
-            </w:r>
-            <w:proofErr w:type="spellEnd"/>
-            <w:r>
-              <w:t xml:space="preserve"> in </w:t>
+            <w:r>
+              <w:t xml:space="preserve">get_help in </w:t>
             </w:r>
             <w:r>
               <w:t>aka2j_templates.yml</w:t>
@@ -12586,15 +12355,7 @@
               <w:outlineLvl w:val="1"/>
             </w:pPr>
             <w:r>
-              <w:t xml:space="preserve">{{ </w:t>
-            </w:r>
-            <w:proofErr w:type="spellStart"/>
-            <w:r>
-              <w:t>get_help.subject</w:t>
-            </w:r>
-            <w:proofErr w:type="spellEnd"/>
-            <w:r>
-              <w:t xml:space="preserve"> }}</w:t>
+              <w:t>{{ get_help.subject }}</w:t>
             </w:r>
           </w:p>
         </w:tc>
@@ -12722,14 +12483,27 @@
     <w:r>
       <w:t xml:space="preserve"> of </w:t>
     </w:r>
-    <w:fldSimple w:instr=" NUMPAGES  \* Arabic  \* MERGEFORMAT ">
-      <w:r>
-        <w:rPr>
-          <w:noProof/>
-        </w:rPr>
-        <w:t>49</w:t>
-      </w:r>
-    </w:fldSimple>
+    <w:r>
+      <w:fldChar w:fldCharType="begin"/>
+    </w:r>
+    <w:r>
+      <w:instrText xml:space="preserve"> NUMPAGES  \* Arabic  \* MERGEFORMAT </w:instrText>
+    </w:r>
+    <w:r>
+      <w:fldChar w:fldCharType="separate"/>
+    </w:r>
+    <w:r>
+      <w:rPr>
+        <w:noProof/>
+      </w:rPr>
+      <w:t>49</w:t>
+    </w:r>
+    <w:r>
+      <w:rPr>
+        <w:noProof/>
+      </w:rPr>
+      <w:fldChar w:fldCharType="end"/>
+    </w:r>
     <w:r>
       <w:t xml:space="preserve"> pages</w:t>
     </w:r>
@@ -12740,10 +12514,7 @@
       <w:spacing w:before="0" w:beforeAutospacing="0" w:after="0" w:afterAutospacing="0"/>
     </w:pPr>
     <w:r>
-      <w:t xml:space="preserve">Aug </w:t>
-    </w:r>
-    <w:r>
-      <w:t>4</w:t>
+      <w:t>August 12</w:t>
     </w:r>
     <w:r>
       <w:t>, 202</w:t>

</xml_diff>

<commit_message>
Changed tests to take 'Custody' out of Motion to Modify Custody forms, when user wants to change both spousal support and custody orders, also updated heading in foreign tests to reflect tribal v. out of state court orders
</commit_message>
<xml_diff>
--- a/docassemble/ChangingDivorceOrder/data/templates/changing_divorce_order_action_plan.docx
+++ b/docassemble/ChangingDivorceOrder/data/templates/changing_divorce_order_action_plan.docx
@@ -338,7 +338,21 @@
               <w:rPr>
                 <w:color w:val="FF0000"/>
               </w:rPr>
-              <w:t>) and type_of_final_order.all_true(</w:t>
+              <w:t xml:space="preserve">) and </w:t>
+            </w:r>
+            <w:proofErr w:type="spellStart"/>
+            <w:r>
+              <w:rPr>
+                <w:color w:val="FF0000"/>
+              </w:rPr>
+              <w:t>type_of_final_order.all_true</w:t>
+            </w:r>
+            <w:proofErr w:type="spellEnd"/>
+            <w:r>
+              <w:rPr>
+                <w:color w:val="FF0000"/>
+              </w:rPr>
+              <w:t>(</w:t>
             </w:r>
             <w:r>
               <w:rPr>
@@ -1165,7 +1179,15 @@
               <w:t xml:space="preserve"> </w:t>
             </w:r>
             <w:r>
-              <w:t>{{ step_list | length }}</w:t>
+              <w:t xml:space="preserve">{{ </w:t>
+            </w:r>
+            <w:proofErr w:type="spellStart"/>
+            <w:r>
+              <w:t>step_list</w:t>
+            </w:r>
+            <w:proofErr w:type="spellEnd"/>
+            <w:r>
+              <w:t xml:space="preserve"> | length }}</w:t>
             </w:r>
             <w:r>
               <w:t xml:space="preserve"> </w:t>
@@ -1394,8 +1416,30 @@
               <w:rPr>
                 <w:color w:val="FF0000"/>
               </w:rPr>
-              <w:t>(unknown_final_date.true_values())|list|length</w:t>
-            </w:r>
+              <w:t>(</w:t>
+            </w:r>
+            <w:proofErr w:type="spellStart"/>
+            <w:r>
+              <w:rPr>
+                <w:color w:val="FF0000"/>
+              </w:rPr>
+              <w:t>unknown_final_date.true_values</w:t>
+            </w:r>
+            <w:proofErr w:type="spellEnd"/>
+            <w:r>
+              <w:rPr>
+                <w:color w:val="FF0000"/>
+              </w:rPr>
+              <w:t>())|</w:t>
+            </w:r>
+            <w:proofErr w:type="spellStart"/>
+            <w:r>
+              <w:rPr>
+                <w:color w:val="FF0000"/>
+              </w:rPr>
+              <w:t>list|length</w:t>
+            </w:r>
+            <w:proofErr w:type="spellEnd"/>
             <w:r>
               <w:rPr>
                 <w:color w:val="FF0000"/>
@@ -1453,9 +1497,11 @@
             <w:pPr>
               <w:pStyle w:val="Body"/>
             </w:pPr>
+            <w:proofErr w:type="spellStart"/>
             <w:r>
               <w:t>pick_a_step_step</w:t>
             </w:r>
+            <w:proofErr w:type="spellEnd"/>
             <w:r>
               <w:t xml:space="preserve"> in </w:t>
             </w:r>
@@ -1483,14 +1529,16 @@
               <w:pStyle w:val="Heading2"/>
               <w:outlineLvl w:val="1"/>
             </w:pPr>
-            <w:r>
-              <w:t>{{</w:t>
-            </w:r>
-            <w:r>
-              <w:t xml:space="preserve"> pick_a_step</w:t>
-            </w:r>
-            <w:r>
-              <w:t>_step.subject }}</w:t>
+            <w:proofErr w:type="spellStart"/>
+            <w:r>
+              <w:t>pick_a_step</w:t>
+            </w:r>
+            <w:r>
+              <w:t>_step.subject</w:t>
+            </w:r>
+            <w:proofErr w:type="spellEnd"/>
+            <w:r>
+              <w:t xml:space="preserve"> </w:t>
             </w:r>
           </w:p>
         </w:tc>
@@ -1664,18 +1712,22 @@
             <w:pPr>
               <w:pStyle w:val="Body"/>
             </w:pPr>
+            <w:proofErr w:type="spellStart"/>
             <w:r>
               <w:t>parents_agree_step</w:t>
             </w:r>
+            <w:proofErr w:type="spellEnd"/>
             <w:r>
               <w:t xml:space="preserve"> and</w:t>
             </w:r>
             <w:r>
               <w:br/>
             </w:r>
+            <w:proofErr w:type="spellStart"/>
             <w:r>
               <w:t>tell_the_court_step</w:t>
             </w:r>
+            <w:proofErr w:type="spellEnd"/>
             <w:r>
               <w:t xml:space="preserve"> </w:t>
             </w:r>
@@ -1719,8 +1771,13 @@
               <w:pStyle w:val="Heading2"/>
               <w:outlineLvl w:val="1"/>
             </w:pPr>
-            <w:r>
-              <w:t>{{ parents_agree_step.subject }}</w:t>
+            <w:proofErr w:type="spellStart"/>
+            <w:r>
+              <w:t>parents_agree_step.subject</w:t>
+            </w:r>
+            <w:proofErr w:type="spellEnd"/>
+            <w:r>
+              <w:t xml:space="preserve"> </w:t>
             </w:r>
           </w:p>
         </w:tc>
@@ -1773,16 +1830,18 @@
               <w:pStyle w:val="Heading2"/>
               <w:outlineLvl w:val="1"/>
             </w:pPr>
+            <w:proofErr w:type="spellStart"/>
             <w:r>
               <w:lastRenderedPageBreak/>
-              <w:t>{{ tell_the_court_</w:t>
+              <w:t>tell_the_court_</w:t>
             </w:r>
             <w:r>
               <w:t>step.</w:t>
             </w:r>
             <w:r>
-              <w:t>subject }}</w:t>
-            </w:r>
+              <w:t>subject</w:t>
+            </w:r>
+            <w:proofErr w:type="spellEnd"/>
           </w:p>
         </w:tc>
         <w:tc>
@@ -2024,9 +2083,11 @@
             <w:pPr>
               <w:pStyle w:val="Body"/>
             </w:pPr>
+            <w:proofErr w:type="spellStart"/>
             <w:r>
               <w:t>foreign_order_step</w:t>
             </w:r>
+            <w:proofErr w:type="spellEnd"/>
             <w:r>
               <w:t xml:space="preserve"> in </w:t>
             </w:r>
@@ -2038,9 +2099,11 @@
             <w:pPr>
               <w:pStyle w:val="Body"/>
             </w:pPr>
+            <w:proofErr w:type="spellStart"/>
             <w:r>
               <w:t>ak_jurisdiction_step</w:t>
             </w:r>
+            <w:proofErr w:type="spellEnd"/>
             <w:r>
               <w:t xml:space="preserve"> in </w:t>
             </w:r>
@@ -2082,15 +2145,14 @@
                 <w:shd w:val="clear" w:color="auto" w:fill="FFFFFF"/>
               </w:rPr>
             </w:pPr>
-            <w:r>
-              <w:t xml:space="preserve">{{ </w:t>
-            </w:r>
+            <w:proofErr w:type="spellStart"/>
             <w:r>
               <w:t>foreign_order_step</w:t>
             </w:r>
             <w:r>
-              <w:t>.subject }}</w:t>
-            </w:r>
+              <w:t>.subject</w:t>
+            </w:r>
+            <w:proofErr w:type="spellEnd"/>
           </w:p>
         </w:tc>
         <w:tc>
@@ -2138,12 +2200,7 @@
                 <w:shd w:val="clear" w:color="auto" w:fill="FFFFFF"/>
               </w:rPr>
             </w:pPr>
-            <w:r>
-              <w:rPr>
-                <w:shd w:val="clear" w:color="auto" w:fill="FFFFFF"/>
-              </w:rPr>
-              <w:t xml:space="preserve">{{ </w:t>
-            </w:r>
+            <w:proofErr w:type="spellStart"/>
             <w:r>
               <w:rPr>
                 <w:shd w:val="clear" w:color="auto" w:fill="FFFFFF"/>
@@ -2154,8 +2211,9 @@
               <w:rPr>
                 <w:shd w:val="clear" w:color="auto" w:fill="FFFFFF"/>
               </w:rPr>
-              <w:t>.subject }}</w:t>
-            </w:r>
+              <w:t>.subject</w:t>
+            </w:r>
+            <w:proofErr w:type="spellEnd"/>
           </w:p>
         </w:tc>
         <w:tc>
@@ -2213,12 +2271,7 @@
                 <w:shd w:val="clear" w:color="auto" w:fill="FFFFFF"/>
               </w:rPr>
             </w:pPr>
-            <w:r>
-              <w:rPr>
-                <w:shd w:val="clear" w:color="auto" w:fill="FFFFFF"/>
-              </w:rPr>
-              <w:t xml:space="preserve">{{ </w:t>
-            </w:r>
+            <w:proofErr w:type="spellStart"/>
             <w:r>
               <w:rPr>
                 <w:shd w:val="clear" w:color="auto" w:fill="FFFFFF"/>
@@ -2229,8 +2282,9 @@
               <w:rPr>
                 <w:shd w:val="clear" w:color="auto" w:fill="FFFFFF"/>
               </w:rPr>
-              <w:t>.subject }}</w:t>
-            </w:r>
+              <w:t>.subject</w:t>
+            </w:r>
+            <w:proofErr w:type="spellEnd"/>
           </w:p>
         </w:tc>
         <w:tc>
@@ -2928,10 +2982,12 @@
             <w:pPr>
               <w:pStyle w:val="Body"/>
             </w:pPr>
+            <w:proofErr w:type="spellStart"/>
             <w:r>
               <w:lastRenderedPageBreak/>
               <w:t>modify_step</w:t>
             </w:r>
+            <w:proofErr w:type="spellEnd"/>
             <w:r>
               <w:t xml:space="preserve"> in </w:t>
             </w:r>
@@ -2962,12 +3018,14 @@
                 <w:shd w:val="clear" w:color="auto" w:fill="FFFFFF"/>
               </w:rPr>
             </w:pPr>
-            <w:r>
-              <w:rPr>
-                <w:shd w:val="clear" w:color="auto" w:fill="FFFFFF"/>
-              </w:rPr>
-              <w:t>{{ modify_step.subject }}</w:t>
-            </w:r>
+            <w:proofErr w:type="spellStart"/>
+            <w:r>
+              <w:rPr>
+                <w:shd w:val="clear" w:color="auto" w:fill="FFFFFF"/>
+              </w:rPr>
+              <w:t>modify_step.subject</w:t>
+            </w:r>
+            <w:proofErr w:type="spellEnd"/>
           </w:p>
         </w:tc>
         <w:tc>
@@ -3263,9 +3321,11 @@
             <w:pPr>
               <w:pStyle w:val="Body"/>
             </w:pPr>
+            <w:proofErr w:type="spellStart"/>
             <w:r>
               <w:t>fill_modify_step</w:t>
             </w:r>
+            <w:proofErr w:type="spellEnd"/>
             <w:r>
               <w:t xml:space="preserve"> in </w:t>
             </w:r>
@@ -3277,11 +3337,16 @@
             <w:pPr>
               <w:pStyle w:val="Body"/>
             </w:pPr>
+            <w:proofErr w:type="spellStart"/>
             <w:r>
               <w:t>calculate_child_support_</w:t>
             </w:r>
             <w:r>
-              <w:t xml:space="preserve">step in </w:t>
+              <w:t>step</w:t>
+            </w:r>
+            <w:proofErr w:type="spellEnd"/>
+            <w:r>
+              <w:t xml:space="preserve"> in </w:t>
             </w:r>
             <w:r>
               <w:t>aka2j_templates.yml</w:t>
@@ -3310,12 +3375,14 @@
                 <w:shd w:val="clear" w:color="auto" w:fill="FFFFFF"/>
               </w:rPr>
             </w:pPr>
-            <w:r>
-              <w:rPr>
-                <w:shd w:val="clear" w:color="auto" w:fill="FFFFFF"/>
-              </w:rPr>
-              <w:t>{{ fill_modify_step.subject }}</w:t>
-            </w:r>
+            <w:proofErr w:type="spellStart"/>
+            <w:r>
+              <w:rPr>
+                <w:shd w:val="clear" w:color="auto" w:fill="FFFFFF"/>
+              </w:rPr>
+              <w:t>fill_modify_step.subject</w:t>
+            </w:r>
+            <w:proofErr w:type="spellEnd"/>
           </w:p>
         </w:tc>
         <w:tc>
@@ -3373,25 +3440,15 @@
                 <w:shd w:val="clear" w:color="auto" w:fill="FFFFFF"/>
               </w:rPr>
             </w:pPr>
-            <w:r>
-              <w:rPr>
-                <w:shd w:val="clear" w:color="auto" w:fill="FFFFFF"/>
-              </w:rPr>
+            <w:proofErr w:type="spellStart"/>
+            <w:r>
               <w:lastRenderedPageBreak/>
-              <w:t xml:space="preserve">{{ </w:t>
-            </w:r>
-            <w:r>
               <w:t>calculate_child_support_</w:t>
             </w:r>
             <w:r>
               <w:t>step.subject</w:t>
             </w:r>
-            <w:r>
-              <w:rPr>
-                <w:shd w:val="clear" w:color="auto" w:fill="FFFFFF"/>
-              </w:rPr>
-              <w:t xml:space="preserve"> }}</w:t>
-            </w:r>
+            <w:proofErr w:type="spellEnd"/>
           </w:p>
         </w:tc>
         <w:tc>
@@ -3566,6 +3623,7 @@
             <w:pPr>
               <w:pStyle w:val="Body"/>
             </w:pPr>
+            <w:proofErr w:type="spellStart"/>
             <w:r>
               <w:t>dont_wait_modify_</w:t>
             </w:r>
@@ -3575,6 +3633,7 @@
             <w:r>
               <w:t>_step</w:t>
             </w:r>
+            <w:proofErr w:type="spellEnd"/>
             <w:r>
               <w:t xml:space="preserve"> in </w:t>
             </w:r>
@@ -3603,16 +3662,13 @@
               <w:outlineLvl w:val="1"/>
             </w:pPr>
             <w:r>
-              <w:t xml:space="preserve">{{ </w:t>
-            </w:r>
-            <w:r>
               <w:t>dont_wait_modify_child_support</w:t>
             </w:r>
             <w:r>
               <w:t>_step</w:t>
             </w:r>
             <w:r>
-              <w:t>.subject }}</w:t>
+              <w:t>.subject</w:t>
             </w:r>
           </w:p>
         </w:tc>
@@ -3962,18 +4018,16 @@
                 <w:shd w:val="clear" w:color="auto" w:fill="FFFFFF"/>
               </w:rPr>
             </w:pPr>
-            <w:r>
-              <w:t xml:space="preserve">{{ </w:t>
-            </w:r>
-            <w:r>
-              <w:t>dont_wait_modify_custody_divor</w:t>
-            </w:r>
-            <w:r>
-              <w:lastRenderedPageBreak/>
-              <w:t>ce_step</w:t>
-            </w:r>
-            <w:r>
-              <w:t>.subject }}</w:t>
+            <w:proofErr w:type="spellStart"/>
+            <w:r>
+              <w:t>dont_wait_modify_custody_divorce_step</w:t>
+            </w:r>
+            <w:r>
+              <w:t>.subject</w:t>
+            </w:r>
+            <w:proofErr w:type="spellEnd"/>
+            <w:r>
+              <w:t xml:space="preserve"> </w:t>
             </w:r>
           </w:p>
         </w:tc>
@@ -4105,6 +4159,7 @@
               <w:rPr>
                 <w:color w:val="FF0000"/>
               </w:rPr>
+              <w:lastRenderedPageBreak/>
               <w:t>{%tr</w:t>
             </w:r>
             <w:r>
@@ -4489,9 +4544,11 @@
             <w:pPr>
               <w:pStyle w:val="Body"/>
             </w:pPr>
+            <w:proofErr w:type="spellStart"/>
             <w:r>
               <w:t>modify_divorce_step</w:t>
             </w:r>
+            <w:proofErr w:type="spellEnd"/>
           </w:p>
         </w:tc>
       </w:tr>
@@ -4513,9 +4570,11 @@
               <w:pStyle w:val="Heading2"/>
               <w:outlineLvl w:val="1"/>
             </w:pPr>
-            <w:r>
-              <w:t>{{ modify_divorce_step.subject }}</w:t>
-            </w:r>
+            <w:proofErr w:type="spellStart"/>
+            <w:r>
+              <w:t>modify_divorce_step.subject</w:t>
+            </w:r>
+            <w:proofErr w:type="spellEnd"/>
           </w:p>
         </w:tc>
         <w:tc>
@@ -4962,194 +5021,194 @@
               <w:rPr>
                 <w:color w:val="FF0000"/>
               </w:rPr>
+              <w:t>{</w:t>
+            </w:r>
+            <w:r>
+              <w:rPr>
+                <w:color w:val="FF0000"/>
+              </w:rPr>
+              <w:t>%</w:t>
+            </w:r>
+            <w:r>
+              <w:rPr>
+                <w:color w:val="FF0000"/>
+              </w:rPr>
+              <w:t>p</w:t>
+            </w:r>
+            <w:r>
+              <w:rPr>
+                <w:color w:val="FF0000"/>
+              </w:rPr>
+              <w:t xml:space="preserve"> if (user_need == </w:t>
+            </w:r>
+            <w:r>
+              <w:rPr>
+                <w:color w:val="FF0000"/>
+              </w:rPr>
+              <w:t>'</w:t>
+            </w:r>
+            <w:r>
+              <w:rPr>
+                <w:color w:val="FF0000"/>
+              </w:rPr>
+              <w:t>change divorce order</w:t>
+            </w:r>
+            <w:r>
+              <w:rPr>
+                <w:color w:val="FF0000"/>
+              </w:rPr>
+              <w:t>'</w:t>
+            </w:r>
+            <w:r>
+              <w:rPr>
+                <w:color w:val="FF0000"/>
+              </w:rPr>
+              <w:t xml:space="preserve"> and middle_of_case == </w:t>
+            </w:r>
+            <w:r>
+              <w:rPr>
+                <w:color w:val="FF0000"/>
+              </w:rPr>
+              <w:t>'</w:t>
+            </w:r>
+            <w:r>
+              <w:rPr>
+                <w:color w:val="FF0000"/>
+              </w:rPr>
+              <w:t>no</w:t>
+            </w:r>
+            <w:r>
+              <w:rPr>
+                <w:color w:val="FF0000"/>
+              </w:rPr>
+              <w:t>'</w:t>
+            </w:r>
+            <w:r>
+              <w:rPr>
+                <w:color w:val="FF0000"/>
+              </w:rPr>
+              <w:t xml:space="preserve"> and type_of_final_order[</w:t>
+            </w:r>
+            <w:r>
+              <w:rPr>
+                <w:color w:val="FF0000"/>
+              </w:rPr>
+              <w:t>'</w:t>
+            </w:r>
+            <w:r>
+              <w:rPr>
+                <w:color w:val="FF0000"/>
+              </w:rPr>
+              <w:t>spousal support</w:t>
+            </w:r>
+            <w:r>
+              <w:rPr>
+                <w:color w:val="FF0000"/>
+              </w:rPr>
+              <w:t>'</w:t>
+            </w:r>
+            <w:r>
+              <w:rPr>
+                <w:color w:val="FF0000"/>
+              </w:rPr>
+              <w:t xml:space="preserve">]) or (user_need == </w:t>
+            </w:r>
+            <w:r>
+              <w:rPr>
+                <w:color w:val="FF0000"/>
+              </w:rPr>
+              <w:t>'</w:t>
+            </w:r>
+            <w:r>
+              <w:rPr>
+                <w:color w:val="FF0000"/>
+              </w:rPr>
+              <w:t>respond to motion in divorce</w:t>
+            </w:r>
+            <w:r>
+              <w:rPr>
+                <w:color w:val="FF0000"/>
+              </w:rPr>
+              <w:t>'</w:t>
+            </w:r>
+            <w:r>
+              <w:rPr>
+                <w:color w:val="FF0000"/>
+              </w:rPr>
+              <w:t xml:space="preserve"> and type_of_response == </w:t>
+            </w:r>
+            <w:r>
+              <w:rPr>
+                <w:color w:val="FF0000"/>
+              </w:rPr>
+              <w:t>'</w:t>
+            </w:r>
+            <w:r>
+              <w:rPr>
+                <w:color w:val="FF0000"/>
+              </w:rPr>
+              <w:t>modify</w:t>
+            </w:r>
+            <w:r>
+              <w:rPr>
+                <w:color w:val="FF0000"/>
+              </w:rPr>
+              <w:t>'</w:t>
+            </w:r>
+            <w:r>
+              <w:rPr>
+                <w:color w:val="FF0000"/>
+              </w:rPr>
+              <w:t xml:space="preserve"> and type_of_modification[</w:t>
+            </w:r>
+            <w:r>
+              <w:rPr>
+                <w:color w:val="FF0000"/>
+              </w:rPr>
+              <w:t>'</w:t>
+            </w:r>
+            <w:r>
+              <w:rPr>
+                <w:color w:val="FF0000"/>
+              </w:rPr>
+              <w:t>spousal support</w:t>
+            </w:r>
+            <w:r>
+              <w:rPr>
+                <w:color w:val="FF0000"/>
+              </w:rPr>
+              <w:t>'</w:t>
+            </w:r>
+            <w:r>
+              <w:rPr>
+                <w:color w:val="FF0000"/>
+              </w:rPr>
+              <w:t>])</w:t>
+            </w:r>
+            <w:r>
+              <w:rPr>
+                <w:color w:val="FF0000"/>
+              </w:rPr>
+              <w:t>%}</w:t>
+            </w:r>
+          </w:p>
+          <w:p>
+            <w:pPr>
+              <w:pStyle w:val="Body"/>
+            </w:pPr>
+            <w:r>
+              <w:t>The court will generally only change spousal support if there is a "substantial change in circumstances."</w:t>
+            </w:r>
+          </w:p>
+          <w:p>
+            <w:pPr>
+              <w:pStyle w:val="Example"/>
+              <w:rPr>
+                <w:color w:val="auto"/>
+              </w:rPr>
+            </w:pPr>
+            <w:r>
               <w:lastRenderedPageBreak/>
-              <w:t>{</w:t>
-            </w:r>
-            <w:r>
-              <w:rPr>
-                <w:color w:val="FF0000"/>
-              </w:rPr>
-              <w:t>%</w:t>
-            </w:r>
-            <w:r>
-              <w:rPr>
-                <w:color w:val="FF0000"/>
-              </w:rPr>
-              <w:t>p</w:t>
-            </w:r>
-            <w:r>
-              <w:rPr>
-                <w:color w:val="FF0000"/>
-              </w:rPr>
-              <w:t xml:space="preserve"> if (user_need == </w:t>
-            </w:r>
-            <w:r>
-              <w:rPr>
-                <w:color w:val="FF0000"/>
-              </w:rPr>
-              <w:t>'</w:t>
-            </w:r>
-            <w:r>
-              <w:rPr>
-                <w:color w:val="FF0000"/>
-              </w:rPr>
-              <w:t>change divorce order</w:t>
-            </w:r>
-            <w:r>
-              <w:rPr>
-                <w:color w:val="FF0000"/>
-              </w:rPr>
-              <w:t>'</w:t>
-            </w:r>
-            <w:r>
-              <w:rPr>
-                <w:color w:val="FF0000"/>
-              </w:rPr>
-              <w:t xml:space="preserve"> and middle_of_case == </w:t>
-            </w:r>
-            <w:r>
-              <w:rPr>
-                <w:color w:val="FF0000"/>
-              </w:rPr>
-              <w:t>'</w:t>
-            </w:r>
-            <w:r>
-              <w:rPr>
-                <w:color w:val="FF0000"/>
-              </w:rPr>
-              <w:t>no</w:t>
-            </w:r>
-            <w:r>
-              <w:rPr>
-                <w:color w:val="FF0000"/>
-              </w:rPr>
-              <w:t>'</w:t>
-            </w:r>
-            <w:r>
-              <w:rPr>
-                <w:color w:val="FF0000"/>
-              </w:rPr>
-              <w:t xml:space="preserve"> and type_of_final_order[</w:t>
-            </w:r>
-            <w:r>
-              <w:rPr>
-                <w:color w:val="FF0000"/>
-              </w:rPr>
-              <w:t>'</w:t>
-            </w:r>
-            <w:r>
-              <w:rPr>
-                <w:color w:val="FF0000"/>
-              </w:rPr>
-              <w:t>spousal support</w:t>
-            </w:r>
-            <w:r>
-              <w:rPr>
-                <w:color w:val="FF0000"/>
-              </w:rPr>
-              <w:t>'</w:t>
-            </w:r>
-            <w:r>
-              <w:rPr>
-                <w:color w:val="FF0000"/>
-              </w:rPr>
-              <w:t xml:space="preserve">]) or (user_need == </w:t>
-            </w:r>
-            <w:r>
-              <w:rPr>
-                <w:color w:val="FF0000"/>
-              </w:rPr>
-              <w:t>'</w:t>
-            </w:r>
-            <w:r>
-              <w:rPr>
-                <w:color w:val="FF0000"/>
-              </w:rPr>
-              <w:t>respond to motion in divorce</w:t>
-            </w:r>
-            <w:r>
-              <w:rPr>
-                <w:color w:val="FF0000"/>
-              </w:rPr>
-              <w:t>'</w:t>
-            </w:r>
-            <w:r>
-              <w:rPr>
-                <w:color w:val="FF0000"/>
-              </w:rPr>
-              <w:t xml:space="preserve"> and type_of_response == </w:t>
-            </w:r>
-            <w:r>
-              <w:rPr>
-                <w:color w:val="FF0000"/>
-              </w:rPr>
-              <w:t>'</w:t>
-            </w:r>
-            <w:r>
-              <w:rPr>
-                <w:color w:val="FF0000"/>
-              </w:rPr>
-              <w:t>modify</w:t>
-            </w:r>
-            <w:r>
-              <w:rPr>
-                <w:color w:val="FF0000"/>
-              </w:rPr>
-              <w:t>'</w:t>
-            </w:r>
-            <w:r>
-              <w:rPr>
-                <w:color w:val="FF0000"/>
-              </w:rPr>
-              <w:t xml:space="preserve"> and type_of_modification[</w:t>
-            </w:r>
-            <w:r>
-              <w:rPr>
-                <w:color w:val="FF0000"/>
-              </w:rPr>
-              <w:t>'</w:t>
-            </w:r>
-            <w:r>
-              <w:rPr>
-                <w:color w:val="FF0000"/>
-              </w:rPr>
-              <w:t>spousal support</w:t>
-            </w:r>
-            <w:r>
-              <w:rPr>
-                <w:color w:val="FF0000"/>
-              </w:rPr>
-              <w:t>'</w:t>
-            </w:r>
-            <w:r>
-              <w:rPr>
-                <w:color w:val="FF0000"/>
-              </w:rPr>
-              <w:t>])</w:t>
-            </w:r>
-            <w:r>
-              <w:rPr>
-                <w:color w:val="FF0000"/>
-              </w:rPr>
-              <w:t>%}</w:t>
-            </w:r>
-          </w:p>
-          <w:p>
-            <w:pPr>
-              <w:pStyle w:val="Body"/>
-            </w:pPr>
-            <w:r>
-              <w:t>The court will generally only change spousal support if there is a "substantial change in circumstances."</w:t>
-            </w:r>
-          </w:p>
-          <w:p>
-            <w:pPr>
-              <w:pStyle w:val="Example"/>
-              <w:rPr>
-                <w:color w:val="auto"/>
-              </w:rPr>
-            </w:pPr>
-            <w:r>
               <w:t>Some examples</w:t>
             </w:r>
           </w:p>
@@ -5552,9 +5611,11 @@
             <w:pPr>
               <w:pStyle w:val="Body"/>
             </w:pPr>
+            <w:proofErr w:type="spellStart"/>
             <w:r>
               <w:t>fill_modify_divorce_step</w:t>
             </w:r>
+            <w:proofErr w:type="spellEnd"/>
           </w:p>
         </w:tc>
       </w:tr>
@@ -5576,9 +5637,13 @@
               <w:pStyle w:val="Heading2"/>
               <w:outlineLvl w:val="1"/>
             </w:pPr>
-            <w:r>
-              <w:lastRenderedPageBreak/>
-              <w:t>{{ fill_modify_divorce_step.subject }}</w:t>
+            <w:proofErr w:type="spellStart"/>
+            <w:r>
+              <w:t>fill_modify_divorce_step.subject</w:t>
+            </w:r>
+            <w:proofErr w:type="spellEnd"/>
+            <w:r>
+              <w:t xml:space="preserve"> </w:t>
             </w:r>
           </w:p>
         </w:tc>
@@ -5770,7 +5835,15 @@
                 <w:color w:val="202529"/>
                 <w:spacing w:val="-2"/>
               </w:rPr>
-              <w:t xml:space="preserve"> on the signature line. For example, Zoe Lee</w:t>
+              <w:t xml:space="preserve"> on the </w:t>
+            </w:r>
+            <w:r>
+              <w:rPr>
+                <w:color w:val="202529"/>
+                <w:spacing w:val="-2"/>
+              </w:rPr>
+              <w:lastRenderedPageBreak/>
+              <w:t>signature line. For example, Zoe Lee</w:t>
             </w:r>
             <w:r>
               <w:rPr>
@@ -6433,7 +6506,23 @@
                   <w:rStyle w:val="Hyperlink"/>
                   <w:spacing w:val="0"/>
                 </w:rPr>
-                <w:t>youtube.com/watch?v=2irmxT0_0EA</w:t>
+                <w:t>youtube.com/</w:t>
+              </w:r>
+              <w:proofErr w:type="spellStart"/>
+              <w:r>
+                <w:rPr>
+                  <w:rStyle w:val="Hyperlink"/>
+                  <w:spacing w:val="0"/>
+                </w:rPr>
+                <w:t>watch?v</w:t>
+              </w:r>
+              <w:proofErr w:type="spellEnd"/>
+              <w:r>
+                <w:rPr>
+                  <w:rStyle w:val="Hyperlink"/>
+                  <w:spacing w:val="0"/>
+                </w:rPr>
+                <w:t>=2irmxT0_0EA</w:t>
               </w:r>
             </w:hyperlink>
           </w:p>
@@ -6460,6 +6549,7 @@
               </w:rPr>
             </w:pPr>
             <w:r>
+              <w:lastRenderedPageBreak/>
               <w:t>{%</w:t>
             </w:r>
             <w:r>
@@ -6528,11 +6618,7 @@
               <w:t xml:space="preserve"> </w:t>
             </w:r>
             <w:r>
-              <w:t>interim_order_date_withi</w:t>
-            </w:r>
-            <w:r>
-              <w:lastRenderedPageBreak/>
-              <w:t>n_10_days</w:t>
+              <w:t>interim_order_date_within_10_days</w:t>
             </w:r>
             <w:r>
               <w:t xml:space="preserve"> </w:t>
@@ -6591,21 +6677,23 @@
             <w:pPr>
               <w:pStyle w:val="Body"/>
             </w:pPr>
-            <w:r>
-              <w:lastRenderedPageBreak/>
+            <w:proofErr w:type="spellStart"/>
+            <w:r>
               <w:t>learn_reconsider_step</w:t>
             </w:r>
+            <w:proofErr w:type="spellEnd"/>
             <w:r>
               <w:t xml:space="preserve"> and </w:t>
             </w:r>
+            <w:proofErr w:type="spellStart"/>
             <w:r>
               <w:t>fill_reconsider_step</w:t>
             </w:r>
+            <w:proofErr w:type="spellEnd"/>
             <w:r>
               <w:t xml:space="preserve"> in </w:t>
             </w:r>
             <w:r>
-              <w:lastRenderedPageBreak/>
               <w:t>aka2j_mod_cust_div_templates.yml</w:t>
             </w:r>
           </w:p>
@@ -6629,16 +6717,15 @@
               <w:pStyle w:val="Heading2"/>
               <w:outlineLvl w:val="1"/>
             </w:pPr>
+            <w:proofErr w:type="spellStart"/>
             <w:r>
               <w:lastRenderedPageBreak/>
-              <w:t xml:space="preserve">{{ </w:t>
-            </w:r>
-            <w:r>
               <w:t>learn_reconsider_step</w:t>
             </w:r>
             <w:r>
-              <w:t>.subject }}</w:t>
-            </w:r>
+              <w:t>.subject</w:t>
+            </w:r>
+            <w:proofErr w:type="spellEnd"/>
           </w:p>
           <w:p/>
         </w:tc>
@@ -6694,15 +6781,17 @@
               <w:pStyle w:val="Heading2"/>
               <w:outlineLvl w:val="1"/>
             </w:pPr>
-            <w:r>
-              <w:t>{{ fill</w:t>
+            <w:proofErr w:type="spellStart"/>
+            <w:r>
+              <w:t>fill</w:t>
             </w:r>
             <w:r>
               <w:t>_reconsider_step</w:t>
             </w:r>
             <w:r>
-              <w:t>.subject }}</w:t>
-            </w:r>
+              <w:t>.subject</w:t>
+            </w:r>
+            <w:proofErr w:type="spellEnd"/>
           </w:p>
         </w:tc>
         <w:tc>
@@ -6935,12 +7024,14 @@
             <w:pPr>
               <w:pStyle w:val="Body"/>
             </w:pPr>
+            <w:proofErr w:type="spellStart"/>
             <w:r>
               <w:t>change_</w:t>
             </w:r>
             <w:r>
               <w:t>standing_order_step</w:t>
             </w:r>
+            <w:proofErr w:type="spellEnd"/>
             <w:r>
               <w:t xml:space="preserve"> in </w:t>
             </w:r>
@@ -6971,12 +7062,7 @@
                 <w:shd w:val="clear" w:color="auto" w:fill="FFFFFF"/>
               </w:rPr>
             </w:pPr>
-            <w:r>
-              <w:rPr>
-                <w:shd w:val="clear" w:color="auto" w:fill="FFFFFF"/>
-              </w:rPr>
-              <w:t xml:space="preserve">{{ </w:t>
-            </w:r>
+            <w:proofErr w:type="spellStart"/>
             <w:r>
               <w:rPr>
                 <w:shd w:val="clear" w:color="auto" w:fill="FFFFFF"/>
@@ -6989,18 +7075,7 @@
               </w:rPr>
               <w:t>standing_order_step.subject</w:t>
             </w:r>
-            <w:r>
-              <w:rPr>
-                <w:shd w:val="clear" w:color="auto" w:fill="FFFFFF"/>
-              </w:rPr>
-              <w:t xml:space="preserve"> </w:t>
-            </w:r>
-            <w:r>
-              <w:rPr>
-                <w:shd w:val="clear" w:color="auto" w:fill="FFFFFF"/>
-              </w:rPr>
-              <w:t>}}</w:t>
-            </w:r>
+            <w:proofErr w:type="spellEnd"/>
           </w:p>
         </w:tc>
         <w:tc>
@@ -7231,7 +7306,6 @@
               <w:rPr>
                 <w:shd w:val="clear" w:color="auto" w:fill="FFFFFF"/>
               </w:rPr>
-              <w:lastRenderedPageBreak/>
               <w:t>(</w:t>
             </w:r>
             <w:r>
@@ -7352,7 +7426,6 @@
               <w:rPr>
                 <w:shd w:val="clear" w:color="auto" w:fill="FFFFFF"/>
               </w:rPr>
-              <w:lastRenderedPageBreak/>
               <w:t xml:space="preserve">motion_forms_step </w:t>
             </w:r>
             <w:r>
@@ -7395,13 +7468,7 @@
               <w:rPr>
                 <w:shd w:val="clear" w:color="auto" w:fill="FFFFFF"/>
               </w:rPr>
-              <w:t>{{ motion_forms_step.subject }</w:t>
-            </w:r>
-            <w:r>
-              <w:rPr>
-                <w:shd w:val="clear" w:color="auto" w:fill="FFFFFF"/>
-              </w:rPr>
-              <w:t>}</w:t>
+              <w:t>motion_forms_step.subject</w:t>
             </w:r>
           </w:p>
         </w:tc>
@@ -7431,7 +7498,11 @@
               <w:t xml:space="preserve"> (include_docx_template("docassemble.AKA2JBranding:</w:t>
             </w:r>
             <w:r>
-              <w:t>motion_forms</w:t>
+              <w:t>motion_form</w:t>
+            </w:r>
+            <w:r>
+              <w:lastRenderedPageBreak/>
+              <w:t>s</w:t>
             </w:r>
             <w:r>
               <w:t>_content.docx")) }}</w:t>
@@ -7463,6 +7534,7 @@
               <w:rPr>
                 <w:shd w:val="clear" w:color="auto" w:fill="FFFFFF"/>
               </w:rPr>
+              <w:lastRenderedPageBreak/>
               <w:t>{%tr</w:t>
             </w:r>
             <w:r>
@@ -7959,15 +8031,7 @@
                 <w:color w:val="00B0F0"/>
                 <w:shd w:val="clear" w:color="auto" w:fill="FFFFFF"/>
               </w:rPr>
-              <w:t>] and why_change_divorce_or</w:t>
-            </w:r>
-            <w:r>
-              <w:rPr>
-                <w:color w:val="00B0F0"/>
-                <w:shd w:val="clear" w:color="auto" w:fill="FFFFFF"/>
-              </w:rPr>
-              <w:lastRenderedPageBreak/>
-              <w:t xml:space="preserve">der == </w:t>
+              <w:t xml:space="preserve">] and why_change_divorce_order == </w:t>
             </w:r>
             <w:r>
               <w:rPr>
@@ -8118,7 +8182,6 @@
               <w:pStyle w:val="Body"/>
             </w:pPr>
             <w:r>
-              <w:lastRenderedPageBreak/>
               <w:t>appeal_step in aka2j_mod_cust_div_templates.yml</w:t>
             </w:r>
           </w:p>
@@ -8149,7 +8212,7 @@
               <w:rPr>
                 <w:shd w:val="clear" w:color="auto" w:fill="FFFFFF"/>
               </w:rPr>
-              <w:t>{{ appeal_step.subject }}</w:t>
+              <w:t>appeal_step.subject</w:t>
             </w:r>
           </w:p>
         </w:tc>
@@ -8176,6 +8239,7 @@
               <w:t xml:space="preserve">{{p </w:t>
             </w:r>
             <w:r>
+              <w:lastRenderedPageBreak/>
               <w:t>(include_docx_template("docassemble.AKA2JBranding:</w:t>
             </w:r>
             <w:r>
@@ -8211,6 +8275,7 @@
               <w:rPr>
                 <w:shd w:val="clear" w:color="auto" w:fill="FFFFFF"/>
               </w:rPr>
+              <w:lastRenderedPageBreak/>
               <w:t>{%tr</w:t>
             </w:r>
             <w:r>
@@ -8521,11 +8586,19 @@
               </w:rPr>
               <w:t>(</w:t>
             </w:r>
+            <w:proofErr w:type="spellStart"/>
             <w:r>
               <w:rPr>
                 <w:color w:val="00B050"/>
               </w:rPr>
-              <w:t xml:space="preserve">final_order_period </w:t>
+              <w:t>final_order_period</w:t>
+            </w:r>
+            <w:proofErr w:type="spellEnd"/>
+            <w:r>
+              <w:rPr>
+                <w:color w:val="00B050"/>
+              </w:rPr>
+              <w:t xml:space="preserve"> </w:t>
             </w:r>
             <w:r>
               <w:rPr>
@@ -8687,14 +8760,7 @@
               <w:rPr>
                 <w:shd w:val="clear" w:color="auto" w:fill="FFFFFF"/>
               </w:rPr>
-              <w:t>{{ learn_set_aside</w:t>
-            </w:r>
-            <w:r>
-              <w:rPr>
-                <w:shd w:val="clear" w:color="auto" w:fill="FFFFFF"/>
-              </w:rPr>
-              <w:lastRenderedPageBreak/>
-              <w:t>_step.subject }}</w:t>
+              <w:t>learn_set_aside_step.subject</w:t>
             </w:r>
           </w:p>
         </w:tc>
@@ -8724,11 +8790,7 @@
               <w:t xml:space="preserve"> (include_docx_template("docassemble.AKA2JBranding:</w:t>
             </w:r>
             <w:r>
-              <w:t>learn_set_asi</w:t>
-            </w:r>
-            <w:r>
-              <w:lastRenderedPageBreak/>
-              <w:t>de</w:t>
+              <w:t>learn_set_aside</w:t>
             </w:r>
             <w:r>
               <w:t>_content.docx")) }}</w:t>
@@ -8761,8 +8823,7 @@
               <w:rPr>
                 <w:shd w:val="clear" w:color="auto" w:fill="FFFFFF"/>
               </w:rPr>
-              <w:lastRenderedPageBreak/>
-              <w:t>{{ fill_set_aside_step.subject }}</w:t>
+              <w:t>fill_set_aside_step.subject</w:t>
             </w:r>
           </w:p>
         </w:tc>
@@ -8825,6 +8886,7 @@
                 <w:color w:val="FF0000"/>
                 <w:shd w:val="clear" w:color="auto" w:fill="FFFFFF"/>
               </w:rPr>
+              <w:lastRenderedPageBreak/>
               <w:t>{%tr endif %}</w:t>
             </w:r>
           </w:p>
@@ -8968,19 +9030,13 @@
               <w:rPr>
                 <w:shd w:val="clear" w:color="auto" w:fill="FFFFFF"/>
               </w:rPr>
-              <w:t xml:space="preserve">{{ </w:t>
-            </w:r>
-            <w:r>
-              <w:rPr>
-                <w:shd w:val="clear" w:color="auto" w:fill="FFFFFF"/>
-              </w:rPr>
               <w:t>respond_to_reconsider_step</w:t>
             </w:r>
             <w:r>
               <w:rPr>
                 <w:shd w:val="clear" w:color="auto" w:fill="FFFFFF"/>
               </w:rPr>
-              <w:t>.subject }}</w:t>
+              <w:t>.subject</w:t>
             </w:r>
           </w:p>
         </w:tc>
@@ -9236,22 +9292,10 @@
               <w:outlineLvl w:val="1"/>
             </w:pPr>
             <w:r>
-              <w:rPr>
-                <w:shd w:val="clear" w:color="auto" w:fill="FFFFFF"/>
-              </w:rPr>
-              <w:t xml:space="preserve">{{ </w:t>
-            </w:r>
-            <w:r>
               <w:t>let_court_party_know_you_agree_step</w:t>
             </w:r>
             <w:r>
               <w:t>.subject</w:t>
-            </w:r>
-            <w:r>
-              <w:rPr>
-                <w:shd w:val="clear" w:color="auto" w:fill="FFFFFF"/>
-              </w:rPr>
-              <w:t xml:space="preserve"> }}</w:t>
             </w:r>
           </w:p>
         </w:tc>
@@ -9313,7 +9357,6 @@
               <w:rPr>
                 <w:shd w:val="clear" w:color="auto" w:fill="FFFFFF"/>
               </w:rPr>
-              <w:lastRenderedPageBreak/>
               <w:t>{%tr endif %}</w:t>
             </w:r>
           </w:p>
@@ -9499,16 +9542,11 @@
               <w:outlineLvl w:val="1"/>
             </w:pPr>
             <w:r>
-              <w:rPr>
-                <w:shd w:val="clear" w:color="auto" w:fill="FFFFFF"/>
-              </w:rPr>
-              <w:t>{{</w:t>
-            </w:r>
-            <w:r>
-              <w:t xml:space="preserve"> respond_in_writing_step</w:t>
-            </w:r>
-            <w:r>
-              <w:t>.subject }}</w:t>
+              <w:lastRenderedPageBreak/>
+              <w:t>respond_in_writing_step</w:t>
+            </w:r>
+            <w:r>
+              <w:t>.subject</w:t>
             </w:r>
           </w:p>
         </w:tc>
@@ -9995,11 +10033,7 @@
               <w:outlineLvl w:val="1"/>
             </w:pPr>
             <w:r>
-              <w:t>{{ sign_step.subjec</w:t>
-            </w:r>
-            <w:r>
-              <w:lastRenderedPageBreak/>
-              <w:t>t }}</w:t>
+              <w:t>sign_step.subject</w:t>
             </w:r>
           </w:p>
         </w:tc>
@@ -10035,11 +10069,7 @@
               <w:t>sign</w:t>
             </w:r>
             <w:r>
-              <w:t>_content.</w:t>
-            </w:r>
-            <w:r>
-              <w:lastRenderedPageBreak/>
-              <w:t>docx")) }}</w:t>
+              <w:t>_content.docx")) }}</w:t>
             </w:r>
           </w:p>
         </w:tc>
@@ -10063,14 +10093,10 @@
               <w:outlineLvl w:val="1"/>
             </w:pPr>
             <w:r>
-              <w:lastRenderedPageBreak/>
-              <w:t xml:space="preserve">{{ </w:t>
-            </w:r>
-            <w:r>
               <w:t>truefiling_file_and_serve_</w:t>
             </w:r>
             <w:r>
-              <w:t>step.subject }}</w:t>
+              <w:t>step.subject</w:t>
             </w:r>
           </w:p>
         </w:tc>
@@ -10170,6 +10196,7 @@
               <w:pStyle w:val="Body"/>
             </w:pPr>
             <w:r>
+              <w:lastRenderedPageBreak/>
               <w:t xml:space="preserve">{%tr if user_need == </w:t>
             </w:r>
             <w:r>
@@ -10293,7 +10320,7 @@
               <w:outlineLvl w:val="1"/>
             </w:pPr>
             <w:r>
-              <w:t>{{ truefiling_serve_step.subject }}</w:t>
+              <w:t>truefiling_serve_step.subject</w:t>
             </w:r>
           </w:p>
         </w:tc>
@@ -10459,161 +10486,154 @@
                 <w:color w:val="FFC000"/>
                 <w:shd w:val="clear" w:color="auto" w:fill="FFFFFF"/>
               </w:rPr>
-              <w:t xml:space="preserve"> </w:t>
-            </w:r>
-            <w:r>
-              <w:rPr>
-                <w:color w:val="FFC000"/>
+              <w:t xml:space="preserve"> and</w:t>
+            </w:r>
+            <w:r>
+              <w:rPr>
+                <w:color w:val="FFC000"/>
+                <w:shd w:val="clear" w:color="auto" w:fill="FFFFFF"/>
+              </w:rPr>
+              <w:t xml:space="preserve"> (</w:t>
+            </w:r>
+            <w:r>
+              <w:rPr>
+                <w:color w:val="92D050"/>
+                <w:shd w:val="clear" w:color="auto" w:fill="FFFFFF"/>
+              </w:rPr>
+              <w:t>(</w:t>
+            </w:r>
+            <w:r>
+              <w:rPr>
+                <w:color w:val="00B050"/>
+                <w:shd w:val="clear" w:color="auto" w:fill="FFFFFF"/>
+              </w:rPr>
+              <w:t>middle_of_case == 'yes' and</w:t>
+            </w:r>
+            <w:r>
+              <w:rPr>
+                <w:color w:val="92D050"/>
+                <w:shd w:val="clear" w:color="auto" w:fill="FFFFFF"/>
+              </w:rPr>
+              <w:t xml:space="preserve"> </w:t>
+            </w:r>
+            <w:r>
+              <w:rPr>
+                <w:color w:val="00B050"/>
+                <w:shd w:val="clear" w:color="auto" w:fill="FFFFFF"/>
+              </w:rPr>
+              <w:t>(</w:t>
+            </w:r>
+            <w:r>
+              <w:rPr>
+                <w:color w:val="00B0F0"/>
+                <w:shd w:val="clear" w:color="auto" w:fill="FFFFFF"/>
+              </w:rPr>
+              <w:t>type_of_interim_order == 'standing order' or not interim_order_date_within_10_days</w:t>
+            </w:r>
+            <w:r>
+              <w:rPr>
+                <w:color w:val="00B050"/>
+                <w:shd w:val="clear" w:color="auto" w:fill="FFFFFF"/>
+              </w:rPr>
+              <w:t>)</w:t>
+            </w:r>
+            <w:r>
+              <w:rPr>
+                <w:color w:val="92D050"/>
+                <w:shd w:val="clear" w:color="auto" w:fill="FFFFFF"/>
+              </w:rPr>
+              <w:t>)</w:t>
+            </w:r>
+            <w:r>
+              <w:rPr>
+                <w:color w:val="92D050"/>
+                <w:shd w:val="clear" w:color="auto" w:fill="FFFFFF"/>
+              </w:rPr>
+              <w:t xml:space="preserve"> </w:t>
+            </w:r>
+            <w:r>
+              <w:rPr>
+                <w:color w:val="92D050"/>
+                <w:shd w:val="clear" w:color="auto" w:fill="FFFFFF"/>
+              </w:rPr>
+              <w:t>or</w:t>
+            </w:r>
+            <w:r>
+              <w:rPr>
+                <w:color w:val="92D050"/>
+                <w:shd w:val="clear" w:color="auto" w:fill="FFFFFF"/>
+              </w:rPr>
+              <w:t xml:space="preserve"> </w:t>
+            </w:r>
+            <w:r>
+              <w:rPr>
+                <w:color w:val="92D050"/>
+                <w:shd w:val="clear" w:color="auto" w:fill="FFFFFF"/>
+              </w:rPr>
+              <w:t>(</w:t>
+            </w:r>
+            <w:r>
+              <w:rPr>
+                <w:color w:val="00B050"/>
+                <w:shd w:val="clear" w:color="auto" w:fill="FFFFFF"/>
+              </w:rPr>
+              <w:t>middle_of_case == 'no' and</w:t>
+            </w:r>
+            <w:r>
+              <w:rPr>
+                <w:color w:val="92D050"/>
+                <w:shd w:val="clear" w:color="auto" w:fill="FFFFFF"/>
+              </w:rPr>
+              <w:t xml:space="preserve"> </w:t>
+            </w:r>
+            <w:r>
+              <w:rPr>
+                <w:color w:val="00B050"/>
+                <w:shd w:val="clear" w:color="auto" w:fill="FFFFFF"/>
+              </w:rPr>
+              <w:t>(</w:t>
+            </w:r>
+            <w:r>
+              <w:rPr>
+                <w:color w:val="00B0F0"/>
+                <w:shd w:val="clear" w:color="auto" w:fill="FFFFFF"/>
+              </w:rPr>
+              <w:t>(</w:t>
+            </w:r>
+            <w:r>
+              <w:rPr>
+                <w:color w:val="0070C0"/>
+                <w:shd w:val="clear" w:color="auto" w:fill="FFFFFF"/>
+              </w:rPr>
+              <w:t>type_of_final_order['custody order'] and why_change in ('review', 'schedule')</w:t>
+            </w:r>
+            <w:r>
+              <w:rPr>
+                <w:color w:val="00B0F0"/>
+                <w:shd w:val="clear" w:color="auto" w:fill="FFFFFF"/>
+              </w:rPr>
+              <w:t>)</w:t>
+            </w:r>
+            <w:r>
+              <w:rPr>
+                <w:color w:val="00B0F0"/>
+                <w:shd w:val="clear" w:color="auto" w:fill="FFFFFF"/>
+              </w:rPr>
+              <w:t xml:space="preserve"> or</w:t>
+            </w:r>
+            <w:r>
+              <w:rPr>
+                <w:color w:val="00B0F0"/>
+                <w:shd w:val="clear" w:color="auto" w:fill="FFFFFF"/>
+              </w:rPr>
+              <w:t xml:space="preserve"> </w:t>
+            </w:r>
+            <w:r>
+              <w:rPr>
+                <w:color w:val="00B0F0"/>
                 <w:shd w:val="clear" w:color="auto" w:fill="FFFFFF"/>
               </w:rPr>
               <w:lastRenderedPageBreak/>
-              <w:t>and</w:t>
-            </w:r>
-            <w:r>
-              <w:rPr>
-                <w:color w:val="FFC000"/>
-                <w:shd w:val="clear" w:color="auto" w:fill="FFFFFF"/>
-              </w:rPr>
-              <w:t xml:space="preserve"> (</w:t>
-            </w:r>
-            <w:r>
-              <w:rPr>
-                <w:color w:val="92D050"/>
-                <w:shd w:val="clear" w:color="auto" w:fill="FFFFFF"/>
-              </w:rPr>
-              <w:t>(</w:t>
-            </w:r>
-            <w:r>
-              <w:rPr>
-                <w:color w:val="00B050"/>
-                <w:shd w:val="clear" w:color="auto" w:fill="FFFFFF"/>
-              </w:rPr>
-              <w:t>middle_of_case == 'yes' and</w:t>
-            </w:r>
-            <w:r>
-              <w:rPr>
-                <w:color w:val="92D050"/>
-                <w:shd w:val="clear" w:color="auto" w:fill="FFFFFF"/>
-              </w:rPr>
-              <w:t xml:space="preserve"> </w:t>
-            </w:r>
-            <w:r>
-              <w:rPr>
-                <w:color w:val="00B050"/>
-                <w:shd w:val="clear" w:color="auto" w:fill="FFFFFF"/>
-              </w:rPr>
-              <w:t>(</w:t>
-            </w:r>
-            <w:r>
-              <w:rPr>
-                <w:color w:val="00B0F0"/>
-                <w:shd w:val="clear" w:color="auto" w:fill="FFFFFF"/>
-              </w:rPr>
-              <w:t>type_of_interim_order == 'standing order' or not interim_order_date_within_10_days</w:t>
-            </w:r>
-            <w:r>
-              <w:rPr>
-                <w:color w:val="00B050"/>
-                <w:shd w:val="clear" w:color="auto" w:fill="FFFFFF"/>
-              </w:rPr>
-              <w:t>)</w:t>
-            </w:r>
-            <w:r>
-              <w:rPr>
-                <w:color w:val="92D050"/>
-                <w:shd w:val="clear" w:color="auto" w:fill="FFFFFF"/>
-              </w:rPr>
-              <w:t>)</w:t>
-            </w:r>
-            <w:r>
-              <w:rPr>
-                <w:color w:val="92D050"/>
-                <w:shd w:val="clear" w:color="auto" w:fill="FFFFFF"/>
-              </w:rPr>
-              <w:t xml:space="preserve"> </w:t>
-            </w:r>
-            <w:r>
-              <w:rPr>
-                <w:color w:val="92D050"/>
-                <w:shd w:val="clear" w:color="auto" w:fill="FFFFFF"/>
-              </w:rPr>
-              <w:t>or</w:t>
-            </w:r>
-            <w:r>
-              <w:rPr>
-                <w:color w:val="92D050"/>
-                <w:shd w:val="clear" w:color="auto" w:fill="FFFFFF"/>
-              </w:rPr>
-              <w:t xml:space="preserve"> </w:t>
-            </w:r>
-            <w:r>
-              <w:rPr>
-                <w:color w:val="92D050"/>
-                <w:shd w:val="clear" w:color="auto" w:fill="FFFFFF"/>
-              </w:rPr>
-              <w:t>(</w:t>
-            </w:r>
-            <w:r>
-              <w:rPr>
-                <w:color w:val="00B050"/>
-                <w:shd w:val="clear" w:color="auto" w:fill="FFFFFF"/>
-              </w:rPr>
-              <w:t>middle_of_case == 'no' and</w:t>
-            </w:r>
-            <w:r>
-              <w:rPr>
-                <w:color w:val="92D050"/>
-                <w:shd w:val="clear" w:color="auto" w:fill="FFFFFF"/>
-              </w:rPr>
-              <w:t xml:space="preserve"> </w:t>
-            </w:r>
-            <w:r>
-              <w:rPr>
-                <w:color w:val="00B050"/>
-                <w:shd w:val="clear" w:color="auto" w:fill="FFFFFF"/>
-              </w:rPr>
-              <w:t>(</w:t>
-            </w:r>
-            <w:r>
-              <w:rPr>
-                <w:color w:val="00B0F0"/>
-                <w:shd w:val="clear" w:color="auto" w:fill="FFFFFF"/>
-              </w:rPr>
-              <w:t>(</w:t>
-            </w:r>
-            <w:r>
-              <w:rPr>
-                <w:color w:val="0070C0"/>
-                <w:shd w:val="clear" w:color="auto" w:fill="FFFFFF"/>
-              </w:rPr>
-              <w:t>type_of_final_order['custody order'] and why_change in ('review', 'schedule')</w:t>
-            </w:r>
-            <w:r>
-              <w:rPr>
-                <w:color w:val="00B0F0"/>
-                <w:shd w:val="clear" w:color="auto" w:fill="FFFFFF"/>
-              </w:rPr>
-              <w:t>)</w:t>
-            </w:r>
-            <w:r>
-              <w:rPr>
-                <w:color w:val="00B0F0"/>
-                <w:shd w:val="clear" w:color="auto" w:fill="FFFFFF"/>
-              </w:rPr>
-              <w:t xml:space="preserve"> or</w:t>
-            </w:r>
-            <w:r>
-              <w:rPr>
-                <w:color w:val="00B0F0"/>
-                <w:shd w:val="clear" w:color="auto" w:fill="FFFFFF"/>
-              </w:rPr>
-              <w:t xml:space="preserve"> </w:t>
-            </w:r>
-            <w:r>
-              <w:rPr>
-                <w:color w:val="00B0F0"/>
-                <w:shd w:val="clear" w:color="auto" w:fill="FFFFFF"/>
-              </w:rPr>
               <w:t>(</w:t>
             </w:r>
             <w:r>
@@ -10859,19 +10879,14 @@
                 <w:shd w:val="clear" w:color="auto" w:fill="FFFFFF"/>
               </w:rPr>
             </w:pPr>
-            <w:r>
-              <w:rPr>
-                <w:shd w:val="clear" w:color="auto" w:fill="FFFFFF"/>
-              </w:rPr>
-              <w:lastRenderedPageBreak/>
-              <w:t xml:space="preserve">{{ </w:t>
-            </w:r>
+            <w:proofErr w:type="spellStart"/>
             <w:r>
               <w:t>expect_after_motion_or_answer</w:t>
             </w:r>
             <w:r>
-              <w:t>_step.subject }}</w:t>
-            </w:r>
+              <w:t>_step.subject</w:t>
+            </w:r>
+            <w:proofErr w:type="spellEnd"/>
           </w:p>
         </w:tc>
         <w:tc>
@@ -10988,7 +11003,11 @@
               <w:t xml:space="preserve"> interim</w:t>
             </w:r>
             <w:r>
-              <w:t>_order_date_within_10_days</w:t>
+              <w:t>_order_date_withi</w:t>
+            </w:r>
+            <w:r>
+              <w:lastRenderedPageBreak/>
+              <w:t>n_10_days</w:t>
             </w:r>
             <w:r>
               <w:t xml:space="preserve"> </w:t>
@@ -11035,9 +11054,12 @@
             <w:pPr>
               <w:pStyle w:val="Body"/>
             </w:pPr>
-            <w:r>
+            <w:proofErr w:type="spellStart"/>
+            <w:r>
+              <w:lastRenderedPageBreak/>
               <w:t>expect_reconsider_step</w:t>
             </w:r>
+            <w:proofErr w:type="spellEnd"/>
             <w:r>
               <w:t xml:space="preserve"> in </w:t>
             </w:r>
@@ -11065,14 +11087,16 @@
               <w:pStyle w:val="Heading2"/>
               <w:outlineLvl w:val="1"/>
             </w:pPr>
-            <w:r>
-              <w:t xml:space="preserve">{{ </w:t>
-            </w:r>
+            <w:proofErr w:type="spellStart"/>
             <w:r>
               <w:t>expect_reconsider_step</w:t>
             </w:r>
             <w:r>
-              <w:t>.subject }}</w:t>
+              <w:t>.subject</w:t>
+            </w:r>
+            <w:proofErr w:type="spellEnd"/>
+            <w:r>
+              <w:t xml:space="preserve"> </w:t>
             </w:r>
           </w:p>
         </w:tc>
@@ -11267,12 +11291,14 @@
                 <w:shd w:val="clear" w:color="auto" w:fill="FFFFFF"/>
               </w:rPr>
             </w:pPr>
+            <w:proofErr w:type="spellStart"/>
             <w:r>
               <w:rPr>
                 <w:shd w:val="clear" w:color="auto" w:fill="FFFFFF"/>
               </w:rPr>
               <w:t>expect_after_response_step</w:t>
             </w:r>
+            <w:proofErr w:type="spellEnd"/>
             <w:r>
               <w:rPr>
                 <w:shd w:val="clear" w:color="auto" w:fill="FFFFFF"/>
@@ -11309,12 +11335,7 @@
                 <w:shd w:val="clear" w:color="auto" w:fill="FFFFFF"/>
               </w:rPr>
             </w:pPr>
-            <w:r>
-              <w:rPr>
-                <w:shd w:val="clear" w:color="auto" w:fill="FFFFFF"/>
-              </w:rPr>
-              <w:t xml:space="preserve">{{ </w:t>
-            </w:r>
+            <w:proofErr w:type="spellStart"/>
             <w:r>
               <w:rPr>
                 <w:shd w:val="clear" w:color="auto" w:fill="FFFFFF"/>
@@ -11327,12 +11348,7 @@
               </w:rPr>
               <w:t>.subject</w:t>
             </w:r>
-            <w:r>
-              <w:rPr>
-                <w:shd w:val="clear" w:color="auto" w:fill="FFFFFF"/>
-              </w:rPr>
-              <w:t xml:space="preserve"> }}</w:t>
-            </w:r>
+            <w:proofErr w:type="spellEnd"/>
           </w:p>
         </w:tc>
         <w:tc>
@@ -11399,7 +11415,6 @@
               <w:rPr>
                 <w:shd w:val="clear" w:color="auto" w:fill="FFFFFF"/>
               </w:rPr>
-              <w:lastRenderedPageBreak/>
               <w:t>{%tr endif %}</w:t>
             </w:r>
           </w:p>
@@ -11575,24 +11590,7 @@
                 <w:shd w:val="clear" w:color="auto" w:fill="FFFFFF"/>
               </w:rPr>
             </w:pPr>
-            <w:r>
-              <w:rPr>
-                <w:shd w:val="clear" w:color="auto" w:fill="FFFFFF"/>
-              </w:rPr>
-              <w:t>{</w:t>
-            </w:r>
-            <w:r>
-              <w:rPr>
-                <w:shd w:val="clear" w:color="auto" w:fill="FFFFFF"/>
-              </w:rPr>
-              <w:t>{</w:t>
-            </w:r>
-            <w:r>
-              <w:rPr>
-                <w:shd w:val="clear" w:color="auto" w:fill="FFFFFF"/>
-              </w:rPr>
-              <w:t xml:space="preserve"> </w:t>
-            </w:r>
+            <w:proofErr w:type="spellStart"/>
             <w:r>
               <w:t>contact_other_party_ste</w:t>
             </w:r>
@@ -11605,24 +11603,7 @@
               </w:rPr>
               <w:t>.subject</w:t>
             </w:r>
-            <w:r>
-              <w:rPr>
-                <w:shd w:val="clear" w:color="auto" w:fill="FFFFFF"/>
-              </w:rPr>
-              <w:t xml:space="preserve"> </w:t>
-            </w:r>
-            <w:r>
-              <w:rPr>
-                <w:shd w:val="clear" w:color="auto" w:fill="FFFFFF"/>
-              </w:rPr>
-              <w:t>}</w:t>
-            </w:r>
-            <w:r>
-              <w:rPr>
-                <w:shd w:val="clear" w:color="auto" w:fill="FFFFFF"/>
-              </w:rPr>
-              <w:t>}</w:t>
-            </w:r>
+            <w:proofErr w:type="spellEnd"/>
           </w:p>
         </w:tc>
         <w:tc>
@@ -11681,7 +11662,8 @@
               <w:rPr>
                 <w:shd w:val="clear" w:color="auto" w:fill="FFFFFF"/>
               </w:rPr>
-              <w:t>{{ file_agreement_step.subject }}</w:t>
+              <w:lastRenderedPageBreak/>
+              <w:t>file_agreement_step.subject</w:t>
             </w:r>
           </w:p>
         </w:tc>
@@ -11898,9 +11880,11 @@
             <w:pPr>
               <w:pStyle w:val="Body"/>
             </w:pPr>
+            <w:proofErr w:type="spellStart"/>
             <w:r>
               <w:t>appeal_response_step</w:t>
             </w:r>
+            <w:proofErr w:type="spellEnd"/>
             <w:r>
               <w:t xml:space="preserve"> in </w:t>
             </w:r>
@@ -11932,13 +11916,7 @@
               <w:rPr>
                 <w:shd w:val="clear" w:color="auto" w:fill="FFFFFF"/>
               </w:rPr>
-              <w:t>{{ appeal_response_step.subject }</w:t>
-            </w:r>
-            <w:r>
-              <w:rPr>
-                <w:shd w:val="clear" w:color="auto" w:fill="FFFFFF"/>
-              </w:rPr>
-              <w:t>}</w:t>
+              <w:t>appeal_response_step.subject</w:t>
             </w:r>
           </w:p>
         </w:tc>
@@ -12047,7 +12025,6 @@
               <w:rPr>
                 <w:shd w:val="clear" w:color="auto" w:fill="FFFFFF"/>
               </w:rPr>
-              <w:lastRenderedPageBreak/>
               <w:t xml:space="preserve">{%tr if </w:t>
             </w:r>
             <w:r>
@@ -12139,18 +12116,6 @@
               <w:outlineLvl w:val="1"/>
             </w:pPr>
             <w:r>
-              <w:rPr>
-                <w:shd w:val="clear" w:color="auto" w:fill="FFFFFF"/>
-              </w:rPr>
-              <w:t>{{</w:t>
-            </w:r>
-            <w:r>
-              <w:rPr>
-                <w:shd w:val="clear" w:color="auto" w:fill="FFFFFF"/>
-              </w:rPr>
-              <w:t xml:space="preserve"> </w:t>
-            </w:r>
-            <w:r>
               <w:t>appeal_contact_parent_step</w:t>
             </w:r>
             <w:r>
@@ -12161,12 +12126,6 @@
                 <w:shd w:val="clear" w:color="auto" w:fill="FFFFFF"/>
               </w:rPr>
               <w:t xml:space="preserve"> </w:t>
-            </w:r>
-            <w:r>
-              <w:rPr>
-                <w:shd w:val="clear" w:color="auto" w:fill="FFFFFF"/>
-              </w:rPr>
-              <w:t>}}</w:t>
             </w:r>
           </w:p>
         </w:tc>
@@ -12227,23 +12186,19 @@
                 <w:shd w:val="clear" w:color="auto" w:fill="FFFFFF"/>
               </w:rPr>
             </w:pPr>
-            <w:r>
-              <w:rPr>
-                <w:shd w:val="clear" w:color="auto" w:fill="FFFFFF"/>
-              </w:rPr>
-              <w:t xml:space="preserve">{{ </w:t>
-            </w:r>
+            <w:proofErr w:type="spellStart"/>
             <w:r>
               <w:t>tell_supreme_court_step</w:t>
             </w:r>
             <w:r>
               <w:t>.subject</w:t>
             </w:r>
-            <w:r>
-              <w:rPr>
-                <w:shd w:val="clear" w:color="auto" w:fill="FFFFFF"/>
-              </w:rPr>
-              <w:t xml:space="preserve"> }}</w:t>
+            <w:proofErr w:type="spellEnd"/>
+            <w:r>
+              <w:rPr>
+                <w:shd w:val="clear" w:color="auto" w:fill="FFFFFF"/>
+              </w:rPr>
+              <w:t xml:space="preserve"> </w:t>
             </w:r>
           </w:p>
         </w:tc>
@@ -12310,6 +12265,7 @@
               <w:rPr>
                 <w:shd w:val="clear" w:color="auto" w:fill="FFFFFF"/>
               </w:rPr>
+              <w:lastRenderedPageBreak/>
               <w:t>{%tr endif %}</w:t>
             </w:r>
           </w:p>
@@ -12327,8 +12283,13 @@
             <w:pPr>
               <w:pStyle w:val="Body"/>
             </w:pPr>
-            <w:r>
-              <w:t xml:space="preserve">get_help in </w:t>
+            <w:proofErr w:type="spellStart"/>
+            <w:r>
+              <w:t>get_help</w:t>
+            </w:r>
+            <w:proofErr w:type="spellEnd"/>
+            <w:r>
+              <w:t xml:space="preserve"> in </w:t>
             </w:r>
             <w:r>
               <w:t>aka2j_templates.yml</w:t>
@@ -12354,8 +12315,13 @@
               <w:pStyle w:val="Heading2"/>
               <w:outlineLvl w:val="1"/>
             </w:pPr>
-            <w:r>
-              <w:t>{{ get_help.subject }}</w:t>
+            <w:proofErr w:type="spellStart"/>
+            <w:r>
+              <w:t>get_help.subject</w:t>
+            </w:r>
+            <w:proofErr w:type="spellEnd"/>
+            <w:r>
+              <w:t xml:space="preserve"> </w:t>
             </w:r>
           </w:p>
         </w:tc>
@@ -12483,27 +12449,14 @@
     <w:r>
       <w:t xml:space="preserve"> of </w:t>
     </w:r>
-    <w:r>
-      <w:fldChar w:fldCharType="begin"/>
-    </w:r>
-    <w:r>
-      <w:instrText xml:space="preserve"> NUMPAGES  \* Arabic  \* MERGEFORMAT </w:instrText>
-    </w:r>
-    <w:r>
-      <w:fldChar w:fldCharType="separate"/>
-    </w:r>
-    <w:r>
-      <w:rPr>
-        <w:noProof/>
-      </w:rPr>
-      <w:t>49</w:t>
-    </w:r>
-    <w:r>
-      <w:rPr>
-        <w:noProof/>
-      </w:rPr>
-      <w:fldChar w:fldCharType="end"/>
-    </w:r>
+    <w:fldSimple w:instr=" NUMPAGES  \* Arabic  \* MERGEFORMAT ">
+      <w:r>
+        <w:rPr>
+          <w:noProof/>
+        </w:rPr>
+        <w:t>49</w:t>
+      </w:r>
+    </w:fldSimple>
     <w:r>
       <w:t xml:space="preserve"> pages</w:t>
     </w:r>

</xml_diff>